<commit_message>
Last Deck Standing: static ASCII-safe rules page, fix stale upkeep wording
Pre-render the rules page to plain HTML with numeric entities instead of
rendering Markdown in the browser; fix two lines that still said players
are eliminated at upkeep; regenerate the .docx.

Co-Authored-By: Claude Opus 5.5 <noreply@anthropic.com>
</commit_message>
<xml_diff>
--- a/games/last-deck-standing/Last Deck Standing Rules v1.docx
+++ b/games/last-deck-standing/Last Deck Standing Rules v1.docx
@@ -2577,7 +2577,11 @@
     </w:p>
     <w:p>
       <w:pPr>
-        <w:ind w:left="720"/>
+        <w:pStyle w:val="ListParagraph"/>
+        <w:numPr>
+          <w:ilvl w:val="0"/>
+          <w:numId w:val="7"/>
+        </w:numPr>
       </w:pPr>
       <w:r>
         <w:t xml:space="preserve">Looted cards go to your discard pile. If the storm removes the tile, the pile is lost.</w:t>
@@ -2596,7 +2600,7 @@
         <w:spacing w:after="120"/>
       </w:pPr>
       <w:r>
-        <w:t xml:space="preserve">The last player not eliminated wins. There are no ties: players are only eliminated during their own upkeep, one at a time.</w:t>
+        <w:t xml:space="preserve">The last player not eliminated wins. There are no ties: players are only eliminated at the end of their own turn, one at a time.</w:t>
       </w:r>
     </w:p>
     <w:p>
@@ -3264,7 +3268,7 @@
         </w:numPr>
       </w:pPr>
       <w:r>
-        <w:t xml:space="preserve">Get your hand below 3 Dead cards by the end of your next turn to stand back up. Otherwise you're eliminated at your next upkeep.</w:t>
+        <w:t xml:space="preserve">Get your hand below 3 Dead cards by the end of your next turn to stand back up. Otherwise you're eliminated at the end of that turn.</w:t>
       </w:r>
     </w:p>
     <w:p>

</xml_diff>

<commit_message>
Last Deck Standing: READTHROUGH-002 wording fixes
Co-Authored-By: Claude Opus 5.5 <noreply@anthropic.com>
</commit_message>
<xml_diff>
--- a/games/last-deck-standing/Last Deck Standing Rules v1.docx
+++ b/games/last-deck-standing/Last Deck Standing Rules v1.docx
@@ -288,7 +288,7 @@
                 <w:sz w:val="20"/>
                 <w:szCs w:val="20"/>
               </w:rPr>
-              <w:t xml:space="preserve">Hex tiles printed with 0–3 loot icons; see Loot Tile Set</w:t>
+              <w:t xml:space="preserve">Hex tiles printed with 0–3 loot icons; each set has its own back colour. See Loot Tile Set</w:t>
             </w:r>
           </w:p>
         </w:tc>
@@ -1032,6 +1032,89 @@
           </w:p>
         </w:tc>
       </w:tr>
+      <w:tr>
+        <w:trPr>
+          <w:tblHeader w:val="off"/>
+        </w:trPr>
+        <w:tc>
+          <w:tcPr>
+            <w:tcW w:type="dxa" w:w="1647"/>
+            <w:tcBorders>
+              <w:top w:val="single" w:color="C9CCD6" w:sz="4"/>
+              <w:left w:val="single" w:color="C9CCD6" w:sz="4"/>
+              <w:bottom w:val="single" w:color="C9CCD6" w:sz="4"/>
+              <w:right w:val="single" w:color="C9CCD6" w:sz="4"/>
+            </w:tcBorders>
+            <w:tcMar>
+              <w:top w:type="dxa" w:w="60"/>
+              <w:left w:type="dxa" w:w="100"/>
+              <w:bottom w:type="dxa" w:w="60"/>
+              <w:right w:type="dxa" w:w="100"/>
+            </w:tcMar>
+          </w:tcPr>
+          <w:p>
+            <w:r>
+              <w:rPr>
+                <w:sz w:val="20"/>
+                <w:szCs w:val="20"/>
+              </w:rPr>
+              <w:t xml:space="preserve">Loot pile markers</w:t>
+            </w:r>
+          </w:p>
+        </w:tc>
+        <w:tc>
+          <w:tcPr>
+            <w:tcW w:type="dxa" w:w="3219"/>
+            <w:tcBorders>
+              <w:top w:val="single" w:color="C9CCD6" w:sz="4"/>
+              <w:left w:val="single" w:color="C9CCD6" w:sz="4"/>
+              <w:bottom w:val="single" w:color="C9CCD6" w:sz="4"/>
+              <w:right w:val="single" w:color="C9CCD6" w:sz="4"/>
+            </w:tcBorders>
+            <w:tcMar>
+              <w:top w:type="dxa" w:w="60"/>
+              <w:left w:type="dxa" w:w="100"/>
+              <w:bottom w:type="dxa" w:w="60"/>
+              <w:right w:type="dxa" w:w="100"/>
+            </w:tcMar>
+          </w:tcPr>
+          <w:p>
+            <w:r>
+              <w:rPr>
+                <w:sz w:val="20"/>
+                <w:szCs w:val="20"/>
+              </w:rPr>
+              <w:t xml:space="preserve">4</w:t>
+            </w:r>
+          </w:p>
+        </w:tc>
+        <w:tc>
+          <w:tcPr>
+            <w:tcW w:type="dxa" w:w="4494"/>
+            <w:tcBorders>
+              <w:top w:val="single" w:color="C9CCD6" w:sz="4"/>
+              <w:left w:val="single" w:color="C9CCD6" w:sz="4"/>
+              <w:bottom w:val="single" w:color="C9CCD6" w:sz="4"/>
+              <w:right w:val="single" w:color="C9CCD6" w:sz="4"/>
+            </w:tcBorders>
+            <w:tcMar>
+              <w:top w:type="dxa" w:w="60"/>
+              <w:left w:type="dxa" w:w="100"/>
+              <w:bottom w:type="dxa" w:w="60"/>
+              <w:right w:type="dxa" w:w="100"/>
+            </w:tcMar>
+          </w:tcPr>
+          <w:p>
+            <w:r>
+              <w:rPr>
+                <w:sz w:val="20"/>
+                <w:szCs w:val="20"/>
+              </w:rPr>
+              <w:t xml:space="preserve">Mark an eliminated player's loot pile on the board</w:t>
+            </w:r>
+          </w:p>
+        </w:tc>
+      </w:tr>
     </w:tbl>
     <w:p>
       <w:pPr>
@@ -1112,7 +1195,7 @@
         <w:t xml:space="preserve">10</w:t>
       </w:r>
       <w:r>
-        <w:t xml:space="preserve"> with 5. Return the rest to the box unseen. Starting with the start player and going clockwise, take your top tile, turn it face up and place it. Each new tile must touch at least one tile already placed.</w:t>
+        <w:t xml:space="preserve"> with 5. Return the rest to the box unseen. Starting with the start player and going clockwise, take your top tile, turn it face up and place it. The first tile starts the board; each tile after that must touch at least one tile already placed. Keep going around the table until everyone has placed all their tiles.</w:t>
       </w:r>
     </w:p>
     <w:p>
@@ -1153,7 +1236,7 @@
         <w:t xml:space="preserve">reverse</w:t>
       </w:r>
       <w:r>
-        <w:t xml:space="preserve"> turn order (the last player first, the start player last), each player places their pawn on any hex. Players may share a hex.</w:t>
+        <w:t xml:space="preserve"> turn order (the last player first, the start player last), each player places their pawn on any tile. Players may share a tile.</w:t>
       </w:r>
     </w:p>
     <w:p>
@@ -1223,7 +1306,7 @@
         </w:numPr>
       </w:pPr>
       <w:r>
-        <w:t xml:space="preserve">The start player takes the first turn. Each time play passes the start player's seat, advance the round marker. Keep doing this even after the start player is eliminated.</w:t>
+        <w:t xml:space="preserve">The start player takes the first turn. Advance the round marker at the start of each of the start player's turns after the first (or when play reaches their seat, if they've been eliminated).</w:t>
       </w:r>
     </w:p>
     <w:p>
@@ -1271,7 +1354,7 @@
         </w:numPr>
       </w:pPr>
       <w:r>
-        <w:t xml:space="preserve">Draw until you have 5 cards in hand. Dead cards still in your hand count toward the 5. If your draw pile runs out, shuffle your discard pile to make a new one and keep drawing.</w:t>
+        <w:t xml:space="preserve">Draw until you have 5 cards in hand. Dead cards still in your hand count toward the 5. If your draw pile runs out, shuffle your discard pile to make a new one and keep drawing. If both are empty, stop drawing.</w:t>
       </w:r>
     </w:p>
     <w:p>
@@ -1290,7 +1373,7 @@
         <w:t xml:space="preserve">Critical:</w:t>
       </w:r>
       <w:r>
-        <w:t xml:space="preserve"> if 3 or more cards in your hand are Dead cards, announce "critical" to the table. You have this turn to heal, or you'll be eliminated at the end of it.</w:t>
+        <w:t xml:space="preserve"> if 3 or more cards in your hand are Dead cards, announce "critical" to the table. This is only a warning: what counts is how many Dead cards you hold at the end of your turn.</w:t>
       </w:r>
     </w:p>
     <w:p>
@@ -1414,6 +1497,14 @@
     </w:p>
     <w:p>
       <w:pPr>
+        <w:spacing w:after="120"/>
+      </w:pPr>
+      <w:r>
+        <w:t xml:space="preserve">Phase 3 starts once you've finished all your actions. You can't play cards during it.</w:t>
+      </w:r>
+    </w:p>
+    <w:p>
+      <w:pPr>
         <w:pStyle w:val="ListParagraph"/>
         <w:numPr>
           <w:ilvl w:val="0"/>
@@ -1450,7 +1541,7 @@
         <w:t xml:space="preserve">Dead cards stay in your hand.</w:t>
       </w:r>
       <w:r>
-        <w:t xml:space="preserve"> Heal cards used to heal are removed from the game instead.</w:t>
+        <w:t xml:space="preserve"> Heal cards used to heal were already removed from the game.</w:t>
       </w:r>
     </w:p>
     <w:p>
@@ -1758,7 +1849,7 @@
                 <w:sz w:val="20"/>
                 <w:szCs w:val="20"/>
               </w:rPr>
-              <w:t xml:space="preserve">Choose one when you play it: </w:t>
+              <w:t xml:space="preserve">Choose one mode for its whole value when you play it. </w:t>
             </w:r>
             <w:r>
               <w:rPr>
@@ -1800,7 +1891,7 @@
                 <w:sz w:val="20"/>
                 <w:szCs w:val="20"/>
               </w:rPr>
-              <w:t xml:space="preserve"> gain that many Shield points (they can go above your Base Shield and protect you until your next upkeep); the card is discarded normally.</w:t>
+              <w:t xml:space="preserve"> add that many points to your Shield tracker (they can go above your Base Shield and protect you until your next upkeep); the card is discarded at the end of your turn with your other cards.</w:t>
             </w:r>
           </w:p>
         </w:tc>
@@ -1850,7 +1941,7 @@
         <w:t xml:space="preserve">Range</w:t>
       </w:r>
       <w:r>
-        <w:t xml:space="preserve"> is the straight-line hex distance from your hex to theirs, counting any removed hexes in between. The same hex is range 0, and an adjacent hex is range 1.</w:t>
+        <w:t xml:space="preserve"> is the straight-line hex distance from your tile to theirs, counting any gaps in between. The same tile is range 0, and an adjacent tile is range 1. You can hit across a gap you can't walk across.</w:t>
       </w:r>
     </w:p>
     <w:p>
@@ -1893,7 +1984,7 @@
         </w:numPr>
       </w:pPr>
       <w:r>
-        <w:t xml:space="preserve">Each of the target's Shield points cancels 1 damage and is then spent.</w:t>
+        <w:t xml:space="preserve">Subtract range first. Then each of the target's Shield points cancels 1 damage and is spent.</w:t>
       </w:r>
     </w:p>
     <w:p>
@@ -1939,7 +2030,7 @@
         <w:spacing w:after="120"/>
       </w:pPr>
       <w:r>
-        <w:t xml:space="preserve">Once per turn, you may take either 1 cube from the hex you're on or one pick from a loot pile there (see Elimination), never both. Return the cube to the general supply and gain a card of that type (Move cube → Movement deck, Attack → Attack deck, Heal → Heal deck). Choose either:</w:t>
+        <w:t xml:space="preserve">Once per turn, you may take either 1 cube from the tile you're on or make one claim on a loot pile there (see Elimination), never both. Return the cube to the general supply and gain a card of that type (Move cube → Movement deck, Attack → Attack deck, Heal → Heal deck). Choose either:</w:t>
       </w:r>
     </w:p>
     <w:p>
@@ -2079,7 +2170,7 @@
         <w:spacing w:after="120"/>
       </w:pPr>
       <w:r>
-        <w:t xml:space="preserve">Paid cards go to your discard pile, not out of the game; they come back when you reshuffle. Cards you pay with can't also be played this turn. You may overpay, but extra value above 4 is lost. Each stat maxes out at 4.</w:t>
+        <w:t xml:space="preserve">Paid cards go to your discard pile, not out of the game; they come back when you reshuffle. Cards you pay with can't also be played this turn and add nothing to your Move, Attack or Shield. You may overpay, but extra value above 4 is lost. Each stat maxes out at 4.</w:t>
       </w:r>
     </w:p>
     <w:p>
@@ -2105,7 +2196,7 @@
         <w:t xml:space="preserve">edge tile</w:t>
       </w:r>
       <w:r>
-        <w:t xml:space="preserve"> from the board: a tile with at least one side not touching another tile. Any loot cubes on it go back to the supply.</w:t>
+        <w:t xml:space="preserve"> from the board: a tile with at least one side not touching another tile (sides facing an inner gap count). Any loot cubes on it go back to the supply. Loot piles don't protect a tile; a pile on a removed tile is lost.</w:t>
       </w:r>
     </w:p>
     <w:p>
@@ -2424,7 +2515,7 @@
         <w:t xml:space="preserve">Push-off (Phase 2):</w:t>
       </w:r>
       <w:r>
-        <w:t xml:space="preserve"> if you remove a tile with pawns on it, each of those pawns' owners chooses a remaining tile adjacent to the removed one and moves their pawn there. A pawn can be pushed more than once in a game.</w:t>
+        <w:t xml:space="preserve"> if you remove a tile with pawns on it, every pawn on it moves, including your own. In turn order starting with you, each owner chooses a remaining tile adjacent to the removed one and moves their pawn there. A pawn can be pushed more than once in a game.</w:t>
       </w:r>
     </w:p>
     <w:p>
@@ -2472,7 +2563,7 @@
         </w:numPr>
       </w:pPr>
       <w:r>
-        <w:t xml:space="preserve">Put your Dead cards back in the Dead supply. Gather the rest of your hand, deck and discard pile into a face-down </w:t>
+        <w:t xml:space="preserve">Return every Dead card you own (hand, deck and discard pile) to the Dead supply. Gather the rest of your cards into a face-down </w:t>
       </w:r>
       <w:r>
         <w:rPr>
@@ -2482,7 +2573,7 @@
         <w:t xml:space="preserve">loot pile</w:t>
       </w:r>
       <w:r>
-        <w:t xml:space="preserve"> on your hex.</w:t>
+        <w:t xml:space="preserve"> on your tile, marked with a loot pile marker.</w:t>
       </w:r>
     </w:p>
     <w:p>
@@ -2494,7 +2585,7 @@
         </w:numPr>
       </w:pPr>
       <w:r>
-        <w:t xml:space="preserve">The loot pile is looted with the normal loot action, but players look through it and choose cards:</w:t>
+        <w:t xml:space="preserve">Each loot action on the pile is one claim. Claims count in order, whoever makes them (the same player can make more than one on later turns). The claimer looks through the pile and chooses cards:</w:t>
       </w:r>
     </w:p>
     <w:p>
@@ -2506,7 +2597,7 @@
         </w:numPr>
       </w:pPr>
       <w:r>
-        <w:t xml:space="preserve">The first player to loot it keeps up to </w:t>
+        <w:t xml:space="preserve">The first claim keeps up to </w:t>
       </w:r>
       <w:r>
         <w:rPr>
@@ -2516,7 +2607,7 @@
         <w:t xml:space="preserve">5</w:t>
       </w:r>
       <w:r>
-        <w:t xml:space="preserve"> cards of their choice.</w:t>
+        <w:t xml:space="preserve"> cards.</w:t>
       </w:r>
     </w:p>
     <w:p>
@@ -2528,7 +2619,7 @@
         </w:numPr>
       </w:pPr>
       <w:r>
-        <w:t xml:space="preserve">The second keeps up to </w:t>
+        <w:t xml:space="preserve">The second claim keeps up to </w:t>
       </w:r>
       <w:r>
         <w:rPr>
@@ -2550,7 +2641,7 @@
         </w:numPr>
       </w:pPr>
       <w:r>
-        <w:t xml:space="preserve">The third keeps </w:t>
+        <w:t xml:space="preserve">The third claim keeps </w:t>
       </w:r>
       <w:r>
         <w:rPr>
@@ -2967,7 +3058,7 @@
         <w:t xml:space="preserve">Actions (any order):</w:t>
       </w:r>
       <w:r>
-        <w:t xml:space="preserve"> play any cards · move · 1 attack · 1 loot (cube or pile pick) · upgrade</w:t>
+        <w:t xml:space="preserve"> play any cards · move · 1 attack · 1 loot (1 cube or 1 pile claim) · upgrade</w:t>
       </w:r>
     </w:p>
     <w:p>
@@ -2979,10 +3070,40 @@
           <w:b/>
           <w:bCs/>
         </w:rPr>
+        <w:t xml:space="preserve">Heal card:</w:t>
+      </w:r>
+      <w:r>
+        <w:t xml:space="preserve"> heal (Dead from hand → supply, card leaves the game) or shield (+Shield until your next upkeep)</w:t>
+      </w:r>
+    </w:p>
+    <w:p>
+      <w:pPr>
+        <w:spacing w:after="120"/>
+      </w:pPr>
+      <w:r>
+        <w:rPr>
+          <w:b/>
+          <w:bCs/>
+        </w:rPr>
+        <w:t xml:space="preserve">Storm:</w:t>
+      </w:r>
+      <w:r>
+        <w:t xml:space="preserve"> rounds 1–7 remove an edge tile with no pawn; round 8+ any edge tile, pawns pushed to an adjacent tile</w:t>
+      </w:r>
+    </w:p>
+    <w:p>
+      <w:pPr>
+        <w:spacing w:after="120"/>
+      </w:pPr>
+      <w:r>
+        <w:rPr>
+          <w:b/>
+          <w:bCs/>
+        </w:rPr>
         <w:t xml:space="preserve">Eliminated:</w:t>
       </w:r>
       <w:r>
-        <w:t xml:space="preserve"> Dead cards to supply; your other cards become a loot pile (first looter picks 5, then 3, then 1)</w:t>
+        <w:t xml:space="preserve"> all your Dead cards to supply; your other cards become a loot pile (claims pick 5, then 3, then 1)</w:t>
       </w:r>
     </w:p>
     <w:p>
@@ -3012,7 +3133,7 @@
         <w:t xml:space="preserve">Damage:</w:t>
       </w:r>
       <w:r>
-        <w:t xml:space="preserve"> Attack − Range; 0 or less can't hit; Shield absorbs; Dead cards go to the target's discard pile</w:t>
+        <w:t xml:space="preserve"> Attack − Range, then Shield absorbs; 0 or less can't hit; Dead cards go to the target's discard pile</w:t>
       </w:r>
     </w:p>
     <w:p>

</xml_diff>

<commit_message>
Last Deck Standing: holding, storm markers with close-fast phase, start spacing
Players may keep unplayed cards (hand limit 5 incl. Dead). Storm now
places markers from the outside in (1/turn, 2/turn and 2 damage from
round 7) instead of removing tiles; no-islands and push-off removed.
Pawns start >=3 tiles apart in normal turn order. Adds SIM-008/009,
READTHROUGH-002 logs and simulator options.

Co-Authored-By: Claude Opus 5.5 <noreply@anthropic.com>
</commit_message>
<xml_diff>
--- a/games/last-deck-standing/Last Deck Standing Rules v1.docx
+++ b/games/last-deck-standing/Last Deck Standing Rules v1.docx
@@ -1027,7 +1027,7 @@
                 <w:sz w:val="20"/>
                 <w:szCs w:val="20"/>
               </w:rPr>
-              <w:t xml:space="preserve">25 spaces; tracks the global round for the storm phases</w:t>
+              <w:t xml:space="preserve">25 spaces; round 7 marked "Storm closes fast"</w:t>
             </w:r>
           </w:p>
         </w:tc>
@@ -1058,6 +1058,89 @@
                 <w:sz w:val="20"/>
                 <w:szCs w:val="20"/>
               </w:rPr>
+              <w:t xml:space="preserve">Storm markers</w:t>
+            </w:r>
+          </w:p>
+        </w:tc>
+        <w:tc>
+          <w:tcPr>
+            <w:tcW w:type="dxa" w:w="3219"/>
+            <w:tcBorders>
+              <w:top w:val="single" w:color="C9CCD6" w:sz="4"/>
+              <w:left w:val="single" w:color="C9CCD6" w:sz="4"/>
+              <w:bottom w:val="single" w:color="C9CCD6" w:sz="4"/>
+              <w:right w:val="single" w:color="C9CCD6" w:sz="4"/>
+            </w:tcBorders>
+            <w:tcMar>
+              <w:top w:type="dxa" w:w="60"/>
+              <w:left w:type="dxa" w:w="100"/>
+              <w:bottom w:type="dxa" w:w="60"/>
+              <w:right w:type="dxa" w:w="100"/>
+            </w:tcMar>
+          </w:tcPr>
+          <w:p>
+            <w:r>
+              <w:rPr>
+                <w:sz w:val="20"/>
+                <w:szCs w:val="20"/>
+              </w:rPr>
+              <w:t xml:space="preserve">50</w:t>
+            </w:r>
+          </w:p>
+        </w:tc>
+        <w:tc>
+          <w:tcPr>
+            <w:tcW w:type="dxa" w:w="4494"/>
+            <w:tcBorders>
+              <w:top w:val="single" w:color="C9CCD6" w:sz="4"/>
+              <w:left w:val="single" w:color="C9CCD6" w:sz="4"/>
+              <w:bottom w:val="single" w:color="C9CCD6" w:sz="4"/>
+              <w:right w:val="single" w:color="C9CCD6" w:sz="4"/>
+            </w:tcBorders>
+            <w:tcMar>
+              <w:top w:type="dxa" w:w="60"/>
+              <w:left w:type="dxa" w:w="100"/>
+              <w:bottom w:type="dxa" w:w="60"/>
+              <w:right w:type="dxa" w:w="100"/>
+            </w:tcMar>
+          </w:tcPr>
+          <w:p>
+            <w:r>
+              <w:rPr>
+                <w:sz w:val="20"/>
+                <w:szCs w:val="20"/>
+              </w:rPr>
+              <w:t xml:space="preserve">Discs or translucent hex overlays placed on tiles; loot icons stay visible</w:t>
+            </w:r>
+          </w:p>
+        </w:tc>
+      </w:tr>
+      <w:tr>
+        <w:trPr>
+          <w:tblHeader w:val="off"/>
+        </w:trPr>
+        <w:tc>
+          <w:tcPr>
+            <w:tcW w:type="dxa" w:w="1647"/>
+            <w:tcBorders>
+              <w:top w:val="single" w:color="C9CCD6" w:sz="4"/>
+              <w:left w:val="single" w:color="C9CCD6" w:sz="4"/>
+              <w:bottom w:val="single" w:color="C9CCD6" w:sz="4"/>
+              <w:right w:val="single" w:color="C9CCD6" w:sz="4"/>
+            </w:tcBorders>
+            <w:tcMar>
+              <w:top w:type="dxa" w:w="60"/>
+              <w:left w:type="dxa" w:w="100"/>
+              <w:bottom w:type="dxa" w:w="60"/>
+              <w:right w:type="dxa" w:w="100"/>
+            </w:tcMar>
+          </w:tcPr>
+          <w:p>
+            <w:r>
+              <w:rPr>
+                <w:sz w:val="20"/>
+                <w:szCs w:val="20"/>
+              </w:rPr>
               <w:t xml:space="preserve">Loot pile markers</w:t>
             </w:r>
           </w:p>
@@ -1226,17 +1309,17 @@
         </w:numPr>
       </w:pPr>
       <w:r>
-        <w:t xml:space="preserve">In </w:t>
-      </w:r>
-      <w:r>
-        <w:rPr>
-          <w:b/>
-          <w:bCs/>
-        </w:rPr>
-        <w:t xml:space="preserve">reverse</w:t>
-      </w:r>
-      <w:r>
-        <w:t xml:space="preserve"> turn order (the last player first, the start player last), each player places their pawn on any tile. Players may share a tile.</w:t>
+        <w:t xml:space="preserve">In turn order, starting with the start player, each player places their pawn on any tile at least </w:t>
+      </w:r>
+      <w:r>
+        <w:rPr>
+          <w:b/>
+          <w:bCs/>
+        </w:rPr>
+        <w:t xml:space="preserve">3 tiles away</w:t>
+      </w:r>
+      <w:r>
+        <w:t xml:space="preserve"> (straight-line distance) from every pawn already placed. If no tile is that far away, place it as far as you can.</w:t>
       </w:r>
     </w:p>
     <w:p>
@@ -1531,17 +1614,17 @@
         </w:numPr>
       </w:pPr>
       <w:r>
-        <w:t xml:space="preserve">Put your played and unplayed cards in your discard pile. </w:t>
-      </w:r>
-      <w:r>
-        <w:rPr>
-          <w:b/>
-          <w:bCs/>
-        </w:rPr>
-        <w:t xml:space="preserve">Dead cards stay in your hand.</w:t>
-      </w:r>
-      <w:r>
-        <w:t xml:space="preserve"> Heal cards used to heal were already removed from the game.</w:t>
+        <w:t xml:space="preserve">Put your played cards in your discard pile (Heal cards used to heal were already removed from the game). </w:t>
+      </w:r>
+      <w:r>
+        <w:rPr>
+          <w:b/>
+          <w:bCs/>
+        </w:rPr>
+        <w:t xml:space="preserve">You may keep any unplayed cards in your hand</w:t>
+      </w:r>
+      <w:r>
+        <w:t xml:space="preserve">; Dead cards must stay. Your hand limit is 5, counting Dead cards.</w:t>
       </w:r>
     </w:p>
     <w:p>
@@ -1560,7 +1643,7 @@
         <w:t xml:space="preserve">Storm:</w:t>
       </w:r>
       <w:r>
-        <w:t xml:space="preserve"> you remove one tile from the board (see The Storm).</w:t>
+        <w:t xml:space="preserve"> place storm markers, then take storm damage if you're on a storm tile (see The Storm).</w:t>
       </w:r>
     </w:p>
     <w:p>
@@ -1941,7 +2024,7 @@
         <w:t xml:space="preserve">Range</w:t>
       </w:r>
       <w:r>
-        <w:t xml:space="preserve"> is the straight-line hex distance from your tile to theirs, counting any gaps in between. The same tile is range 0, and an adjacent tile is range 1. You can hit across a gap you can't walk across.</w:t>
+        <w:t xml:space="preserve"> is the straight-line hex distance from your tile to theirs, The same tile is range 0, and an adjacent tile is range 1.</w:t>
       </w:r>
     </w:p>
     <w:p>
@@ -2186,40 +2269,7 @@
         <w:spacing w:after="120"/>
       </w:pPr>
       <w:r>
-        <w:t xml:space="preserve">At the end of your turn, you choose and remove one </w:t>
-      </w:r>
-      <w:r>
-        <w:rPr>
-          <w:b/>
-          <w:bCs/>
-        </w:rPr>
-        <w:t xml:space="preserve">edge tile</w:t>
-      </w:r>
-      <w:r>
-        <w:t xml:space="preserve"> from the board: a tile with at least one side not touching another tile (sides facing an inner gap count). Any loot cubes on it go back to the supply. Loot piles don't protect a tile; a pile on a removed tile is lost.</w:t>
-      </w:r>
-    </w:p>
-    <w:p>
-      <w:pPr>
-        <w:spacing w:after="120"/>
-      </w:pPr>
-      <w:r>
-        <w:rPr>
-          <w:b/>
-          <w:bCs/>
-        </w:rPr>
-        <w:t xml:space="preserve">The board must stay in one piece.</w:t>
-      </w:r>
-      <w:r>
-        <w:t xml:space="preserve"> You can't remove a tile if that would split the board into separate islands. Never remove the last tile. If no tile qualifies, skip this step.</w:t>
-      </w:r>
-    </w:p>
-    <w:p>
-      <w:pPr>
-        <w:spacing w:after="120"/>
-      </w:pPr>
-      <w:r>
-        <w:t xml:space="preserve">The storm moves in two phases, set by the round marker:</w:t>
+        <w:t xml:space="preserve">The storm closes in from the outside of the board, like a shrinking circle. At the end of your turn, place storm markers on tiles, then check for storm damage.</w:t>
       </w:r>
     </w:p>
     <w:tbl>
@@ -2235,9 +2285,9 @@
         </w:tblBorders>
       </w:tblPr>
       <w:tblGrid>
-        <w:gridCol w:w="1806"/>
-        <w:gridCol w:w="985"/>
-        <w:gridCol w:w="6569"/>
+        <w:gridCol w:w="3744"/>
+        <w:gridCol w:w="3888"/>
+        <w:gridCol w:w="1728"/>
       </w:tblGrid>
       <w:tr>
         <w:trPr>
@@ -2245,7 +2295,7 @@
         </w:trPr>
         <w:tc>
           <w:tcPr>
-            <w:tcW w:type="dxa" w:w="1806"/>
+            <w:tcW w:type="dxa" w:w="3744"/>
             <w:tcBorders>
               <w:top w:val="single" w:color="C9CCD6" w:sz="4"/>
               <w:left w:val="single" w:color="C9CCD6" w:sz="4"/>
@@ -2268,13 +2318,13 @@
                 <w:sz w:val="20"/>
                 <w:szCs w:val="20"/>
               </w:rPr>
-              <w:t xml:space="preserve">Phase</w:t>
-            </w:r>
-          </w:p>
-        </w:tc>
-        <w:tc>
-          <w:tcPr>
-            <w:tcW w:type="dxa" w:w="985"/>
+              <w:t xml:space="preserve">Rounds</w:t>
+            </w:r>
+          </w:p>
+        </w:tc>
+        <w:tc>
+          <w:tcPr>
+            <w:tcW w:type="dxa" w:w="3888"/>
             <w:tcBorders>
               <w:top w:val="single" w:color="C9CCD6" w:sz="4"/>
               <w:left w:val="single" w:color="C9CCD6" w:sz="4"/>
@@ -2297,13 +2347,13 @@
                 <w:sz w:val="20"/>
                 <w:szCs w:val="20"/>
               </w:rPr>
-              <w:t xml:space="preserve">Rounds</w:t>
-            </w:r>
-          </w:p>
-        </w:tc>
-        <w:tc>
-          <w:tcPr>
-            <w:tcW w:type="dxa" w:w="6569"/>
+              <w:t xml:space="preserve">Markers you place each turn</w:t>
+            </w:r>
+          </w:p>
+        </w:tc>
+        <w:tc>
+          <w:tcPr>
+            <w:tcW w:type="dxa" w:w="1728"/>
             <w:tcBorders>
               <w:top w:val="single" w:color="C9CCD6" w:sz="4"/>
               <w:left w:val="single" w:color="C9CCD6" w:sz="4"/>
@@ -2326,7 +2376,7 @@
                 <w:sz w:val="20"/>
                 <w:szCs w:val="20"/>
               </w:rPr>
-              <w:t xml:space="preserve">Which tiles the storm can remove</w:t>
+              <w:t xml:space="preserve">Storm damage</w:t>
             </w:r>
           </w:p>
         </w:tc>
@@ -2337,79 +2387,79 @@
         </w:trPr>
         <w:tc>
           <w:tcPr>
-            <w:tcW w:type="dxa" w:w="1806"/>
-            <w:tcBorders>
-              <w:top w:val="single" w:color="C9CCD6" w:sz="4"/>
-              <w:left w:val="single" w:color="C9CCD6" w:sz="4"/>
-              <w:bottom w:val="single" w:color="C9CCD6" w:sz="4"/>
-              <w:right w:val="single" w:color="C9CCD6" w:sz="4"/>
-            </w:tcBorders>
-            <w:tcMar>
-              <w:top w:type="dxa" w:w="60"/>
-              <w:left w:type="dxa" w:w="100"/>
-              <w:bottom w:type="dxa" w:w="60"/>
-              <w:right w:type="dxa" w:w="100"/>
-            </w:tcMar>
-          </w:tcPr>
-          <w:p>
-            <w:r>
-              <w:rPr>
-                <w:sz w:val="20"/>
-                <w:szCs w:val="20"/>
-              </w:rPr>
-              <w:t xml:space="preserve">1: Closing</w:t>
-            </w:r>
-          </w:p>
-        </w:tc>
-        <w:tc>
-          <w:tcPr>
-            <w:tcW w:type="dxa" w:w="985"/>
-            <w:tcBorders>
-              <w:top w:val="single" w:color="C9CCD6" w:sz="4"/>
-              <w:left w:val="single" w:color="C9CCD6" w:sz="4"/>
-              <w:bottom w:val="single" w:color="C9CCD6" w:sz="4"/>
-              <w:right w:val="single" w:color="C9CCD6" w:sz="4"/>
-            </w:tcBorders>
-            <w:tcMar>
-              <w:top w:type="dxa" w:w="60"/>
-              <w:left w:type="dxa" w:w="100"/>
-              <w:bottom w:type="dxa" w:w="60"/>
-              <w:right w:type="dxa" w:w="100"/>
-            </w:tcMar>
-          </w:tcPr>
-          <w:p>
-            <w:r>
-              <w:rPr>
-                <w:sz w:val="20"/>
-                <w:szCs w:val="20"/>
-              </w:rPr>
-              <w:t xml:space="preserve">1–7</w:t>
-            </w:r>
-          </w:p>
-        </w:tc>
-        <w:tc>
-          <w:tcPr>
-            <w:tcW w:type="dxa" w:w="6569"/>
-            <w:tcBorders>
-              <w:top w:val="single" w:color="C9CCD6" w:sz="4"/>
-              <w:left w:val="single" w:color="C9CCD6" w:sz="4"/>
-              <w:bottom w:val="single" w:color="C9CCD6" w:sz="4"/>
-              <w:right w:val="single" w:color="C9CCD6" w:sz="4"/>
-            </w:tcBorders>
-            <w:tcMar>
-              <w:top w:type="dxa" w:w="60"/>
-              <w:left w:type="dxa" w:w="100"/>
-              <w:bottom w:type="dxa" w:w="60"/>
-              <w:right w:type="dxa" w:w="100"/>
-            </w:tcMar>
-          </w:tcPr>
-          <w:p>
-            <w:r>
-              <w:rPr>
-                <w:sz w:val="20"/>
-                <w:szCs w:val="20"/>
-              </w:rPr>
-              <w:t xml:space="preserve">Edge tiles with no pawn on them</w:t>
+            <w:tcW w:type="dxa" w:w="3744"/>
+            <w:tcBorders>
+              <w:top w:val="single" w:color="C9CCD6" w:sz="4"/>
+              <w:left w:val="single" w:color="C9CCD6" w:sz="4"/>
+              <w:bottom w:val="single" w:color="C9CCD6" w:sz="4"/>
+              <w:right w:val="single" w:color="C9CCD6" w:sz="4"/>
+            </w:tcBorders>
+            <w:tcMar>
+              <w:top w:type="dxa" w:w="60"/>
+              <w:left w:type="dxa" w:w="100"/>
+              <w:bottom w:type="dxa" w:w="60"/>
+              <w:right w:type="dxa" w:w="100"/>
+            </w:tcMar>
+          </w:tcPr>
+          <w:p>
+            <w:r>
+              <w:rPr>
+                <w:sz w:val="20"/>
+                <w:szCs w:val="20"/>
+              </w:rPr>
+              <w:t xml:space="preserve">1–6</w:t>
+            </w:r>
+          </w:p>
+        </w:tc>
+        <w:tc>
+          <w:tcPr>
+            <w:tcW w:type="dxa" w:w="3888"/>
+            <w:tcBorders>
+              <w:top w:val="single" w:color="C9CCD6" w:sz="4"/>
+              <w:left w:val="single" w:color="C9CCD6" w:sz="4"/>
+              <w:bottom w:val="single" w:color="C9CCD6" w:sz="4"/>
+              <w:right w:val="single" w:color="C9CCD6" w:sz="4"/>
+            </w:tcBorders>
+            <w:tcMar>
+              <w:top w:type="dxa" w:w="60"/>
+              <w:left w:type="dxa" w:w="100"/>
+              <w:bottom w:type="dxa" w:w="60"/>
+              <w:right w:type="dxa" w:w="100"/>
+            </w:tcMar>
+          </w:tcPr>
+          <w:p>
+            <w:r>
+              <w:rPr>
+                <w:sz w:val="20"/>
+                <w:szCs w:val="20"/>
+              </w:rPr>
+              <w:t xml:space="preserve">1</w:t>
+            </w:r>
+          </w:p>
+        </w:tc>
+        <w:tc>
+          <w:tcPr>
+            <w:tcW w:type="dxa" w:w="1728"/>
+            <w:tcBorders>
+              <w:top w:val="single" w:color="C9CCD6" w:sz="4"/>
+              <w:left w:val="single" w:color="C9CCD6" w:sz="4"/>
+              <w:bottom w:val="single" w:color="C9CCD6" w:sz="4"/>
+              <w:right w:val="single" w:color="C9CCD6" w:sz="4"/>
+            </w:tcBorders>
+            <w:tcMar>
+              <w:top w:type="dxa" w:w="60"/>
+              <w:left w:type="dxa" w:w="100"/>
+              <w:bottom w:type="dxa" w:w="60"/>
+              <w:right w:type="dxa" w:w="100"/>
+            </w:tcMar>
+          </w:tcPr>
+          <w:p>
+            <w:r>
+              <w:rPr>
+                <w:sz w:val="20"/>
+                <w:szCs w:val="20"/>
+              </w:rPr>
+              <w:t xml:space="preserve">1 Dead card</w:t>
             </w:r>
           </w:p>
         </w:tc>
@@ -2420,79 +2470,79 @@
         </w:trPr>
         <w:tc>
           <w:tcPr>
-            <w:tcW w:type="dxa" w:w="1806"/>
-            <w:tcBorders>
-              <w:top w:val="single" w:color="C9CCD6" w:sz="4"/>
-              <w:left w:val="single" w:color="C9CCD6" w:sz="4"/>
-              <w:bottom w:val="single" w:color="C9CCD6" w:sz="4"/>
-              <w:right w:val="single" w:color="C9CCD6" w:sz="4"/>
-            </w:tcBorders>
-            <w:tcMar>
-              <w:top w:type="dxa" w:w="60"/>
-              <w:left w:type="dxa" w:w="100"/>
-              <w:bottom w:type="dxa" w:w="60"/>
-              <w:right w:type="dxa" w:w="100"/>
-            </w:tcMar>
-          </w:tcPr>
-          <w:p>
-            <w:r>
-              <w:rPr>
-                <w:sz w:val="20"/>
-                <w:szCs w:val="20"/>
-              </w:rPr>
-              <w:t xml:space="preserve">2: Collapse</w:t>
-            </w:r>
-          </w:p>
-        </w:tc>
-        <w:tc>
-          <w:tcPr>
-            <w:tcW w:type="dxa" w:w="985"/>
-            <w:tcBorders>
-              <w:top w:val="single" w:color="C9CCD6" w:sz="4"/>
-              <w:left w:val="single" w:color="C9CCD6" w:sz="4"/>
-              <w:bottom w:val="single" w:color="C9CCD6" w:sz="4"/>
-              <w:right w:val="single" w:color="C9CCD6" w:sz="4"/>
-            </w:tcBorders>
-            <w:tcMar>
-              <w:top w:type="dxa" w:w="60"/>
-              <w:left w:type="dxa" w:w="100"/>
-              <w:bottom w:type="dxa" w:w="60"/>
-              <w:right w:type="dxa" w:w="100"/>
-            </w:tcMar>
-          </w:tcPr>
-          <w:p>
-            <w:r>
-              <w:rPr>
-                <w:sz w:val="20"/>
-                <w:szCs w:val="20"/>
-              </w:rPr>
-              <w:t xml:space="preserve">8+</w:t>
-            </w:r>
-          </w:p>
-        </w:tc>
-        <w:tc>
-          <w:tcPr>
-            <w:tcW w:type="dxa" w:w="6569"/>
-            <w:tcBorders>
-              <w:top w:val="single" w:color="C9CCD6" w:sz="4"/>
-              <w:left w:val="single" w:color="C9CCD6" w:sz="4"/>
-              <w:bottom w:val="single" w:color="C9CCD6" w:sz="4"/>
-              <w:right w:val="single" w:color="C9CCD6" w:sz="4"/>
-            </w:tcBorders>
-            <w:tcMar>
-              <w:top w:type="dxa" w:w="60"/>
-              <w:left w:type="dxa" w:w="100"/>
-              <w:bottom w:type="dxa" w:w="60"/>
-              <w:right w:type="dxa" w:w="100"/>
-            </w:tcMar>
-          </w:tcPr>
-          <w:p>
-            <w:r>
-              <w:rPr>
-                <w:sz w:val="20"/>
-                <w:szCs w:val="20"/>
-              </w:rPr>
-              <w:t xml:space="preserve">Any edge tile, even one with pawns on it</w:t>
+            <w:tcW w:type="dxa" w:w="3744"/>
+            <w:tcBorders>
+              <w:top w:val="single" w:color="C9CCD6" w:sz="4"/>
+              <w:left w:val="single" w:color="C9CCD6" w:sz="4"/>
+              <w:bottom w:val="single" w:color="C9CCD6" w:sz="4"/>
+              <w:right w:val="single" w:color="C9CCD6" w:sz="4"/>
+            </w:tcBorders>
+            <w:tcMar>
+              <w:top w:type="dxa" w:w="60"/>
+              <w:left w:type="dxa" w:w="100"/>
+              <w:bottom w:type="dxa" w:w="60"/>
+              <w:right w:type="dxa" w:w="100"/>
+            </w:tcMar>
+          </w:tcPr>
+          <w:p>
+            <w:r>
+              <w:rPr>
+                <w:sz w:val="20"/>
+                <w:szCs w:val="20"/>
+              </w:rPr>
+              <w:t xml:space="preserve">7+ (the storm closes fast)</w:t>
+            </w:r>
+          </w:p>
+        </w:tc>
+        <w:tc>
+          <w:tcPr>
+            <w:tcW w:type="dxa" w:w="3888"/>
+            <w:tcBorders>
+              <w:top w:val="single" w:color="C9CCD6" w:sz="4"/>
+              <w:left w:val="single" w:color="C9CCD6" w:sz="4"/>
+              <w:bottom w:val="single" w:color="C9CCD6" w:sz="4"/>
+              <w:right w:val="single" w:color="C9CCD6" w:sz="4"/>
+            </w:tcBorders>
+            <w:tcMar>
+              <w:top w:type="dxa" w:w="60"/>
+              <w:left w:type="dxa" w:w="100"/>
+              <w:bottom w:type="dxa" w:w="60"/>
+              <w:right w:type="dxa" w:w="100"/>
+            </w:tcMar>
+          </w:tcPr>
+          <w:p>
+            <w:r>
+              <w:rPr>
+                <w:sz w:val="20"/>
+                <w:szCs w:val="20"/>
+              </w:rPr>
+              <w:t xml:space="preserve">2</w:t>
+            </w:r>
+          </w:p>
+        </w:tc>
+        <w:tc>
+          <w:tcPr>
+            <w:tcW w:type="dxa" w:w="1728"/>
+            <w:tcBorders>
+              <w:top w:val="single" w:color="C9CCD6" w:sz="4"/>
+              <w:left w:val="single" w:color="C9CCD6" w:sz="4"/>
+              <w:bottom w:val="single" w:color="C9CCD6" w:sz="4"/>
+              <w:right w:val="single" w:color="C9CCD6" w:sz="4"/>
+            </w:tcBorders>
+            <w:tcMar>
+              <w:top w:type="dxa" w:w="60"/>
+              <w:left w:type="dxa" w:w="100"/>
+              <w:bottom w:type="dxa" w:w="60"/>
+              <w:right w:type="dxa" w:w="100"/>
+            </w:tcMar>
+          </w:tcPr>
+          <w:p>
+            <w:r>
+              <w:rPr>
+                <w:sz w:val="20"/>
+                <w:szCs w:val="20"/>
+              </w:rPr>
+              <w:t xml:space="preserve">2 Dead cards</w:t>
             </w:r>
           </w:p>
         </w:tc>
@@ -2512,10 +2562,10 @@
           <w:b/>
           <w:bCs/>
         </w:rPr>
-        <w:t xml:space="preserve">Push-off (Phase 2):</w:t>
-      </w:r>
-      <w:r>
-        <w:t xml:space="preserve"> if you remove a tile with pawns on it, every pawn on it moves, including your own. In turn order starting with you, each owner chooses a remaining tile adjacent to the removed one and moves their pawn there. A pawn can be pushed more than once in a game.</w:t>
+        <w:t xml:space="preserve">Placing markers:</w:t>
+      </w:r>
+      <w:r>
+        <w:t xml:space="preserve"> put each marker on an unmarked tile that is on the edge of the board or touches a marked tile. You choose which. It doesn't matter what's on the tile: pawns, loot cubes and loot piles all stay. Once every tile is marked, stop placing markers.</w:t>
       </w:r>
     </w:p>
     <w:p>
@@ -2523,7 +2573,24 @@
         <w:spacing w:after="120"/>
       </w:pPr>
       <w:r>
-        <w:t xml:space="preserve">Removed tiles are gone. Pawns can't move onto or across the gap, and range is still counted in hexes across the gap.</w:t>
+        <w:rPr>
+          <w:b/>
+          <w:bCs/>
+        </w:rPr>
+        <w:t xml:space="preserve">Storm tiles:</w:t>
+      </w:r>
+      <w:r>
+        <w:t xml:space="preserve"> a marked tile is a storm tile. You can move through, stop on and loot storm tiles normally. If you </w:t>
+      </w:r>
+      <w:r>
+        <w:rPr>
+          <w:b/>
+          <w:bCs/>
+        </w:rPr>
+        <w:t xml:space="preserve">end your turn on a storm tile</w:t>
+      </w:r>
+      <w:r>
+        <w:t xml:space="preserve">, take the storm damage for this round as Dead cards into your discard pile. Shield does not block storm damage.</w:t>
       </w:r>
     </w:p>
     <w:p>
@@ -2675,7 +2742,7 @@
         </w:numPr>
       </w:pPr>
       <w:r>
-        <w:t xml:space="preserve">Looted cards go to your discard pile. If the storm removes the tile, the pile is lost.</w:t>
+        <w:t xml:space="preserve">Looted cards go to your discard pile. Loot piles stay on the board until they're used up, even on storm tiles.</w:t>
       </w:r>
     </w:p>
     <w:p>
@@ -3043,7 +3110,7 @@
         <w:t xml:space="preserve">Upkeep:</w:t>
       </w:r>
       <w:r>
-        <w:t xml:space="preserve"> reset Shield → draw up to 5 (Dead cards in hand count) → 3+ Dead: announce "critical"</w:t>
+        <w:t xml:space="preserve"> reset Shield → draw up to 5 (held and Dead cards count) → 3+ Dead: announce "critical"</w:t>
       </w:r>
     </w:p>
     <w:p>
@@ -3088,7 +3155,7 @@
         <w:t xml:space="preserve">Storm:</w:t>
       </w:r>
       <w:r>
-        <w:t xml:space="preserve"> rounds 1–7 remove an edge tile with no pawn; round 8+ any edge tile, pawns pushed to an adjacent tile</w:t>
+        <w:t xml:space="preserve"> place markers from the outside in: 1 per turn (rounds 1–6), 2 per turn (round 7+). End your turn on a storm tile: 1 Dead card (round 7+: 2) to your discard pile; Shield doesn't block it</w:t>
       </w:r>
     </w:p>
     <w:p>
@@ -3118,7 +3185,7 @@
         <w:t xml:space="preserve">End:</w:t>
       </w:r>
       <w:r>
-        <w:t xml:space="preserve"> eliminated if 3+ Dead in hand → discard all but Dead cards (Heal cards used to heal leave the game) → storm removes 1 edge tile (never splits the board)</w:t>
+        <w:t xml:space="preserve"> eliminated if 3+ Dead in hand → discard played cards, keep any others (hand limit 5) → storm markers → storm damage</w:t>
       </w:r>
     </w:p>
     <w:p>
@@ -3207,25 +3274,6 @@
           <w:b/>
           <w:bCs/>
         </w:rPr>
-        <w:t xml:space="preserve">Storm damage:</w:t>
-      </w:r>
-      <w:r>
-        <w:t xml:space="preserve"> storm tiles that deal Dead cards to anyone who ends a turn on them, possibly escalating to 2 later in the game.</w:t>
-      </w:r>
-    </w:p>
-    <w:p>
-      <w:pPr>
-        <w:pStyle w:val="ListParagraph"/>
-        <w:numPr>
-          <w:ilvl w:val="0"/>
-          <w:numId w:val="2"/>
-        </w:numPr>
-      </w:pPr>
-      <w:r>
-        <w:rPr>
-          <w:b/>
-          <w:bCs/>
-        </w:rPr>
         <w:t xml:space="preserve">Battle bus drop:</w:t>
       </w:r>
       <w:r>
@@ -3279,7 +3327,7 @@
         </w:numPr>
       </w:pPr>
       <w:r>
-        <w:t xml:space="preserve">At the start of rounds 4, 8 and 12, a drop of 2 gold cards lands. The placer puts it on any tile at least 3 hexes from their own pawn. Then each other player, clockwise, may nudge it 1 hex or pass. It can never be nudged off the board or into a gap.</w:t>
+        <w:t xml:space="preserve">At the start of rounds 4, 8 and 12, a drop of 2 gold cards lands. The placer puts it on any tile at least 3 tiles from their own pawn. Then each other player, clockwise, may nudge it 1 tile or pass. It can never be nudged off the board.</w:t>
       </w:r>
     </w:p>
     <w:p>
@@ -3315,7 +3363,45 @@
         </w:numPr>
       </w:pPr>
       <w:r>
-        <w:t xml:space="preserve">The storm can't remove a tile with an unlooted drop on it.</w:t>
+        <w:t xml:space="preserve">Simulation: about 3 drops per game, and players grab nearly all of them.</w:t>
+      </w:r>
+    </w:p>
+    <w:p>
+      <w:pPr>
+        <w:pStyle w:val="ListParagraph"/>
+        <w:numPr>
+          <w:ilvl w:val="0"/>
+          <w:numId w:val="2"/>
+        </w:numPr>
+      </w:pPr>
+      <w:r>
+        <w:rPr>
+          <w:b/>
+          <w:bCs/>
+        </w:rPr>
+        <w:t xml:space="preserve">8–10 player team variant (needs testing):</w:t>
+      </w:r>
+      <w:r>
+        <w:t xml:space="preserve"> duos or squads that share a win. Teammates can revive a knocked-down partner (see Knocked down). Simulation: 10 solo players take about 115 turns, far past 45 minutes, so high player counts need teams or simultaneous turns.</w:t>
+      </w:r>
+    </w:p>
+    <w:p>
+      <w:pPr>
+        <w:pStyle w:val="ListParagraph"/>
+        <w:numPr>
+          <w:ilvl w:val="0"/>
+          <w:numId w:val="2"/>
+        </w:numPr>
+      </w:pPr>
+      <w:r>
+        <w:rPr>
+          <w:b/>
+          <w:bCs/>
+        </w:rPr>
+        <w:t xml:space="preserve">Knocked down (team play only):</w:t>
+      </w:r>
+      <w:r>
+        <w:t xml:space="preserve"> if you end your turn with 3 or more Dead cards, you're knocked down instead of eliminated. You can be knocked down only once per game; a second time eliminates you.</w:t>
       </w:r>
     </w:p>
     <w:p>
@@ -3327,45 +3413,7 @@
         </w:numPr>
       </w:pPr>
       <w:r>
-        <w:t xml:space="preserve">Simulation: about 3 drops per game, and players grab nearly all of them.</w:t>
-      </w:r>
-    </w:p>
-    <w:p>
-      <w:pPr>
-        <w:pStyle w:val="ListParagraph"/>
-        <w:numPr>
-          <w:ilvl w:val="0"/>
-          <w:numId w:val="2"/>
-        </w:numPr>
-      </w:pPr>
-      <w:r>
-        <w:rPr>
-          <w:b/>
-          <w:bCs/>
-        </w:rPr>
-        <w:t xml:space="preserve">8–10 player team variant (needs testing):</w:t>
-      </w:r>
-      <w:r>
-        <w:t xml:space="preserve"> duos or squads that share a win. Teammates can revive a knocked-down partner (see Knocked down). Simulation: 10 solo players take about 115 turns, far past 45 minutes, so high player counts need teams or simultaneous turns.</w:t>
-      </w:r>
-    </w:p>
-    <w:p>
-      <w:pPr>
-        <w:pStyle w:val="ListParagraph"/>
-        <w:numPr>
-          <w:ilvl w:val="0"/>
-          <w:numId w:val="2"/>
-        </w:numPr>
-      </w:pPr>
-      <w:r>
-        <w:rPr>
-          <w:b/>
-          <w:bCs/>
-        </w:rPr>
-        <w:t xml:space="preserve">Knocked down (team play only):</w:t>
-      </w:r>
-      <w:r>
-        <w:t xml:space="preserve"> if you end your turn with 3 or more Dead cards, you're knocked down instead of eliminated. You can be knocked down only once per game; a second time eliminates you.</w:t>
+        <w:t xml:space="preserve">While knocked down, you move at most 1 hex, can't attack or loot, and can only play Heal cards.</w:t>
       </w:r>
     </w:p>
     <w:p>
@@ -3377,7 +3425,7 @@
         </w:numPr>
       </w:pPr>
       <w:r>
-        <w:t xml:space="preserve">While knocked down, you move at most 1 hex, can't attack or loot, and can only play Heal cards.</w:t>
+        <w:t xml:space="preserve">Get your hand below 3 Dead cards by the end of your next turn to stand back up. Otherwise you're eliminated at the end of that turn.</w:t>
       </w:r>
     </w:p>
     <w:p>
@@ -3389,7 +3437,7 @@
         </w:numPr>
       </w:pPr>
       <w:r>
-        <w:t xml:space="preserve">Get your hand below 3 Dead cards by the end of your next turn to stand back up. Otherwise you're eliminated at the end of that turn.</w:t>
+        <w:t xml:space="preserve">Any hit that lands on you while you're knocked down eliminates you immediately.</w:t>
       </w:r>
     </w:p>
     <w:p>
@@ -3401,19 +3449,36 @@
         </w:numPr>
       </w:pPr>
       <w:r>
-        <w:t xml:space="preserve">Any hit that lands on you while you're knocked down eliminates you immediately.</w:t>
-      </w:r>
-    </w:p>
-    <w:p>
-      <w:pPr>
-        <w:pStyle w:val="ListParagraph"/>
-        <w:numPr>
-          <w:ilvl w:val="1"/>
+        <w:t xml:space="preserve">A teammate on your hex can spend a Heal card on you to revive you. You stand up with that many fewer Dead cards.</w:t>
+      </w:r>
+    </w:p>
+    <w:p>
+      <w:pPr>
+        <w:pStyle w:val="ListParagraph"/>
+        <w:numPr>
+          <w:ilvl w:val="0"/>
           <w:numId w:val="2"/>
         </w:numPr>
       </w:pPr>
       <w:r>
-        <w:t xml:space="preserve">A teammate on your hex can spend a Heal card on you to revive you. You stand up with that many fewer Dead cards.</w:t>
+        <w:rPr>
+          <w:b/>
+          <w:bCs/>
+        </w:rPr>
+        <w:t xml:space="preserve">Special cards:</w:t>
+      </w:r>
+      <w:r>
+        <w:t xml:space="preserve"> rare cards with unique effects, such as a </w:t>
+      </w:r>
+      <w:r>
+        <w:rPr>
+          <w:b/>
+          <w:bCs/>
+        </w:rPr>
+        <w:t xml:space="preserve">Self-Revive</w:t>
+      </w:r>
+      <w:r>
+        <w:t xml:space="preserve"> that lets a solo player survive one end-of-turn elimination check.</w:t>
       </w:r>
     </w:p>
     <w:p>
@@ -3429,20 +3494,10 @@
           <w:b/>
           <w:bCs/>
         </w:rPr>
-        <w:t xml:space="preserve">Special cards:</w:t>
-      </w:r>
-      <w:r>
-        <w:t xml:space="preserve"> rare cards with unique effects, such as a </w:t>
-      </w:r>
-      <w:r>
-        <w:rPr>
-          <w:b/>
-          <w:bCs/>
-        </w:rPr>
-        <w:t xml:space="preserve">Self-Revive</w:t>
-      </w:r>
-      <w:r>
-        <w:t xml:space="preserve"> that lets a solo player survive one end-of-turn elimination check.</w:t>
+        <w:t xml:space="preserve">Walls:</w:t>
+      </w:r>
+      <w:r>
+        <w:t xml:space="preserve"> spend a card to place a wall on a hex edge. Walls block movement, and attacks through a wall cost +1 range.</w:t>
       </w:r>
     </w:p>
     <w:p>
@@ -3458,10 +3513,10 @@
           <w:b/>
           <w:bCs/>
         </w:rPr>
-        <w:t xml:space="preserve">Walls:</w:t>
-      </w:r>
-      <w:r>
-        <w:t xml:space="preserve"> spend a card to place a wall on a hex edge. Walls block movement, and attacks through a wall cost +1 range.</w:t>
+        <w:t xml:space="preserve">Chests:</w:t>
+      </w:r>
+      <w:r>
+        <w:t xml:space="preserve"> some tiles are chests. Looting one lets you take the display card and the top card of the deck.</w:t>
       </w:r>
     </w:p>
     <w:p>
@@ -3477,10 +3532,18 @@
           <w:b/>
           <w:bCs/>
         </w:rPr>
-        <w:t xml:space="preserve">Chests:</w:t>
-      </w:r>
-      <w:r>
-        <w:t xml:space="preserve"> some tiles are chests. Looting one lets you take the display card and the top card of the deck.</w:t>
+        <w:t xml:space="preserve">Named locations:</w:t>
+      </w:r>
+      <w:r>
+        <w:t xml:space="preserve"> each player places one named tile during setup, such as a factory or a village, with richer loot.</w:t>
+      </w:r>
+    </w:p>
+    <w:p>
+      <w:pPr>
+        <w:pStyle w:val="Heading2"/>
+      </w:pPr>
+      <w:r>
+        <w:t xml:space="preserve">Playtest Questions</w:t>
       </w:r>
     </w:p>
     <w:p>
@@ -3492,22 +3555,7 @@
         </w:numPr>
       </w:pPr>
       <w:r>
-        <w:rPr>
-          <w:b/>
-          <w:bCs/>
-        </w:rPr>
-        <w:t xml:space="preserve">Named locations:</w:t>
-      </w:r>
-      <w:r>
-        <w:t xml:space="preserve"> each player places one named tile during setup, such as a factory or a village, with richer loot.</w:t>
-      </w:r>
-    </w:p>
-    <w:p>
-      <w:pPr>
-        <w:pStyle w:val="Heading2"/>
-      </w:pPr>
-      <w:r>
-        <w:t xml:space="preserve">Playtest Questions</w:t>
+        <w:t xml:space="preserve">With unlimited plays, how long does a turn take? Time a few.</w:t>
       </w:r>
     </w:p>
     <w:p>
@@ -3519,7 +3567,7 @@
         </w:numPr>
       </w:pPr>
       <w:r>
-        <w:t xml:space="preserve">With unlimited plays, how long does a turn take? Time a few.</w:t>
+        <w:t xml:space="preserve">Is upgrading worth giving up a turn's cards? Which stat do people upgrade first?</w:t>
       </w:r>
     </w:p>
     <w:p>
@@ -3531,7 +3579,7 @@
         </w:numPr>
       </w:pPr>
       <w:r>
-        <w:t xml:space="preserve">Is upgrading worth giving up a turn's cards? Which stat do people upgrade first?</w:t>
+        <w:t xml:space="preserve">Heal or Shield: which do players choose, and when? Is a critical turn ever survivable in practice?</w:t>
       </w:r>
     </w:p>
     <w:p>
@@ -3543,7 +3591,7 @@
         </w:numPr>
       </w:pPr>
       <w:r>
-        <w:t xml:space="preserve">Heal or Shield: which do players choose, and when? Is a critical turn ever survivable in practice?</w:t>
+        <w:t xml:space="preserve">Does the storm close at the right pace for 2 players vs 5? Is round 7 the right time for it to speed up?</w:t>
       </w:r>
     </w:p>
     <w:p>
@@ -3555,7 +3603,7 @@
         </w:numPr>
       </w:pPr>
       <w:r>
-        <w:t xml:space="preserve">Does removing 1 tile per turn shrink the board at the right pace for 2 players vs 5?</w:t>
+        <w:t xml:space="preserve">Holding: do players stockpile Heal cards and wait? (Simulation: cautious play wins about half of 5-player games with holding.)</w:t>
       </w:r>
     </w:p>
     <w:p>

</xml_diff>

<commit_message>
Last Deck Standing: siphon idea note, SIM-010 heal spread
Co-Authored-By: Claude Opus 5.5 <noreply@anthropic.com>
</commit_message>
<xml_diff>
--- a/games/last-deck-standing/Last Deck Standing Rules v1.docx
+++ b/games/last-deck-standing/Last Deck Standing Rules v1.docx
@@ -3259,6 +3259,25 @@
       </w:r>
       <w:r>
         <w:t xml:space="preserve"> Sharing a hex is allowed on purpose. You can go all in for maximum damage, but if you don't get away afterward, they hit you back.</w:t>
+      </w:r>
+    </w:p>
+    <w:p>
+      <w:pPr>
+        <w:pStyle w:val="ListParagraph"/>
+        <w:numPr>
+          <w:ilvl w:val="0"/>
+          <w:numId w:val="2"/>
+        </w:numPr>
+      </w:pPr>
+      <w:r>
+        <w:rPr>
+          <w:b/>
+          <w:bCs/>
+        </w:rPr>
+        <w:t xml:space="preserve">Siphon (from Fortnite):</w:t>
+      </w:r>
+      <w:r>
+        <w:t xml:space="preserve"> when your attack lands 2 or more Dead cards, return 1 Dead card from your own hand to the supply. Aggressive players heal by fighting instead of hoarding Heal cards. Untested.</w:t>
       </w:r>
     </w:p>
     <w:p>

</xml_diff>

<commit_message>
Last Deck Standing: supply drops in the main rules (one per player)
Co-Authored-By: Claude Opus 5.5 <noreply@anthropic.com>
</commit_message>
<xml_diff>
--- a/games/last-deck-standing/Last Deck Standing Rules v1.docx
+++ b/games/last-deck-standing/Last Deck Standing Rules v1.docx
@@ -1027,7 +1027,7 @@
                 <w:sz w:val="20"/>
                 <w:szCs w:val="20"/>
               </w:rPr>
-              <w:t xml:space="preserve">25 spaces; round 7 marked "Storm closes fast"</w:t>
+              <w:t xml:space="preserve">25 spaces; round 7 marked "Storm closes fast"; rounds 3, 5, 7, 9, 11 marked "Supply drop"</w:t>
             </w:r>
           </w:p>
         </w:tc>
@@ -1058,7 +1058,7 @@
                 <w:sz w:val="20"/>
                 <w:szCs w:val="20"/>
               </w:rPr>
-              <w:t xml:space="preserve">Storm markers</w:t>
+              <w:t xml:space="preserve">Gold deck</w:t>
             </w:r>
           </w:p>
         </w:tc>
@@ -1084,7 +1084,7 @@
                 <w:sz w:val="20"/>
                 <w:szCs w:val="20"/>
               </w:rPr>
-              <w:t xml:space="preserve">50</w:t>
+              <w:t xml:space="preserve">12</w:t>
             </w:r>
           </w:p>
         </w:tc>
@@ -1110,7 +1110,7 @@
                 <w:sz w:val="20"/>
                 <w:szCs w:val="20"/>
               </w:rPr>
-              <w:t xml:space="preserve">Discs or translucent hex overlays placed on tiles; loot icons stay visible</w:t>
+              <w:t xml:space="preserve">Value-2 and value-3 cards of mixed types (Attack, Move, Heal), for supply drops</w:t>
             </w:r>
           </w:p>
         </w:tc>
@@ -1141,6 +1141,172 @@
                 <w:sz w:val="20"/>
                 <w:szCs w:val="20"/>
               </w:rPr>
+              <w:t xml:space="preserve">Supply drop marker</w:t>
+            </w:r>
+          </w:p>
+        </w:tc>
+        <w:tc>
+          <w:tcPr>
+            <w:tcW w:type="dxa" w:w="3219"/>
+            <w:tcBorders>
+              <w:top w:val="single" w:color="C9CCD6" w:sz="4"/>
+              <w:left w:val="single" w:color="C9CCD6" w:sz="4"/>
+              <w:bottom w:val="single" w:color="C9CCD6" w:sz="4"/>
+              <w:right w:val="single" w:color="C9CCD6" w:sz="4"/>
+            </w:tcBorders>
+            <w:tcMar>
+              <w:top w:type="dxa" w:w="60"/>
+              <w:left w:type="dxa" w:w="100"/>
+              <w:bottom w:type="dxa" w:w="60"/>
+              <w:right w:type="dxa" w:w="100"/>
+            </w:tcMar>
+          </w:tcPr>
+          <w:p>
+            <w:r>
+              <w:rPr>
+                <w:sz w:val="20"/>
+                <w:szCs w:val="20"/>
+              </w:rPr>
+              <w:t xml:space="preserve">1</w:t>
+            </w:r>
+          </w:p>
+        </w:tc>
+        <w:tc>
+          <w:tcPr>
+            <w:tcW w:type="dxa" w:w="4494"/>
+            <w:tcBorders>
+              <w:top w:val="single" w:color="C9CCD6" w:sz="4"/>
+              <w:left w:val="single" w:color="C9CCD6" w:sz="4"/>
+              <w:bottom w:val="single" w:color="C9CCD6" w:sz="4"/>
+              <w:right w:val="single" w:color="C9CCD6" w:sz="4"/>
+            </w:tcBorders>
+            <w:tcMar>
+              <w:top w:type="dxa" w:w="60"/>
+              <w:left w:type="dxa" w:w="100"/>
+              <w:bottom w:type="dxa" w:w="60"/>
+              <w:right w:type="dxa" w:w="100"/>
+            </w:tcMar>
+          </w:tcPr>
+          <w:p>
+            <w:r>
+              <w:rPr>
+                <w:sz w:val="20"/>
+                <w:szCs w:val="20"/>
+              </w:rPr>
+              <w:t xml:space="preserve">Shows where the current drop landed</w:t>
+            </w:r>
+          </w:p>
+        </w:tc>
+      </w:tr>
+      <w:tr>
+        <w:trPr>
+          <w:tblHeader w:val="off"/>
+        </w:trPr>
+        <w:tc>
+          <w:tcPr>
+            <w:tcW w:type="dxa" w:w="1647"/>
+            <w:tcBorders>
+              <w:top w:val="single" w:color="C9CCD6" w:sz="4"/>
+              <w:left w:val="single" w:color="C9CCD6" w:sz="4"/>
+              <w:bottom w:val="single" w:color="C9CCD6" w:sz="4"/>
+              <w:right w:val="single" w:color="C9CCD6" w:sz="4"/>
+            </w:tcBorders>
+            <w:tcMar>
+              <w:top w:type="dxa" w:w="60"/>
+              <w:left w:type="dxa" w:w="100"/>
+              <w:bottom w:type="dxa" w:w="60"/>
+              <w:right w:type="dxa" w:w="100"/>
+            </w:tcMar>
+          </w:tcPr>
+          <w:p>
+            <w:r>
+              <w:rPr>
+                <w:sz w:val="20"/>
+                <w:szCs w:val="20"/>
+              </w:rPr>
+              <w:t xml:space="preserve">Storm markers</w:t>
+            </w:r>
+          </w:p>
+        </w:tc>
+        <w:tc>
+          <w:tcPr>
+            <w:tcW w:type="dxa" w:w="3219"/>
+            <w:tcBorders>
+              <w:top w:val="single" w:color="C9CCD6" w:sz="4"/>
+              <w:left w:val="single" w:color="C9CCD6" w:sz="4"/>
+              <w:bottom w:val="single" w:color="C9CCD6" w:sz="4"/>
+              <w:right w:val="single" w:color="C9CCD6" w:sz="4"/>
+            </w:tcBorders>
+            <w:tcMar>
+              <w:top w:type="dxa" w:w="60"/>
+              <w:left w:type="dxa" w:w="100"/>
+              <w:bottom w:type="dxa" w:w="60"/>
+              <w:right w:type="dxa" w:w="100"/>
+            </w:tcMar>
+          </w:tcPr>
+          <w:p>
+            <w:r>
+              <w:rPr>
+                <w:sz w:val="20"/>
+                <w:szCs w:val="20"/>
+              </w:rPr>
+              <w:t xml:space="preserve">50</w:t>
+            </w:r>
+          </w:p>
+        </w:tc>
+        <w:tc>
+          <w:tcPr>
+            <w:tcW w:type="dxa" w:w="4494"/>
+            <w:tcBorders>
+              <w:top w:val="single" w:color="C9CCD6" w:sz="4"/>
+              <w:left w:val="single" w:color="C9CCD6" w:sz="4"/>
+              <w:bottom w:val="single" w:color="C9CCD6" w:sz="4"/>
+              <w:right w:val="single" w:color="C9CCD6" w:sz="4"/>
+            </w:tcBorders>
+            <w:tcMar>
+              <w:top w:type="dxa" w:w="60"/>
+              <w:left w:type="dxa" w:w="100"/>
+              <w:bottom w:type="dxa" w:w="60"/>
+              <w:right w:type="dxa" w:w="100"/>
+            </w:tcMar>
+          </w:tcPr>
+          <w:p>
+            <w:r>
+              <w:rPr>
+                <w:sz w:val="20"/>
+                <w:szCs w:val="20"/>
+              </w:rPr>
+              <w:t xml:space="preserve">Discs or translucent hex overlays placed on tiles; loot icons stay visible</w:t>
+            </w:r>
+          </w:p>
+        </w:tc>
+      </w:tr>
+      <w:tr>
+        <w:trPr>
+          <w:tblHeader w:val="off"/>
+        </w:trPr>
+        <w:tc>
+          <w:tcPr>
+            <w:tcW w:type="dxa" w:w="1647"/>
+            <w:tcBorders>
+              <w:top w:val="single" w:color="C9CCD6" w:sz="4"/>
+              <w:left w:val="single" w:color="C9CCD6" w:sz="4"/>
+              <w:bottom w:val="single" w:color="C9CCD6" w:sz="4"/>
+              <w:right w:val="single" w:color="C9CCD6" w:sz="4"/>
+            </w:tcBorders>
+            <w:tcMar>
+              <w:top w:type="dxa" w:w="60"/>
+              <w:left w:type="dxa" w:w="100"/>
+              <w:bottom w:type="dxa" w:w="60"/>
+              <w:right w:type="dxa" w:w="100"/>
+            </w:tcMar>
+          </w:tcPr>
+          <w:p>
+            <w:r>
+              <w:rPr>
+                <w:sz w:val="20"/>
+                <w:szCs w:val="20"/>
+              </w:rPr>
               <w:t xml:space="preserve">Loot pile markers</w:t>
             </w:r>
           </w:p>
@@ -1343,7 +1509,7 @@
         </w:numPr>
       </w:pPr>
       <w:r>
-        <w:t xml:space="preserve">Shuffle the three supply decks separately and place them face down. Turn the top card of each face up. Those three cards are the </w:t>
+        <w:t xml:space="preserve">Shuffle the gold deck face down. Shuffle the three supply decks separately and place them face down. Turn the top card of each face up. Those three cards are the </w:t>
       </w:r>
       <w:r>
         <w:rPr>
@@ -2113,7 +2279,7 @@
         <w:spacing w:after="120"/>
       </w:pPr>
       <w:r>
-        <w:t xml:space="preserve">Once per turn, you may take either 1 cube from the tile you're on or make one claim on a loot pile there (see Elimination), never both. Return the cube to the general supply and gain a card of that type (Move cube → Movement deck, Attack → Attack deck, Heal → Heal deck). Choose either:</w:t>
+        <w:t xml:space="preserve">Once per turn, you may take 1 cube from the tile you're on, make one claim on a loot pile there (see Elimination), or take 1 card from a supply drop there (see Supply Drops). Only one of these per turn. Return the cube to the general supply and gain a card of that type (Move cube → Movement deck, Attack → Attack deck, Heal → Heal deck). Choose either:</w:t>
       </w:r>
     </w:p>
     <w:p>
@@ -2598,6 +2764,116 @@
         <w:pStyle w:val="Heading1"/>
       </w:pPr>
       <w:r>
+        <w:t xml:space="preserve">Supply Drops</w:t>
+      </w:r>
+    </w:p>
+    <w:p>
+      <w:pPr>
+        <w:spacing w:after="120"/>
+      </w:pPr>
+      <w:r>
+        <w:t xml:space="preserve">A supply drop lands at the start of rounds </w:t>
+      </w:r>
+      <w:r>
+        <w:rPr>
+          <w:b/>
+          <w:bCs/>
+        </w:rPr>
+        <w:t xml:space="preserve">3, 5, 7, 9 and 11</w:t>
+      </w:r>
+      <w:r>
+        <w:t xml:space="preserve">, but only one per player: with 2 players, only rounds 3 and 5; with 3 players, rounds 3, 5 and 7; and so on.</w:t>
+      </w:r>
+    </w:p>
+    <w:p>
+      <w:pPr>
+        <w:pStyle w:val="ListParagraph"/>
+        <w:numPr>
+          <w:ilvl w:val="0"/>
+          <w:numId w:val="7"/>
+        </w:numPr>
+      </w:pPr>
+      <w:r>
+        <w:rPr>
+          <w:b/>
+          <w:bCs/>
+        </w:rPr>
+        <w:t xml:space="preserve">Who places it:</w:t>
+      </w:r>
+      <w:r>
+        <w:t xml:space="preserve"> the start player places the first drop, then the next player clockwise places the next one, skipping eliminated players.</w:t>
+      </w:r>
+    </w:p>
+    <w:p>
+      <w:pPr>
+        <w:pStyle w:val="ListParagraph"/>
+        <w:numPr>
+          <w:ilvl w:val="0"/>
+          <w:numId w:val="7"/>
+        </w:numPr>
+      </w:pPr>
+      <w:r>
+        <w:rPr>
+          <w:b/>
+          <w:bCs/>
+        </w:rPr>
+        <w:t xml:space="preserve">Placing:</w:t>
+      </w:r>
+      <w:r>
+        <w:t xml:space="preserve"> draw 2 gold cards face up and put them with the drop marker on any tile at least 3 tiles from your own pawn.</w:t>
+      </w:r>
+    </w:p>
+    <w:p>
+      <w:pPr>
+        <w:pStyle w:val="ListParagraph"/>
+        <w:numPr>
+          <w:ilvl w:val="0"/>
+          <w:numId w:val="7"/>
+        </w:numPr>
+      </w:pPr>
+      <w:r>
+        <w:rPr>
+          <w:b/>
+          <w:bCs/>
+        </w:rPr>
+        <w:t xml:space="preserve">Nudging:</w:t>
+      </w:r>
+      <w:r>
+        <w:t xml:space="preserve"> then each other player, clockwise, may move the drop 1 tile or pass.</w:t>
+      </w:r>
+    </w:p>
+    <w:p>
+      <w:pPr>
+        <w:pStyle w:val="ListParagraph"/>
+        <w:numPr>
+          <w:ilvl w:val="0"/>
+          <w:numId w:val="7"/>
+        </w:numPr>
+      </w:pPr>
+      <w:r>
+        <w:rPr>
+          <w:b/>
+          <w:bCs/>
+        </w:rPr>
+        <w:t xml:space="preserve">Looting:</w:t>
+      </w:r>
+      <w:r>
+        <w:t xml:space="preserve"> looting the drop uses your loot action. Take 1 of its cards into your discard pile. The other card stays for the next looter. When both are taken, remove the marker.</w:t>
+      </w:r>
+    </w:p>
+    <w:p>
+      <w:pPr>
+        <w:spacing w:after="120"/>
+      </w:pPr>
+      <w:r>
+        <w:t xml:space="preserve">A drop can land on a storm tile, and storm markers can be placed on a drop's tile.</w:t>
+      </w:r>
+    </w:p>
+    <w:p>
+      <w:pPr>
+        <w:pStyle w:val="Heading1"/>
+      </w:pPr>
+      <w:r>
         <w:t xml:space="preserve">Elimination</w:t>
       </w:r>
     </w:p>
@@ -2614,7 +2890,7 @@
         <w:pStyle w:val="ListParagraph"/>
         <w:numPr>
           <w:ilvl w:val="0"/>
-          <w:numId w:val="7"/>
+          <w:numId w:val="8"/>
         </w:numPr>
       </w:pPr>
       <w:r>
@@ -2626,7 +2902,7 @@
         <w:pStyle w:val="ListParagraph"/>
         <w:numPr>
           <w:ilvl w:val="0"/>
-          <w:numId w:val="7"/>
+          <w:numId w:val="8"/>
         </w:numPr>
       </w:pPr>
       <w:r>
@@ -2648,7 +2924,7 @@
         <w:pStyle w:val="ListParagraph"/>
         <w:numPr>
           <w:ilvl w:val="0"/>
-          <w:numId w:val="7"/>
+          <w:numId w:val="8"/>
         </w:numPr>
       </w:pPr>
       <w:r>
@@ -2738,7 +3014,7 @@
         <w:pStyle w:val="ListParagraph"/>
         <w:numPr>
           <w:ilvl w:val="0"/>
-          <w:numId w:val="7"/>
+          <w:numId w:val="8"/>
         </w:numPr>
       </w:pPr>
       <w:r>
@@ -3125,7 +3401,22 @@
         <w:t xml:space="preserve">Actions (any order):</w:t>
       </w:r>
       <w:r>
-        <w:t xml:space="preserve"> play any cards · move · 1 attack · 1 loot (1 cube or 1 pile claim) · upgrade</w:t>
+        <w:t xml:space="preserve"> play any cards · move · 1 attack · 1 loot (1 cube, 1 pile claim or 1 drop card) · upgrade</w:t>
+      </w:r>
+    </w:p>
+    <w:p>
+      <w:pPr>
+        <w:spacing w:after="120"/>
+      </w:pPr>
+      <w:r>
+        <w:rPr>
+          <w:b/>
+          <w:bCs/>
+        </w:rPr>
+        <w:t xml:space="preserve">Supply drops:</w:t>
+      </w:r>
+      <w:r>
+        <w:t xml:space="preserve"> rounds 3, 5, 7, 9, 11 (one per player); placed 3+ tiles from the placer, then everyone may nudge it 1 tile</w:t>
       </w:r>
     </w:p>
     <w:p>
@@ -3316,73 +3607,6 @@
       </w:r>
       <w:r>
         <w:t xml:space="preserve"> Attack cards like a Shotgun that leave the game after use.</w:t>
-      </w:r>
-    </w:p>
-    <w:p>
-      <w:pPr>
-        <w:pStyle w:val="ListParagraph"/>
-        <w:numPr>
-          <w:ilvl w:val="0"/>
-          <w:numId w:val="2"/>
-        </w:numPr>
-      </w:pPr>
-      <w:r>
-        <w:rPr>
-          <w:b/>
-          <w:bCs/>
-        </w:rPr>
-        <w:t xml:space="preserve">Supply drops (gold deck):</w:t>
-      </w:r>
-      <w:r>
-        <w:t xml:space="preserve"> a separate 12-card gold deck of value-2 and value-3 cards of mixed types, shuffled.</w:t>
-      </w:r>
-    </w:p>
-    <w:p>
-      <w:pPr>
-        <w:pStyle w:val="ListParagraph"/>
-        <w:numPr>
-          <w:ilvl w:val="1"/>
-          <w:numId w:val="2"/>
-        </w:numPr>
-      </w:pPr>
-      <w:r>
-        <w:t xml:space="preserve">At the start of rounds 4, 8 and 12, a drop of 2 gold cards lands. The placer puts it on any tile at least 3 tiles from their own pawn. Then each other player, clockwise, may nudge it 1 tile or pass. It can never be nudged off the board.</w:t>
-      </w:r>
-    </w:p>
-    <w:p>
-      <w:pPr>
-        <w:pStyle w:val="ListParagraph"/>
-        <w:numPr>
-          <w:ilvl w:val="1"/>
-          <w:numId w:val="2"/>
-        </w:numPr>
-      </w:pPr>
-      <w:r>
-        <w:t xml:space="preserve">Placement rotates: the start player places the round 4 drop, the next player clockwise places round 8, and so on.</w:t>
-      </w:r>
-    </w:p>
-    <w:p>
-      <w:pPr>
-        <w:pStyle w:val="ListParagraph"/>
-        <w:numPr>
-          <w:ilvl w:val="1"/>
-          <w:numId w:val="2"/>
-        </w:numPr>
-      </w:pPr>
-      <w:r>
-        <w:t xml:space="preserve">Looting the drop uses your loot action: take 1 of its cards into your discard pile. The other card stays for the next looter.</w:t>
-      </w:r>
-    </w:p>
-    <w:p>
-      <w:pPr>
-        <w:pStyle w:val="ListParagraph"/>
-        <w:numPr>
-          <w:ilvl w:val="1"/>
-          <w:numId w:val="2"/>
-        </w:numPr>
-      </w:pPr>
-      <w:r>
-        <w:t xml:space="preserve">Simulation: about 3 drops per game, and players grab nearly all of them.</w:t>
       </w:r>
     </w:p>
     <w:p>
@@ -3886,6 +4110,12 @@
     </w:lvlOverride>
   </w:num>
   <w:num w:numId="7">
+    <w:abstractNumId w:val="3"/>
+    <w:lvlOverride w:ilvl="0">
+      <w:startOverride w:val="1"/>
+    </w:lvlOverride>
+  </w:num>
+  <w:num w:numId="8">
     <w:abstractNumId w:val="3"/>
     <w:lvlOverride w:ilvl="0">
       <w:startOverride w:val="1"/>

</xml_diff>

<commit_message>
Last Deck Standing: loot pile findings and kill-reward ideas in notes (SIM-012)
Co-Authored-By: Claude Opus 5.5 <noreply@anthropic.com>
</commit_message>
<xml_diff>
--- a/games/last-deck-standing/Last Deck Standing Rules v1.docx
+++ b/games/last-deck-standing/Last Deck Standing Rules v1.docx
@@ -3568,7 +3568,45 @@
         <w:t xml:space="preserve">Siphon (from Fortnite):</w:t>
       </w:r>
       <w:r>
-        <w:t xml:space="preserve"> when your attack lands 2 or more Dead cards, return 1 Dead card from your own hand to the supply. Aggressive players heal by fighting instead of hoarding Heal cards. Untested.</w:t>
+        <w:t xml:space="preserve"> when your attack lands 2 or more Dead cards, return 1 Dead card from your own hand to the supply. Aggressive players heal by fighting instead of hoarding Heal cards. Untested; the top candidate if cautious play dominates, because it rewards every hit rather than just the kill.</w:t>
+      </w:r>
+    </w:p>
+    <w:p>
+      <w:pPr>
+        <w:pStyle w:val="ListParagraph"/>
+        <w:numPr>
+          <w:ilvl w:val="0"/>
+          <w:numId w:val="2"/>
+        </w:numPr>
+      </w:pPr>
+      <w:r>
+        <w:rPr>
+          <w:b/>
+          <w:bCs/>
+        </w:rPr>
+        <w:t xml:space="preserve">Eliminator claims first:</w:t>
+      </w:r>
+      <w:r>
+        <w:t xml:space="preserve"> the player who landed the final hit on an eliminated player takes the first loot-pile claim (5 cards) immediately, from anywhere. A direct kill reward; similar kill rewards barely helped in simulation (SIM-004), because the final hit often lands on an already weakened player.</w:t>
+      </w:r>
+    </w:p>
+    <w:p>
+      <w:pPr>
+        <w:pStyle w:val="ListParagraph"/>
+        <w:numPr>
+          <w:ilvl w:val="0"/>
+          <w:numId w:val="2"/>
+        </w:numPr>
+      </w:pPr>
+      <w:r>
+        <w:rPr>
+          <w:b/>
+          <w:bCs/>
+        </w:rPr>
+        <w:t xml:space="preserve">Why loot piles don't reward fighters (SIM-012):</w:t>
+      </w:r>
+      <w:r>
+        <w:t xml:space="preserve"> piles go to whoever reaches them first. Cautious players take 39% of claims, aggressive only 23%, and the player who landed the final hit claims only about a third. Piles stay in the game because they pull players toward fights, but they don't fix cautious play winning about half of 5-player games.</w:t>
       </w:r>
     </w:p>
     <w:p>

</xml_diff>

<commit_message>
Last Deck Standing: print-and-play PDF, READTHROUGH-003 wording fixes
Adds sim/pnp_sheets.py and pnp/ (28-page letter PDF: cards, Dead cards,
5 tile sets, stat trackers, round track, storm markers, reference cards).

Co-Authored-By: Claude Opus 5.5 <noreply@anthropic.com>
</commit_message>
<xml_diff>
--- a/games/last-deck-standing/Last Deck Standing Rules v1.docx
+++ b/games/last-deck-standing/Last Deck Standing Rules v1.docx
@@ -1110,7 +1110,7 @@
                 <w:sz w:val="20"/>
                 <w:szCs w:val="20"/>
               </w:rPr>
-              <w:t xml:space="preserve">Value-2 and value-3 cards of mixed types (Attack, Move, Heal), for supply drops</w:t>
+              <w:t xml:space="preserve">For supply drops: 2 each of Attack 2, Attack 3, Move 2, Move 3, Heal 2, Heal 3</w:t>
             </w:r>
           </w:p>
         </w:tc>
@@ -1485,7 +1485,7 @@
         <w:t xml:space="preserve">3 tiles away</w:t>
       </w:r>
       <w:r>
-        <w:t xml:space="preserve"> (straight-line distance) from every pawn already placed. If no tile is that far away, place it as far as you can.</w:t>
+        <w:t xml:space="preserve"> (hex distance, counted straight across any gaps) from every pawn already placed. If no tile is that far away, choose the tile whose nearest pawn is as far away as possible.</w:t>
       </w:r>
     </w:p>
     <w:p>
@@ -1790,7 +1790,7 @@
         <w:t xml:space="preserve">You may keep any unplayed cards in your hand</w:t>
       </w:r>
       <w:r>
-        <w:t xml:space="preserve">; Dead cards must stay. Your hand limit is 5, counting Dead cards.</w:t>
+        <w:t xml:space="preserve">; Dead cards must stay. Any card you put into play counts as played, even if you didn't use all of its value.</w:t>
       </w:r>
     </w:p>
     <w:p>
@@ -2190,7 +2190,7 @@
         <w:t xml:space="preserve">Range</w:t>
       </w:r>
       <w:r>
-        <w:t xml:space="preserve"> is the straight-line hex distance from your tile to theirs, The same tile is range 0, and an adjacent tile is range 1.</w:t>
+        <w:t xml:space="preserve"> is the hex distance from your tile to theirs, counted straight across any gaps. The same tile is range 0, and an adjacent tile is range 1.</w:t>
       </w:r>
     </w:p>
     <w:p>
@@ -2279,7 +2279,7 @@
         <w:spacing w:after="120"/>
       </w:pPr>
       <w:r>
-        <w:t xml:space="preserve">Once per turn, you may take 1 cube from the tile you're on, make one claim on a loot pile there (see Elimination), or take 1 card from a supply drop there (see Supply Drops). Only one of these per turn. Return the cube to the general supply and gain a card of that type (Move cube → Movement deck, Attack → Attack deck, Heal → Heal deck). Choose either:</w:t>
+        <w:t xml:space="preserve">Once per turn, you may take 1 cube from the tile you're on, make one claim on a loot pile there (see Elimination; if there are several piles, pick one), or take 1 card from a supply drop there (see Supply Drops). Only one of these per turn. Return the cube to the general supply and gain a card of that type (Move cube → Movement deck, Attack → Attack deck, Heal → Heal deck). Choose either:</w:t>
       </w:r>
     </w:p>
     <w:p>
@@ -2357,7 +2357,7 @@
         <w:spacing w:after="120"/>
       </w:pPr>
       <w:r>
-        <w:t xml:space="preserve">At any time on your turn, pay cards from your hand of one type with a total value of </w:t>
+        <w:t xml:space="preserve">During your Actions phase, pay cards from your hand of one type with a total value of </w:t>
       </w:r>
       <w:r>
         <w:rPr>
@@ -2731,7 +2731,7 @@
         <w:t xml:space="preserve">Placing markers:</w:t>
       </w:r>
       <w:r>
-        <w:t xml:space="preserve"> put each marker on an unmarked tile that is on the edge of the board or touches a marked tile. You choose which. It doesn't matter what's on the tile: pawns, loot cubes and loot piles all stay. Once every tile is marked, stop placing markers.</w:t>
+        <w:t xml:space="preserve"> put each marker on an unmarked tile that is on the edge of the board (at least one of its six sides has no tile next to it, including sides facing a hole) or touches a marked tile. You choose which. It doesn't matter what's on the tile: pawns, loot cubes and loot piles all stay. Once every tile is marked, stop placing markers.</w:t>
       </w:r>
     </w:p>
     <w:p>
@@ -2782,7 +2782,17 @@
         <w:t xml:space="preserve">3, 5, 7, 9 and 11</w:t>
       </w:r>
       <w:r>
-        <w:t xml:space="preserve">, but only one per player: with 2 players, only rounds 3 and 5; with 3 players, rounds 3, 5 and 7; and so on.</w:t>
+        <w:t xml:space="preserve">, before the start player's upkeep. The number of drops is set by the </w:t>
+      </w:r>
+      <w:r>
+        <w:rPr>
+          <w:b/>
+          <w:bCs/>
+        </w:rPr>
+        <w:t xml:space="preserve">starting</w:t>
+      </w:r>
+      <w:r>
+        <w:t xml:space="preserve"> player count: with 2 players, only rounds 3 and 5; with 3 players, rounds 3, 5 and 7; and so on. When a new drop lands, any card left in the previous drop is removed from the game.</w:t>
       </w:r>
     </w:p>
     <w:p>
@@ -2801,7 +2811,7 @@
         <w:t xml:space="preserve">Who places it:</w:t>
       </w:r>
       <w:r>
-        <w:t xml:space="preserve"> the start player places the first drop, then the next player clockwise places the next one, skipping eliminated players.</w:t>
+        <w:t xml:space="preserve"> the start player places the first drop, then placing passes clockwise to the next player still in the game.</w:t>
       </w:r>
     </w:p>
     <w:p>
@@ -3386,7 +3396,7 @@
         <w:t xml:space="preserve">Upkeep:</w:t>
       </w:r>
       <w:r>
-        <w:t xml:space="preserve"> reset Shield → draw up to 5 (held and Dead cards count) → 3+ Dead: announce "critical"</w:t>
+        <w:t xml:space="preserve"> reset Shield → draw up to 5 (held and Dead cards count; reshuffle your discard pile if your deck runs out) → 3+ Dead: announce "critical"</w:t>
       </w:r>
     </w:p>
     <w:p>
@@ -3446,7 +3456,7 @@
         <w:t xml:space="preserve">Storm:</w:t>
       </w:r>
       <w:r>
-        <w:t xml:space="preserve"> place markers from the outside in: 1 per turn (rounds 1–6), 2 per turn (round 7+). End your turn on a storm tile: 1 Dead card (round 7+: 2) to your discard pile; Shield doesn't block it</w:t>
+        <w:t xml:space="preserve"> place markers on edge tiles or tiles touching a marked tile: 1 per turn (rounds 1–6), 2 per turn (round 7+). End your turn on a storm tile: 1 Dead card (round 7+: 2) to your discard pile; Shield doesn't block it</w:t>
       </w:r>
     </w:p>
     <w:p>
@@ -3476,7 +3486,7 @@
         <w:t xml:space="preserve">End:</w:t>
       </w:r>
       <w:r>
-        <w:t xml:space="preserve"> eliminated if 3+ Dead in hand → discard played cards, keep any others (hand limit 5) → storm markers → storm damage</w:t>
+        <w:t xml:space="preserve"> eliminated if 3+ Dead in hand (then skip the rest) → discard played cards, keep any others → storm markers → storm damage</w:t>
       </w:r>
     </w:p>
     <w:p>

</xml_diff>

<commit_message>
Last Deck Standing: draw at least 2 at upkeep, drops off storm/edge tiles (SIM-013)
Co-Authored-By: Claude Opus 5.5 <noreply@anthropic.com>
</commit_message>
<xml_diff>
--- a/games/last-deck-standing/Last Deck Standing Rules v1.docx
+++ b/games/last-deck-standing/Last Deck Standing Rules v1.docx
@@ -1603,7 +1603,24 @@
         </w:numPr>
       </w:pPr>
       <w:r>
-        <w:t xml:space="preserve">Draw until you have 5 cards in hand. Dead cards still in your hand count toward the 5. If your draw pile runs out, shuffle your discard pile to make a new one and keep drawing. If both are empty, stop drawing.</w:t>
+        <w:rPr>
+          <w:b/>
+          <w:bCs/>
+        </w:rPr>
+        <w:t xml:space="preserve">Draw:</w:t>
+      </w:r>
+      <w:r>
+        <w:t xml:space="preserve"> draw until you have 5 cards in hand, and always draw </w:t>
+      </w:r>
+      <w:r>
+        <w:rPr>
+          <w:b/>
+          <w:bCs/>
+        </w:rPr>
+        <w:t xml:space="preserve">at least 2</w:t>
+      </w:r>
+      <w:r>
+        <w:t xml:space="preserve"> cards. If that puts you over 5, discard cards of your choice until you have 5 (Dead cards can't be discarded). Held cards and Dead cards count toward the 5. If your draw pile runs out, shuffle your discard pile to make a new one and keep drawing. If both are empty, stop drawing.</w:t>
       </w:r>
     </w:p>
     <w:p>
@@ -2830,7 +2847,17 @@
         <w:t xml:space="preserve">Placing:</w:t>
       </w:r>
       <w:r>
-        <w:t xml:space="preserve"> draw 2 gold cards face up and put them with the drop marker on any tile at least 3 tiles from your own pawn.</w:t>
+        <w:t xml:space="preserve"> draw 2 gold cards face up and put them with the drop marker on any tile that is </w:t>
+      </w:r>
+      <w:r>
+        <w:rPr>
+          <w:b/>
+          <w:bCs/>
+        </w:rPr>
+        <w:t xml:space="preserve">not a storm tile and not an edge tile</w:t>
+      </w:r>
+      <w:r>
+        <w:t xml:space="preserve">.</w:t>
       </w:r>
     </w:p>
     <w:p>
@@ -3396,7 +3423,7 @@
         <w:t xml:space="preserve">Upkeep:</w:t>
       </w:r>
       <w:r>
-        <w:t xml:space="preserve"> reset Shield → draw up to 5 (held and Dead cards count; reshuffle your discard pile if your deck runs out) → 3+ Dead: announce "critical"</w:t>
+        <w:t xml:space="preserve"> reset Shield → draw up to 5 and at least 2, then discard down to 5 (not Dead cards) → 3+ Dead: announce "critical"</w:t>
       </w:r>
     </w:p>
     <w:p>
@@ -3426,7 +3453,7 @@
         <w:t xml:space="preserve">Supply drops:</w:t>
       </w:r>
       <w:r>
-        <w:t xml:space="preserve"> rounds 3, 5, 7, 9, 11 (one per player); placed 3+ tiles from the placer, then everyone may nudge it 1 tile</w:t>
+        <w:t xml:space="preserve"> rounds 3, 5, 7, 9, 11 (one per starting player); placed on a tile that's not storm or edge, then everyone may nudge it 1 tile</w:t>
       </w:r>
     </w:p>
     <w:p>

</xml_diff>

<commit_message>
Last Deck Standing: 3 face-up cards per supply deck (SIM-014)
Co-Authored-By: Claude Opus 5.5 <noreply@anthropic.com>
</commit_message>
<xml_diff>
--- a/games/last-deck-standing/Last Deck Standing Rules v1.docx
+++ b/games/last-deck-standing/Last Deck Standing Rules v1.docx
@@ -1509,7 +1509,17 @@
         </w:numPr>
       </w:pPr>
       <w:r>
-        <w:t xml:space="preserve">Shuffle the gold deck face down. Shuffle the three supply decks separately and place them face down. Turn the top card of each face up. Those three cards are the </w:t>
+        <w:t xml:space="preserve">Shuffle the gold deck face down. Shuffle the three supply decks separately and place them face down. Turn the top </w:t>
+      </w:r>
+      <w:r>
+        <w:rPr>
+          <w:b/>
+          <w:bCs/>
+        </w:rPr>
+        <w:t xml:space="preserve">3</w:t>
+      </w:r>
+      <w:r>
+        <w:t xml:space="preserve"> cards of each deck face up in a row beside it. Those 9 cards are the </w:t>
       </w:r>
       <w:r>
         <w:rPr>
@@ -2308,17 +2318,14 @@
         </w:numPr>
       </w:pPr>
       <w:r>
-        <w:t xml:space="preserve">the </w:t>
-      </w:r>
-      <w:r>
-        <w:rPr>
-          <w:b/>
-          <w:bCs/>
-        </w:rPr>
-        <w:t xml:space="preserve">face-up card</w:t>
-      </w:r>
-      <w:r>
-        <w:t xml:space="preserve"> of that type in the loot display (then turn the next card of that deck face up), or</w:t>
+        <w:rPr>
+          <w:b/>
+          <w:bCs/>
+        </w:rPr>
+        <w:t xml:space="preserve">any one of the 3 face-up cards</w:t>
+      </w:r>
+      <w:r>
+        <w:t xml:space="preserve"> of that type in the loot display (then turn the next card of that deck face up to refill the row), or</w:t>
       </w:r>
     </w:p>
     <w:p>

</xml_diff>

<commit_message>
Last Deck Standing: 2 face-up cards per supply deck; no round-25 backstop
Co-Authored-By: Claude Opus 5.5 <noreply@anthropic.com>
</commit_message>
<xml_diff>
--- a/games/last-deck-standing/Last Deck Standing Rules v1.docx
+++ b/games/last-deck-standing/Last Deck Standing Rules v1.docx
@@ -1516,10 +1516,10 @@
           <w:b/>
           <w:bCs/>
         </w:rPr>
-        <w:t xml:space="preserve">3</w:t>
-      </w:r>
-      <w:r>
-        <w:t xml:space="preserve"> cards of each deck face up in a row beside it. Those 9 cards are the </w:t>
+        <w:t xml:space="preserve">2</w:t>
+      </w:r>
+      <w:r>
+        <w:t xml:space="preserve"> cards of each deck face up in a row beside it. Those 6 cards are the </w:t>
       </w:r>
       <w:r>
         <w:rPr>
@@ -2322,7 +2322,7 @@
           <w:b/>
           <w:bCs/>
         </w:rPr>
-        <w:t xml:space="preserve">any one of the 3 face-up cards</w:t>
+        <w:t xml:space="preserve">either of the 2 face-up cards</w:t>
       </w:r>
       <w:r>
         <w:t xml:space="preserve"> of that type in the loot display (then turn the next card of that deck face up to refill the row), or</w:t>

</xml_diff>

<commit_message>
Last Deck Standing: persistent Shield, max 8 (SIM-015)
Co-Authored-By: Claude Opus 5.5 <noreply@anthropic.com>
</commit_message>
<xml_diff>
--- a/games/last-deck-standing/Last Deck Standing Rules v1.docx
+++ b/games/last-deck-standing/Last Deck Standing Rules v1.docx
@@ -944,7 +944,7 @@
                 <w:sz w:val="20"/>
                 <w:szCs w:val="20"/>
               </w:rPr>
-              <w:t xml:space="preserve">Tracks Base Move, Base Attack and Base Shield (each 0–4) and current Shield points</w:t>
+              <w:t xml:space="preserve">Tracks Base Move, Base Attack and Base Shield (each 0–4) and current Shield points (0–8)</w:t>
             </w:r>
           </w:p>
         </w:tc>
@@ -1601,7 +1601,14 @@
         </w:numPr>
       </w:pPr>
       <w:r>
-        <w:t xml:space="preserve">Set your Shield points equal to your Base Shield. Any points left over from last turn are lost.</w:t>
+        <w:rPr>
+          <w:b/>
+          <w:bCs/>
+        </w:rPr>
+        <w:t xml:space="preserve">Shield refill:</w:t>
+      </w:r>
+      <w:r>
+        <w:t xml:space="preserve"> if your Shield points are below your Base Shield, raise them to your Base Shield. Shield points never go down at upkeep; they stay until damage uses them.</w:t>
       </w:r>
     </w:p>
     <w:p>
@@ -2167,7 +2174,7 @@
                 <w:sz w:val="20"/>
                 <w:szCs w:val="20"/>
               </w:rPr>
-              <w:t xml:space="preserve"> add that many points to your Shield tracker (they can go above your Base Shield and protect you until your next upkeep); the card is discarded at the end of your turn with your other cards.</w:t>
+              <w:t xml:space="preserve"> add that many points to your Shield tracker (maximum 8). They stay until damage uses them; the card is discarded at the end of your turn with your other cards.</w:t>
             </w:r>
           </w:p>
         </w:tc>
@@ -3430,7 +3437,7 @@
         <w:t xml:space="preserve">Upkeep:</w:t>
       </w:r>
       <w:r>
-        <w:t xml:space="preserve"> reset Shield → draw up to 5 and at least 2, then discard down to 5 (not Dead cards) → 3+ Dead: announce "critical"</w:t>
+        <w:t xml:space="preserve"> refill Shield up to Base Shield → draw up to 5 and at least 2, then discard down to 5 (not Dead cards) → 3+ Dead: announce "critical"</w:t>
       </w:r>
     </w:p>
     <w:p>
@@ -3475,7 +3482,7 @@
         <w:t xml:space="preserve">Heal card:</w:t>
       </w:r>
       <w:r>
-        <w:t xml:space="preserve"> heal (Dead from hand → supply, card leaves the game) or shield (+Shield until your next upkeep)</w:t>
+        <w:t xml:space="preserve"> heal (Dead from hand → supply, card leaves the game) or shield (+Shield, max 8; stays until used)</w:t>
       </w:r>
     </w:p>
     <w:p>

</xml_diff>

<commit_message>
Last Deck Standing: Shield max 4 (SIM-015 addendum)
Co-Authored-By: Claude Opus 5.5 <noreply@anthropic.com>
</commit_message>
<xml_diff>
--- a/games/last-deck-standing/Last Deck Standing Rules v1.docx
+++ b/games/last-deck-standing/Last Deck Standing Rules v1.docx
@@ -944,7 +944,7 @@
                 <w:sz w:val="20"/>
                 <w:szCs w:val="20"/>
               </w:rPr>
-              <w:t xml:space="preserve">Tracks Base Move, Base Attack and Base Shield (each 0–4) and current Shield points (0–8)</w:t>
+              <w:t xml:space="preserve">Tracks Base Move, Base Attack and Base Shield (each 0–4) and current Shield points (0–4)</w:t>
             </w:r>
           </w:p>
         </w:tc>
@@ -2174,7 +2174,7 @@
                 <w:sz w:val="20"/>
                 <w:szCs w:val="20"/>
               </w:rPr>
-              <w:t xml:space="preserve"> add that many points to your Shield tracker (maximum 8). They stay until damage uses them; the card is discarded at the end of your turn with your other cards.</w:t>
+              <w:t xml:space="preserve"> add that many points to your Shield tracker (maximum 4). They stay until damage uses them; the card is discarded at the end of your turn with your other cards.</w:t>
             </w:r>
           </w:p>
         </w:tc>
@@ -3482,7 +3482,7 @@
         <w:t xml:space="preserve">Heal card:</w:t>
       </w:r>
       <w:r>
-        <w:t xml:space="preserve"> heal (Dead from hand → supply, card leaves the game) or shield (+Shield, max 8; stays until used)</w:t>
+        <w:t xml:space="preserve"> heal (Dead from hand → supply, card leaves the game) or shield (+Shield, max 4; stays until used)</w:t>
       </w:r>
     </w:p>
     <w:p>

</xml_diff>

<commit_message>
Last Deck Standing: 7/9/5 loot tiles (SIM-016), character names on starting decks
Co-Authored-By: Claude Opus 5.5 <noreply@anthropic.com>
</commit_message>
<xml_diff>
--- a/games/last-deck-standing/Last Deck Standing Rules v1.docx
+++ b/games/last-deck-standing/Last Deck Standing Rules v1.docx
@@ -114,9 +114,9 @@
         </w:tblBorders>
       </w:tblPr>
       <w:tblGrid>
-        <w:gridCol w:w="1647"/>
-        <w:gridCol w:w="3219"/>
-        <w:gridCol w:w="4494"/>
+        <w:gridCol w:w="1745"/>
+        <w:gridCol w:w="2855"/>
+        <w:gridCol w:w="4760"/>
       </w:tblGrid>
       <w:tr>
         <w:trPr>
@@ -124,7 +124,7 @@
         </w:trPr>
         <w:tc>
           <w:tcPr>
-            <w:tcW w:type="dxa" w:w="1647"/>
+            <w:tcW w:type="dxa" w:w="1745"/>
             <w:tcBorders>
               <w:top w:val="single" w:color="C9CCD6" w:sz="4"/>
               <w:left w:val="single" w:color="C9CCD6" w:sz="4"/>
@@ -153,7 +153,7 @@
         </w:tc>
         <w:tc>
           <w:tcPr>
-            <w:tcW w:type="dxa" w:w="3219"/>
+            <w:tcW w:type="dxa" w:w="2855"/>
             <w:tcBorders>
               <w:top w:val="single" w:color="C9CCD6" w:sz="4"/>
               <w:left w:val="single" w:color="C9CCD6" w:sz="4"/>
@@ -182,7 +182,7 @@
         </w:tc>
         <w:tc>
           <w:tcPr>
-            <w:tcW w:type="dxa" w:w="4494"/>
+            <w:tcW w:type="dxa" w:w="4760"/>
             <w:tcBorders>
               <w:top w:val="single" w:color="C9CCD6" w:sz="4"/>
               <w:left w:val="single" w:color="C9CCD6" w:sz="4"/>
@@ -216,7 +216,7 @@
         </w:trPr>
         <w:tc>
           <w:tcPr>
-            <w:tcW w:type="dxa" w:w="1647"/>
+            <w:tcW w:type="dxa" w:w="1745"/>
             <w:tcBorders>
               <w:top w:val="single" w:color="C9CCD6" w:sz="4"/>
               <w:left w:val="single" w:color="C9CCD6" w:sz="4"/>
@@ -242,7 +242,7 @@
         </w:tc>
         <w:tc>
           <w:tcPr>
-            <w:tcW w:type="dxa" w:w="3219"/>
+            <w:tcW w:type="dxa" w:w="2855"/>
             <w:tcBorders>
               <w:top w:val="single" w:color="C9CCD6" w:sz="4"/>
               <w:left w:val="single" w:color="C9CCD6" w:sz="4"/>
@@ -268,7 +268,7 @@
         </w:tc>
         <w:tc>
           <w:tcPr>
-            <w:tcW w:type="dxa" w:w="4494"/>
+            <w:tcW w:type="dxa" w:w="4760"/>
             <w:tcBorders>
               <w:top w:val="single" w:color="C9CCD6" w:sz="4"/>
               <w:left w:val="single" w:color="C9CCD6" w:sz="4"/>
@@ -299,7 +299,7 @@
         </w:trPr>
         <w:tc>
           <w:tcPr>
-            <w:tcW w:type="dxa" w:w="1647"/>
+            <w:tcW w:type="dxa" w:w="1745"/>
             <w:tcBorders>
               <w:top w:val="single" w:color="C9CCD6" w:sz="4"/>
               <w:left w:val="single" w:color="C9CCD6" w:sz="4"/>
@@ -325,7 +325,7 @@
         </w:tc>
         <w:tc>
           <w:tcPr>
-            <w:tcW w:type="dxa" w:w="3219"/>
+            <w:tcW w:type="dxa" w:w="2855"/>
             <w:tcBorders>
               <w:top w:val="single" w:color="C9CCD6" w:sz="4"/>
               <w:left w:val="single" w:color="C9CCD6" w:sz="4"/>
@@ -351,27 +351,27 @@
         </w:tc>
         <w:tc>
           <w:tcPr>
-            <w:tcW w:type="dxa" w:w="4494"/>
-            <w:tcBorders>
-              <w:top w:val="single" w:color="C9CCD6" w:sz="4"/>
-              <w:left w:val="single" w:color="C9CCD6" w:sz="4"/>
-              <w:bottom w:val="single" w:color="C9CCD6" w:sz="4"/>
-              <w:right w:val="single" w:color="C9CCD6" w:sz="4"/>
-            </w:tcBorders>
-            <w:tcMar>
-              <w:top w:type="dxa" w:w="60"/>
-              <w:left w:type="dxa" w:w="100"/>
-              <w:bottom w:type="dxa" w:w="60"/>
-              <w:right w:type="dxa" w:w="100"/>
-            </w:tcMar>
-          </w:tcPr>
-          <w:p>
-            <w:r>
-              <w:rPr>
-                <w:sz w:val="20"/>
-                <w:szCs w:val="20"/>
-              </w:rPr>
-              <w:t xml:space="preserve">4 Strike (Attack 1), 3 Dash (Move 1), 3 Patch Up (Heal 1)</w:t>
+            <w:tcW w:type="dxa" w:w="4760"/>
+            <w:tcBorders>
+              <w:top w:val="single" w:color="C9CCD6" w:sz="4"/>
+              <w:left w:val="single" w:color="C9CCD6" w:sz="4"/>
+              <w:bottom w:val="single" w:color="C9CCD6" w:sz="4"/>
+              <w:right w:val="single" w:color="C9CCD6" w:sz="4"/>
+            </w:tcBorders>
+            <w:tcMar>
+              <w:top w:type="dxa" w:w="60"/>
+              <w:left w:type="dxa" w:w="100"/>
+              <w:bottom w:type="dxa" w:w="60"/>
+              <w:right w:type="dxa" w:w="100"/>
+            </w:tcMar>
+          </w:tcPr>
+          <w:p>
+            <w:r>
+              <w:rPr>
+                <w:sz w:val="20"/>
+                <w:szCs w:val="20"/>
+              </w:rPr>
+              <w:t xml:space="preserve">4 Strike (Attack 1), 3 Dash (Move 1), 3 Patch Up (Heal 1). Each player's deck belongs to a character: Blaze (red), Ember (orange), Tide (teal), Nova (pink), Shade (black)</w:t>
             </w:r>
           </w:p>
         </w:tc>
@@ -382,7 +382,7 @@
         </w:trPr>
         <w:tc>
           <w:tcPr>
-            <w:tcW w:type="dxa" w:w="1647"/>
+            <w:tcW w:type="dxa" w:w="1745"/>
             <w:tcBorders>
               <w:top w:val="single" w:color="C9CCD6" w:sz="4"/>
               <w:left w:val="single" w:color="C9CCD6" w:sz="4"/>
@@ -408,7 +408,7 @@
         </w:tc>
         <w:tc>
           <w:tcPr>
-            <w:tcW w:type="dxa" w:w="3219"/>
+            <w:tcW w:type="dxa" w:w="2855"/>
             <w:tcBorders>
               <w:top w:val="single" w:color="C9CCD6" w:sz="4"/>
               <w:left w:val="single" w:color="C9CCD6" w:sz="4"/>
@@ -434,7 +434,7 @@
         </w:tc>
         <w:tc>
           <w:tcPr>
-            <w:tcW w:type="dxa" w:w="4494"/>
+            <w:tcW w:type="dxa" w:w="4760"/>
             <w:tcBorders>
               <w:top w:val="single" w:color="C9CCD6" w:sz="4"/>
               <w:left w:val="single" w:color="C9CCD6" w:sz="4"/>
@@ -465,7 +465,7 @@
         </w:trPr>
         <w:tc>
           <w:tcPr>
-            <w:tcW w:type="dxa" w:w="1647"/>
+            <w:tcW w:type="dxa" w:w="1745"/>
             <w:tcBorders>
               <w:top w:val="single" w:color="C9CCD6" w:sz="4"/>
               <w:left w:val="single" w:color="C9CCD6" w:sz="4"/>
@@ -491,7 +491,7 @@
         </w:tc>
         <w:tc>
           <w:tcPr>
-            <w:tcW w:type="dxa" w:w="3219"/>
+            <w:tcW w:type="dxa" w:w="2855"/>
             <w:tcBorders>
               <w:top w:val="single" w:color="C9CCD6" w:sz="4"/>
               <w:left w:val="single" w:color="C9CCD6" w:sz="4"/>
@@ -517,7 +517,7 @@
         </w:tc>
         <w:tc>
           <w:tcPr>
-            <w:tcW w:type="dxa" w:w="4494"/>
+            <w:tcW w:type="dxa" w:w="4760"/>
             <w:tcBorders>
               <w:top w:val="single" w:color="C9CCD6" w:sz="4"/>
               <w:left w:val="single" w:color="C9CCD6" w:sz="4"/>
@@ -548,7 +548,7 @@
         </w:trPr>
         <w:tc>
           <w:tcPr>
-            <w:tcW w:type="dxa" w:w="1647"/>
+            <w:tcW w:type="dxa" w:w="1745"/>
             <w:tcBorders>
               <w:top w:val="single" w:color="C9CCD6" w:sz="4"/>
               <w:left w:val="single" w:color="C9CCD6" w:sz="4"/>
@@ -574,7 +574,7 @@
         </w:tc>
         <w:tc>
           <w:tcPr>
-            <w:tcW w:type="dxa" w:w="3219"/>
+            <w:tcW w:type="dxa" w:w="2855"/>
             <w:tcBorders>
               <w:top w:val="single" w:color="C9CCD6" w:sz="4"/>
               <w:left w:val="single" w:color="C9CCD6" w:sz="4"/>
@@ -600,7 +600,7 @@
         </w:tc>
         <w:tc>
           <w:tcPr>
-            <w:tcW w:type="dxa" w:w="4494"/>
+            <w:tcW w:type="dxa" w:w="4760"/>
             <w:tcBorders>
               <w:top w:val="single" w:color="C9CCD6" w:sz="4"/>
               <w:left w:val="single" w:color="C9CCD6" w:sz="4"/>
@@ -631,7 +631,7 @@
         </w:trPr>
         <w:tc>
           <w:tcPr>
-            <w:tcW w:type="dxa" w:w="1647"/>
+            <w:tcW w:type="dxa" w:w="1745"/>
             <w:tcBorders>
               <w:top w:val="single" w:color="C9CCD6" w:sz="4"/>
               <w:left w:val="single" w:color="C9CCD6" w:sz="4"/>
@@ -657,7 +657,7 @@
         </w:tc>
         <w:tc>
           <w:tcPr>
-            <w:tcW w:type="dxa" w:w="3219"/>
+            <w:tcW w:type="dxa" w:w="2855"/>
             <w:tcBorders>
               <w:top w:val="single" w:color="C9CCD6" w:sz="4"/>
               <w:left w:val="single" w:color="C9CCD6" w:sz="4"/>
@@ -683,7 +683,7 @@
         </w:tc>
         <w:tc>
           <w:tcPr>
-            <w:tcW w:type="dxa" w:w="4494"/>
+            <w:tcW w:type="dxa" w:w="4760"/>
             <w:tcBorders>
               <w:top w:val="single" w:color="C9CCD6" w:sz="4"/>
               <w:left w:val="single" w:color="C9CCD6" w:sz="4"/>
@@ -714,7 +714,7 @@
         </w:trPr>
         <w:tc>
           <w:tcPr>
-            <w:tcW w:type="dxa" w:w="1647"/>
+            <w:tcW w:type="dxa" w:w="1745"/>
             <w:tcBorders>
               <w:top w:val="single" w:color="C9CCD6" w:sz="4"/>
               <w:left w:val="single" w:color="C9CCD6" w:sz="4"/>
@@ -740,33 +740,33 @@
         </w:tc>
         <w:tc>
           <w:tcPr>
-            <w:tcW w:type="dxa" w:w="3219"/>
-            <w:tcBorders>
-              <w:top w:val="single" w:color="C9CCD6" w:sz="4"/>
-              <w:left w:val="single" w:color="C9CCD6" w:sz="4"/>
-              <w:bottom w:val="single" w:color="C9CCD6" w:sz="4"/>
-              <w:right w:val="single" w:color="C9CCD6" w:sz="4"/>
-            </w:tcBorders>
-            <w:tcMar>
-              <w:top w:type="dxa" w:w="60"/>
-              <w:left w:type="dxa" w:w="100"/>
-              <w:bottom w:type="dxa" w:w="60"/>
-              <w:right w:type="dxa" w:w="100"/>
-            </w:tcMar>
-          </w:tcPr>
-          <w:p>
-            <w:r>
-              <w:rPr>
-                <w:sz w:val="20"/>
-                <w:szCs w:val="20"/>
-              </w:rPr>
-              <w:t xml:space="preserve">7 per color per player (Move, Attack, Heal)</w:t>
-            </w:r>
-          </w:p>
-        </w:tc>
-        <w:tc>
-          <w:tcPr>
-            <w:tcW w:type="dxa" w:w="4494"/>
+            <w:tcW w:type="dxa" w:w="2855"/>
+            <w:tcBorders>
+              <w:top w:val="single" w:color="C9CCD6" w:sz="4"/>
+              <w:left w:val="single" w:color="C9CCD6" w:sz="4"/>
+              <w:bottom w:val="single" w:color="C9CCD6" w:sz="4"/>
+              <w:right w:val="single" w:color="C9CCD6" w:sz="4"/>
+            </w:tcBorders>
+            <w:tcMar>
+              <w:top w:type="dxa" w:w="60"/>
+              <w:left w:type="dxa" w:w="100"/>
+              <w:bottom w:type="dxa" w:w="60"/>
+              <w:right w:type="dxa" w:w="100"/>
+            </w:tcMar>
+          </w:tcPr>
+          <w:p>
+            <w:r>
+              <w:rPr>
+                <w:sz w:val="20"/>
+                <w:szCs w:val="20"/>
+              </w:rPr>
+              <w:t xml:space="preserve">Per player: 7 Move, 9 Attack, 5 Heal</w:t>
+            </w:r>
+          </w:p>
+        </w:tc>
+        <w:tc>
+          <w:tcPr>
+            <w:tcW w:type="dxa" w:w="4760"/>
             <w:tcBorders>
               <w:top w:val="single" w:color="C9CCD6" w:sz="4"/>
               <w:left w:val="single" w:color="C9CCD6" w:sz="4"/>
@@ -797,7 +797,7 @@
         </w:trPr>
         <w:tc>
           <w:tcPr>
-            <w:tcW w:type="dxa" w:w="1647"/>
+            <w:tcW w:type="dxa" w:w="1745"/>
             <w:tcBorders>
               <w:top w:val="single" w:color="C9CCD6" w:sz="4"/>
               <w:left w:val="single" w:color="C9CCD6" w:sz="4"/>
@@ -823,7 +823,7 @@
         </w:tc>
         <w:tc>
           <w:tcPr>
-            <w:tcW w:type="dxa" w:w="3219"/>
+            <w:tcW w:type="dxa" w:w="2855"/>
             <w:tcBorders>
               <w:top w:val="single" w:color="C9CCD6" w:sz="4"/>
               <w:left w:val="single" w:color="C9CCD6" w:sz="4"/>
@@ -849,7 +849,7 @@
         </w:tc>
         <w:tc>
           <w:tcPr>
-            <w:tcW w:type="dxa" w:w="4494"/>
+            <w:tcW w:type="dxa" w:w="4760"/>
             <w:tcBorders>
               <w:top w:val="single" w:color="C9CCD6" w:sz="4"/>
               <w:left w:val="single" w:color="C9CCD6" w:sz="4"/>
@@ -872,7 +872,7 @@
         </w:trPr>
         <w:tc>
           <w:tcPr>
-            <w:tcW w:type="dxa" w:w="1647"/>
+            <w:tcW w:type="dxa" w:w="1745"/>
             <w:tcBorders>
               <w:top w:val="single" w:color="C9CCD6" w:sz="4"/>
               <w:left w:val="single" w:color="C9CCD6" w:sz="4"/>
@@ -898,7 +898,7 @@
         </w:tc>
         <w:tc>
           <w:tcPr>
-            <w:tcW w:type="dxa" w:w="3219"/>
+            <w:tcW w:type="dxa" w:w="2855"/>
             <w:tcBorders>
               <w:top w:val="single" w:color="C9CCD6" w:sz="4"/>
               <w:left w:val="single" w:color="C9CCD6" w:sz="4"/>
@@ -924,7 +924,7 @@
         </w:tc>
         <w:tc>
           <w:tcPr>
-            <w:tcW w:type="dxa" w:w="4494"/>
+            <w:tcW w:type="dxa" w:w="4760"/>
             <w:tcBorders>
               <w:top w:val="single" w:color="C9CCD6" w:sz="4"/>
               <w:left w:val="single" w:color="C9CCD6" w:sz="4"/>
@@ -955,7 +955,7 @@
         </w:trPr>
         <w:tc>
           <w:tcPr>
-            <w:tcW w:type="dxa" w:w="1647"/>
+            <w:tcW w:type="dxa" w:w="1745"/>
             <w:tcBorders>
               <w:top w:val="single" w:color="C9CCD6" w:sz="4"/>
               <w:left w:val="single" w:color="C9CCD6" w:sz="4"/>
@@ -981,7 +981,7 @@
         </w:tc>
         <w:tc>
           <w:tcPr>
-            <w:tcW w:type="dxa" w:w="3219"/>
+            <w:tcW w:type="dxa" w:w="2855"/>
             <w:tcBorders>
               <w:top w:val="single" w:color="C9CCD6" w:sz="4"/>
               <w:left w:val="single" w:color="C9CCD6" w:sz="4"/>
@@ -1007,7 +1007,7 @@
         </w:tc>
         <w:tc>
           <w:tcPr>
-            <w:tcW w:type="dxa" w:w="4494"/>
+            <w:tcW w:type="dxa" w:w="4760"/>
             <w:tcBorders>
               <w:top w:val="single" w:color="C9CCD6" w:sz="4"/>
               <w:left w:val="single" w:color="C9CCD6" w:sz="4"/>
@@ -1038,7 +1038,7 @@
         </w:trPr>
         <w:tc>
           <w:tcPr>
-            <w:tcW w:type="dxa" w:w="1647"/>
+            <w:tcW w:type="dxa" w:w="1745"/>
             <w:tcBorders>
               <w:top w:val="single" w:color="C9CCD6" w:sz="4"/>
               <w:left w:val="single" w:color="C9CCD6" w:sz="4"/>
@@ -1064,7 +1064,7 @@
         </w:tc>
         <w:tc>
           <w:tcPr>
-            <w:tcW w:type="dxa" w:w="3219"/>
+            <w:tcW w:type="dxa" w:w="2855"/>
             <w:tcBorders>
               <w:top w:val="single" w:color="C9CCD6" w:sz="4"/>
               <w:left w:val="single" w:color="C9CCD6" w:sz="4"/>
@@ -1090,7 +1090,7 @@
         </w:tc>
         <w:tc>
           <w:tcPr>
-            <w:tcW w:type="dxa" w:w="4494"/>
+            <w:tcW w:type="dxa" w:w="4760"/>
             <w:tcBorders>
               <w:top w:val="single" w:color="C9CCD6" w:sz="4"/>
               <w:left w:val="single" w:color="C9CCD6" w:sz="4"/>
@@ -1121,7 +1121,7 @@
         </w:trPr>
         <w:tc>
           <w:tcPr>
-            <w:tcW w:type="dxa" w:w="1647"/>
+            <w:tcW w:type="dxa" w:w="1745"/>
             <w:tcBorders>
               <w:top w:val="single" w:color="C9CCD6" w:sz="4"/>
               <w:left w:val="single" w:color="C9CCD6" w:sz="4"/>
@@ -1147,7 +1147,7 @@
         </w:tc>
         <w:tc>
           <w:tcPr>
-            <w:tcW w:type="dxa" w:w="3219"/>
+            <w:tcW w:type="dxa" w:w="2855"/>
             <w:tcBorders>
               <w:top w:val="single" w:color="C9CCD6" w:sz="4"/>
               <w:left w:val="single" w:color="C9CCD6" w:sz="4"/>
@@ -1173,7 +1173,7 @@
         </w:tc>
         <w:tc>
           <w:tcPr>
-            <w:tcW w:type="dxa" w:w="4494"/>
+            <w:tcW w:type="dxa" w:w="4760"/>
             <w:tcBorders>
               <w:top w:val="single" w:color="C9CCD6" w:sz="4"/>
               <w:left w:val="single" w:color="C9CCD6" w:sz="4"/>
@@ -1204,7 +1204,7 @@
         </w:trPr>
         <w:tc>
           <w:tcPr>
-            <w:tcW w:type="dxa" w:w="1647"/>
+            <w:tcW w:type="dxa" w:w="1745"/>
             <w:tcBorders>
               <w:top w:val="single" w:color="C9CCD6" w:sz="4"/>
               <w:left w:val="single" w:color="C9CCD6" w:sz="4"/>
@@ -1230,7 +1230,7 @@
         </w:tc>
         <w:tc>
           <w:tcPr>
-            <w:tcW w:type="dxa" w:w="3219"/>
+            <w:tcW w:type="dxa" w:w="2855"/>
             <w:tcBorders>
               <w:top w:val="single" w:color="C9CCD6" w:sz="4"/>
               <w:left w:val="single" w:color="C9CCD6" w:sz="4"/>
@@ -1256,7 +1256,7 @@
         </w:tc>
         <w:tc>
           <w:tcPr>
-            <w:tcW w:type="dxa" w:w="4494"/>
+            <w:tcW w:type="dxa" w:w="4760"/>
             <w:tcBorders>
               <w:top w:val="single" w:color="C9CCD6" w:sz="4"/>
               <w:left w:val="single" w:color="C9CCD6" w:sz="4"/>
@@ -1287,7 +1287,7 @@
         </w:trPr>
         <w:tc>
           <w:tcPr>
-            <w:tcW w:type="dxa" w:w="1647"/>
+            <w:tcW w:type="dxa" w:w="1745"/>
             <w:tcBorders>
               <w:top w:val="single" w:color="C9CCD6" w:sz="4"/>
               <w:left w:val="single" w:color="C9CCD6" w:sz="4"/>
@@ -1313,7 +1313,7 @@
         </w:tc>
         <w:tc>
           <w:tcPr>
-            <w:tcW w:type="dxa" w:w="3219"/>
+            <w:tcW w:type="dxa" w:w="2855"/>
             <w:tcBorders>
               <w:top w:val="single" w:color="C9CCD6" w:sz="4"/>
               <w:left w:val="single" w:color="C9CCD6" w:sz="4"/>
@@ -1339,7 +1339,7 @@
         </w:tc>
         <w:tc>
           <w:tcPr>
-            <w:tcW w:type="dxa" w:w="4494"/>
+            <w:tcW w:type="dxa" w:w="4760"/>
             <w:tcBorders>
               <w:top w:val="single" w:color="C9CCD6" w:sz="4"/>
               <w:left w:val="single" w:color="C9CCD6" w:sz="4"/>
@@ -3101,7 +3101,7 @@
         <w:spacing w:after="120"/>
       </w:pPr>
       <w:r>
-        <w:t xml:space="preserve">Each player's set has 15 tiles and 21 loot icons, 7 of each type:</w:t>
+        <w:t xml:space="preserve">Each player's set has 15 tiles and 21 loot icons: 7 Move, 9 Attack, 5 Heal.</w:t>
       </w:r>
     </w:p>
     <w:tbl>
@@ -3292,7 +3292,7 @@
                 <w:sz w:val="20"/>
                 <w:szCs w:val="20"/>
               </w:rPr>
-              <w:t xml:space="preserve">1 each: Move · Attack · Heal · Heal</w:t>
+              <w:t xml:space="preserve">1 each: Move · Attack · Attack · Heal</w:t>
             </w:r>
           </w:p>
         </w:tc>
@@ -3406,7 +3406,7 @@
                 <w:sz w:val="20"/>
                 <w:szCs w:val="20"/>
               </w:rPr>
-              <w:t xml:space="preserve">3 each: Move+Attack+Heal · Attack+Attack+Heal · Move+Attack+Heal</w:t>
+              <w:t xml:space="preserve">3 each: Move+Attack+Attack · Attack+Attack+Heal · Move+Attack+Heal</w:t>
             </w:r>
           </w:p>
         </w:tc>

</xml_diff>

<commit_message>
Last Deck Standing: 6/11/4 loot tiles with a 24-card Attack deck (SIM-016)
Co-Authored-By: Claude Opus 5.5 <noreply@anthropic.com>
</commit_message>
<xml_diff>
--- a/games/last-deck-standing/Last Deck Standing Rules v1.docx
+++ b/games/last-deck-standing/Last Deck Standing Rules v1.docx
@@ -114,9 +114,9 @@
         </w:tblBorders>
       </w:tblPr>
       <w:tblGrid>
-        <w:gridCol w:w="1745"/>
-        <w:gridCol w:w="2855"/>
-        <w:gridCol w:w="4760"/>
+        <w:gridCol w:w="1730"/>
+        <w:gridCol w:w="2910"/>
+        <w:gridCol w:w="4720"/>
       </w:tblGrid>
       <w:tr>
         <w:trPr>
@@ -124,7 +124,7 @@
         </w:trPr>
         <w:tc>
           <w:tcPr>
-            <w:tcW w:type="dxa" w:w="1745"/>
+            <w:tcW w:type="dxa" w:w="1730"/>
             <w:tcBorders>
               <w:top w:val="single" w:color="C9CCD6" w:sz="4"/>
               <w:left w:val="single" w:color="C9CCD6" w:sz="4"/>
@@ -153,7 +153,7 @@
         </w:tc>
         <w:tc>
           <w:tcPr>
-            <w:tcW w:type="dxa" w:w="2855"/>
+            <w:tcW w:type="dxa" w:w="2910"/>
             <w:tcBorders>
               <w:top w:val="single" w:color="C9CCD6" w:sz="4"/>
               <w:left w:val="single" w:color="C9CCD6" w:sz="4"/>
@@ -182,7 +182,7 @@
         </w:tc>
         <w:tc>
           <w:tcPr>
-            <w:tcW w:type="dxa" w:w="4760"/>
+            <w:tcW w:type="dxa" w:w="4720"/>
             <w:tcBorders>
               <w:top w:val="single" w:color="C9CCD6" w:sz="4"/>
               <w:left w:val="single" w:color="C9CCD6" w:sz="4"/>
@@ -216,7 +216,7 @@
         </w:trPr>
         <w:tc>
           <w:tcPr>
-            <w:tcW w:type="dxa" w:w="1745"/>
+            <w:tcW w:type="dxa" w:w="1730"/>
             <w:tcBorders>
               <w:top w:val="single" w:color="C9CCD6" w:sz="4"/>
               <w:left w:val="single" w:color="C9CCD6" w:sz="4"/>
@@ -242,7 +242,7 @@
         </w:tc>
         <w:tc>
           <w:tcPr>
-            <w:tcW w:type="dxa" w:w="2855"/>
+            <w:tcW w:type="dxa" w:w="2910"/>
             <w:tcBorders>
               <w:top w:val="single" w:color="C9CCD6" w:sz="4"/>
               <w:left w:val="single" w:color="C9CCD6" w:sz="4"/>
@@ -268,7 +268,7 @@
         </w:tc>
         <w:tc>
           <w:tcPr>
-            <w:tcW w:type="dxa" w:w="4760"/>
+            <w:tcW w:type="dxa" w:w="4720"/>
             <w:tcBorders>
               <w:top w:val="single" w:color="C9CCD6" w:sz="4"/>
               <w:left w:val="single" w:color="C9CCD6" w:sz="4"/>
@@ -299,7 +299,7 @@
         </w:trPr>
         <w:tc>
           <w:tcPr>
-            <w:tcW w:type="dxa" w:w="1745"/>
+            <w:tcW w:type="dxa" w:w="1730"/>
             <w:tcBorders>
               <w:top w:val="single" w:color="C9CCD6" w:sz="4"/>
               <w:left w:val="single" w:color="C9CCD6" w:sz="4"/>
@@ -325,7 +325,7 @@
         </w:tc>
         <w:tc>
           <w:tcPr>
-            <w:tcW w:type="dxa" w:w="2855"/>
+            <w:tcW w:type="dxa" w:w="2910"/>
             <w:tcBorders>
               <w:top w:val="single" w:color="C9CCD6" w:sz="4"/>
               <w:left w:val="single" w:color="C9CCD6" w:sz="4"/>
@@ -351,7 +351,7 @@
         </w:tc>
         <w:tc>
           <w:tcPr>
-            <w:tcW w:type="dxa" w:w="4760"/>
+            <w:tcW w:type="dxa" w:w="4720"/>
             <w:tcBorders>
               <w:top w:val="single" w:color="C9CCD6" w:sz="4"/>
               <w:left w:val="single" w:color="C9CCD6" w:sz="4"/>
@@ -382,7 +382,7 @@
         </w:trPr>
         <w:tc>
           <w:tcPr>
-            <w:tcW w:type="dxa" w:w="1745"/>
+            <w:tcW w:type="dxa" w:w="1730"/>
             <w:tcBorders>
               <w:top w:val="single" w:color="C9CCD6" w:sz="4"/>
               <w:left w:val="single" w:color="C9CCD6" w:sz="4"/>
@@ -408,53 +408,53 @@
         </w:tc>
         <w:tc>
           <w:tcPr>
-            <w:tcW w:type="dxa" w:w="2855"/>
-            <w:tcBorders>
-              <w:top w:val="single" w:color="C9CCD6" w:sz="4"/>
-              <w:left w:val="single" w:color="C9CCD6" w:sz="4"/>
-              <w:bottom w:val="single" w:color="C9CCD6" w:sz="4"/>
-              <w:right w:val="single" w:color="C9CCD6" w:sz="4"/>
-            </w:tcBorders>
-            <w:tcMar>
-              <w:top w:type="dxa" w:w="60"/>
-              <w:left w:type="dxa" w:w="100"/>
-              <w:bottom w:type="dxa" w:w="60"/>
-              <w:right w:type="dxa" w:w="100"/>
-            </w:tcMar>
-          </w:tcPr>
-          <w:p>
-            <w:r>
-              <w:rPr>
-                <w:sz w:val="20"/>
-                <w:szCs w:val="20"/>
-              </w:rPr>
-              <w:t xml:space="preserve">18</w:t>
-            </w:r>
-          </w:p>
-        </w:tc>
-        <w:tc>
-          <w:tcPr>
-            <w:tcW w:type="dxa" w:w="4760"/>
-            <w:tcBorders>
-              <w:top w:val="single" w:color="C9CCD6" w:sz="4"/>
-              <w:left w:val="single" w:color="C9CCD6" w:sz="4"/>
-              <w:bottom w:val="single" w:color="C9CCD6" w:sz="4"/>
-              <w:right w:val="single" w:color="C9CCD6" w:sz="4"/>
-            </w:tcBorders>
-            <w:tcMar>
-              <w:top w:type="dxa" w:w="60"/>
-              <w:left w:type="dxa" w:w="100"/>
-              <w:bottom w:type="dxa" w:w="60"/>
-              <w:right w:type="dxa" w:w="100"/>
-            </w:tcMar>
-          </w:tcPr>
-          <w:p>
-            <w:r>
-              <w:rPr>
-                <w:sz w:val="20"/>
-                <w:szCs w:val="20"/>
-              </w:rPr>
-              <w:t xml:space="preserve">9× value 1, 6× value 2, 3× value 3</w:t>
+            <w:tcW w:type="dxa" w:w="2910"/>
+            <w:tcBorders>
+              <w:top w:val="single" w:color="C9CCD6" w:sz="4"/>
+              <w:left w:val="single" w:color="C9CCD6" w:sz="4"/>
+              <w:bottom w:val="single" w:color="C9CCD6" w:sz="4"/>
+              <w:right w:val="single" w:color="C9CCD6" w:sz="4"/>
+            </w:tcBorders>
+            <w:tcMar>
+              <w:top w:type="dxa" w:w="60"/>
+              <w:left w:type="dxa" w:w="100"/>
+              <w:bottom w:type="dxa" w:w="60"/>
+              <w:right w:type="dxa" w:w="100"/>
+            </w:tcMar>
+          </w:tcPr>
+          <w:p>
+            <w:r>
+              <w:rPr>
+                <w:sz w:val="20"/>
+                <w:szCs w:val="20"/>
+              </w:rPr>
+              <w:t xml:space="preserve">24</w:t>
+            </w:r>
+          </w:p>
+        </w:tc>
+        <w:tc>
+          <w:tcPr>
+            <w:tcW w:type="dxa" w:w="4720"/>
+            <w:tcBorders>
+              <w:top w:val="single" w:color="C9CCD6" w:sz="4"/>
+              <w:left w:val="single" w:color="C9CCD6" w:sz="4"/>
+              <w:bottom w:val="single" w:color="C9CCD6" w:sz="4"/>
+              <w:right w:val="single" w:color="C9CCD6" w:sz="4"/>
+            </w:tcBorders>
+            <w:tcMar>
+              <w:top w:type="dxa" w:w="60"/>
+              <w:left w:type="dxa" w:w="100"/>
+              <w:bottom w:type="dxa" w:w="60"/>
+              <w:right w:type="dxa" w:w="100"/>
+            </w:tcMar>
+          </w:tcPr>
+          <w:p>
+            <w:r>
+              <w:rPr>
+                <w:sz w:val="20"/>
+                <w:szCs w:val="20"/>
+              </w:rPr>
+              <w:t xml:space="preserve">12× value 1, 8× value 2, 4× value 3</w:t>
             </w:r>
           </w:p>
         </w:tc>
@@ -465,7 +465,7 @@
         </w:trPr>
         <w:tc>
           <w:tcPr>
-            <w:tcW w:type="dxa" w:w="1745"/>
+            <w:tcW w:type="dxa" w:w="1730"/>
             <w:tcBorders>
               <w:top w:val="single" w:color="C9CCD6" w:sz="4"/>
               <w:left w:val="single" w:color="C9CCD6" w:sz="4"/>
@@ -491,7 +491,7 @@
         </w:tc>
         <w:tc>
           <w:tcPr>
-            <w:tcW w:type="dxa" w:w="2855"/>
+            <w:tcW w:type="dxa" w:w="2910"/>
             <w:tcBorders>
               <w:top w:val="single" w:color="C9CCD6" w:sz="4"/>
               <w:left w:val="single" w:color="C9CCD6" w:sz="4"/>
@@ -517,7 +517,7 @@
         </w:tc>
         <w:tc>
           <w:tcPr>
-            <w:tcW w:type="dxa" w:w="4760"/>
+            <w:tcW w:type="dxa" w:w="4720"/>
             <w:tcBorders>
               <w:top w:val="single" w:color="C9CCD6" w:sz="4"/>
               <w:left w:val="single" w:color="C9CCD6" w:sz="4"/>
@@ -548,7 +548,7 @@
         </w:trPr>
         <w:tc>
           <w:tcPr>
-            <w:tcW w:type="dxa" w:w="1745"/>
+            <w:tcW w:type="dxa" w:w="1730"/>
             <w:tcBorders>
               <w:top w:val="single" w:color="C9CCD6" w:sz="4"/>
               <w:left w:val="single" w:color="C9CCD6" w:sz="4"/>
@@ -574,7 +574,7 @@
         </w:tc>
         <w:tc>
           <w:tcPr>
-            <w:tcW w:type="dxa" w:w="2855"/>
+            <w:tcW w:type="dxa" w:w="2910"/>
             <w:tcBorders>
               <w:top w:val="single" w:color="C9CCD6" w:sz="4"/>
               <w:left w:val="single" w:color="C9CCD6" w:sz="4"/>
@@ -600,7 +600,7 @@
         </w:tc>
         <w:tc>
           <w:tcPr>
-            <w:tcW w:type="dxa" w:w="4760"/>
+            <w:tcW w:type="dxa" w:w="4720"/>
             <w:tcBorders>
               <w:top w:val="single" w:color="C9CCD6" w:sz="4"/>
               <w:left w:val="single" w:color="C9CCD6" w:sz="4"/>
@@ -631,7 +631,7 @@
         </w:trPr>
         <w:tc>
           <w:tcPr>
-            <w:tcW w:type="dxa" w:w="1745"/>
+            <w:tcW w:type="dxa" w:w="1730"/>
             <w:tcBorders>
               <w:top w:val="single" w:color="C9CCD6" w:sz="4"/>
               <w:left w:val="single" w:color="C9CCD6" w:sz="4"/>
@@ -657,7 +657,7 @@
         </w:tc>
         <w:tc>
           <w:tcPr>
-            <w:tcW w:type="dxa" w:w="2855"/>
+            <w:tcW w:type="dxa" w:w="2910"/>
             <w:tcBorders>
               <w:top w:val="single" w:color="C9CCD6" w:sz="4"/>
               <w:left w:val="single" w:color="C9CCD6" w:sz="4"/>
@@ -683,7 +683,7 @@
         </w:tc>
         <w:tc>
           <w:tcPr>
-            <w:tcW w:type="dxa" w:w="4760"/>
+            <w:tcW w:type="dxa" w:w="4720"/>
             <w:tcBorders>
               <w:top w:val="single" w:color="C9CCD6" w:sz="4"/>
               <w:left w:val="single" w:color="C9CCD6" w:sz="4"/>
@@ -714,7 +714,7 @@
         </w:trPr>
         <w:tc>
           <w:tcPr>
-            <w:tcW w:type="dxa" w:w="1745"/>
+            <w:tcW w:type="dxa" w:w="1730"/>
             <w:tcBorders>
               <w:top w:val="single" w:color="C9CCD6" w:sz="4"/>
               <w:left w:val="single" w:color="C9CCD6" w:sz="4"/>
@@ -740,33 +740,33 @@
         </w:tc>
         <w:tc>
           <w:tcPr>
-            <w:tcW w:type="dxa" w:w="2855"/>
-            <w:tcBorders>
-              <w:top w:val="single" w:color="C9CCD6" w:sz="4"/>
-              <w:left w:val="single" w:color="C9CCD6" w:sz="4"/>
-              <w:bottom w:val="single" w:color="C9CCD6" w:sz="4"/>
-              <w:right w:val="single" w:color="C9CCD6" w:sz="4"/>
-            </w:tcBorders>
-            <w:tcMar>
-              <w:top w:type="dxa" w:w="60"/>
-              <w:left w:type="dxa" w:w="100"/>
-              <w:bottom w:type="dxa" w:w="60"/>
-              <w:right w:type="dxa" w:w="100"/>
-            </w:tcMar>
-          </w:tcPr>
-          <w:p>
-            <w:r>
-              <w:rPr>
-                <w:sz w:val="20"/>
-                <w:szCs w:val="20"/>
-              </w:rPr>
-              <w:t xml:space="preserve">Per player: 7 Move, 9 Attack, 5 Heal</w:t>
-            </w:r>
-          </w:p>
-        </w:tc>
-        <w:tc>
-          <w:tcPr>
-            <w:tcW w:type="dxa" w:w="4760"/>
+            <w:tcW w:type="dxa" w:w="2910"/>
+            <w:tcBorders>
+              <w:top w:val="single" w:color="C9CCD6" w:sz="4"/>
+              <w:left w:val="single" w:color="C9CCD6" w:sz="4"/>
+              <w:bottom w:val="single" w:color="C9CCD6" w:sz="4"/>
+              <w:right w:val="single" w:color="C9CCD6" w:sz="4"/>
+            </w:tcBorders>
+            <w:tcMar>
+              <w:top w:type="dxa" w:w="60"/>
+              <w:left w:type="dxa" w:w="100"/>
+              <w:bottom w:type="dxa" w:w="60"/>
+              <w:right w:type="dxa" w:w="100"/>
+            </w:tcMar>
+          </w:tcPr>
+          <w:p>
+            <w:r>
+              <w:rPr>
+                <w:sz w:val="20"/>
+                <w:szCs w:val="20"/>
+              </w:rPr>
+              <w:t xml:space="preserve">Per player: 6 Move, 11 Attack, 4 Heal</w:t>
+            </w:r>
+          </w:p>
+        </w:tc>
+        <w:tc>
+          <w:tcPr>
+            <w:tcW w:type="dxa" w:w="4720"/>
             <w:tcBorders>
               <w:top w:val="single" w:color="C9CCD6" w:sz="4"/>
               <w:left w:val="single" w:color="C9CCD6" w:sz="4"/>
@@ -797,7 +797,7 @@
         </w:trPr>
         <w:tc>
           <w:tcPr>
-            <w:tcW w:type="dxa" w:w="1745"/>
+            <w:tcW w:type="dxa" w:w="1730"/>
             <w:tcBorders>
               <w:top w:val="single" w:color="C9CCD6" w:sz="4"/>
               <w:left w:val="single" w:color="C9CCD6" w:sz="4"/>
@@ -823,7 +823,7 @@
         </w:tc>
         <w:tc>
           <w:tcPr>
-            <w:tcW w:type="dxa" w:w="2855"/>
+            <w:tcW w:type="dxa" w:w="2910"/>
             <w:tcBorders>
               <w:top w:val="single" w:color="C9CCD6" w:sz="4"/>
               <w:left w:val="single" w:color="C9CCD6" w:sz="4"/>
@@ -849,7 +849,7 @@
         </w:tc>
         <w:tc>
           <w:tcPr>
-            <w:tcW w:type="dxa" w:w="4760"/>
+            <w:tcW w:type="dxa" w:w="4720"/>
             <w:tcBorders>
               <w:top w:val="single" w:color="C9CCD6" w:sz="4"/>
               <w:left w:val="single" w:color="C9CCD6" w:sz="4"/>
@@ -872,7 +872,7 @@
         </w:trPr>
         <w:tc>
           <w:tcPr>
-            <w:tcW w:type="dxa" w:w="1745"/>
+            <w:tcW w:type="dxa" w:w="1730"/>
             <w:tcBorders>
               <w:top w:val="single" w:color="C9CCD6" w:sz="4"/>
               <w:left w:val="single" w:color="C9CCD6" w:sz="4"/>
@@ -898,7 +898,7 @@
         </w:tc>
         <w:tc>
           <w:tcPr>
-            <w:tcW w:type="dxa" w:w="2855"/>
+            <w:tcW w:type="dxa" w:w="2910"/>
             <w:tcBorders>
               <w:top w:val="single" w:color="C9CCD6" w:sz="4"/>
               <w:left w:val="single" w:color="C9CCD6" w:sz="4"/>
@@ -924,7 +924,7 @@
         </w:tc>
         <w:tc>
           <w:tcPr>
-            <w:tcW w:type="dxa" w:w="4760"/>
+            <w:tcW w:type="dxa" w:w="4720"/>
             <w:tcBorders>
               <w:top w:val="single" w:color="C9CCD6" w:sz="4"/>
               <w:left w:val="single" w:color="C9CCD6" w:sz="4"/>
@@ -955,7 +955,7 @@
         </w:trPr>
         <w:tc>
           <w:tcPr>
-            <w:tcW w:type="dxa" w:w="1745"/>
+            <w:tcW w:type="dxa" w:w="1730"/>
             <w:tcBorders>
               <w:top w:val="single" w:color="C9CCD6" w:sz="4"/>
               <w:left w:val="single" w:color="C9CCD6" w:sz="4"/>
@@ -981,7 +981,7 @@
         </w:tc>
         <w:tc>
           <w:tcPr>
-            <w:tcW w:type="dxa" w:w="2855"/>
+            <w:tcW w:type="dxa" w:w="2910"/>
             <w:tcBorders>
               <w:top w:val="single" w:color="C9CCD6" w:sz="4"/>
               <w:left w:val="single" w:color="C9CCD6" w:sz="4"/>
@@ -1007,7 +1007,7 @@
         </w:tc>
         <w:tc>
           <w:tcPr>
-            <w:tcW w:type="dxa" w:w="4760"/>
+            <w:tcW w:type="dxa" w:w="4720"/>
             <w:tcBorders>
               <w:top w:val="single" w:color="C9CCD6" w:sz="4"/>
               <w:left w:val="single" w:color="C9CCD6" w:sz="4"/>
@@ -1038,7 +1038,7 @@
         </w:trPr>
         <w:tc>
           <w:tcPr>
-            <w:tcW w:type="dxa" w:w="1745"/>
+            <w:tcW w:type="dxa" w:w="1730"/>
             <w:tcBorders>
               <w:top w:val="single" w:color="C9CCD6" w:sz="4"/>
               <w:left w:val="single" w:color="C9CCD6" w:sz="4"/>
@@ -1064,7 +1064,7 @@
         </w:tc>
         <w:tc>
           <w:tcPr>
-            <w:tcW w:type="dxa" w:w="2855"/>
+            <w:tcW w:type="dxa" w:w="2910"/>
             <w:tcBorders>
               <w:top w:val="single" w:color="C9CCD6" w:sz="4"/>
               <w:left w:val="single" w:color="C9CCD6" w:sz="4"/>
@@ -1090,7 +1090,7 @@
         </w:tc>
         <w:tc>
           <w:tcPr>
-            <w:tcW w:type="dxa" w:w="4760"/>
+            <w:tcW w:type="dxa" w:w="4720"/>
             <w:tcBorders>
               <w:top w:val="single" w:color="C9CCD6" w:sz="4"/>
               <w:left w:val="single" w:color="C9CCD6" w:sz="4"/>
@@ -1121,7 +1121,7 @@
         </w:trPr>
         <w:tc>
           <w:tcPr>
-            <w:tcW w:type="dxa" w:w="1745"/>
+            <w:tcW w:type="dxa" w:w="1730"/>
             <w:tcBorders>
               <w:top w:val="single" w:color="C9CCD6" w:sz="4"/>
               <w:left w:val="single" w:color="C9CCD6" w:sz="4"/>
@@ -1147,7 +1147,7 @@
         </w:tc>
         <w:tc>
           <w:tcPr>
-            <w:tcW w:type="dxa" w:w="2855"/>
+            <w:tcW w:type="dxa" w:w="2910"/>
             <w:tcBorders>
               <w:top w:val="single" w:color="C9CCD6" w:sz="4"/>
               <w:left w:val="single" w:color="C9CCD6" w:sz="4"/>
@@ -1173,7 +1173,7 @@
         </w:tc>
         <w:tc>
           <w:tcPr>
-            <w:tcW w:type="dxa" w:w="4760"/>
+            <w:tcW w:type="dxa" w:w="4720"/>
             <w:tcBorders>
               <w:top w:val="single" w:color="C9CCD6" w:sz="4"/>
               <w:left w:val="single" w:color="C9CCD6" w:sz="4"/>
@@ -1204,7 +1204,7 @@
         </w:trPr>
         <w:tc>
           <w:tcPr>
-            <w:tcW w:type="dxa" w:w="1745"/>
+            <w:tcW w:type="dxa" w:w="1730"/>
             <w:tcBorders>
               <w:top w:val="single" w:color="C9CCD6" w:sz="4"/>
               <w:left w:val="single" w:color="C9CCD6" w:sz="4"/>
@@ -1230,7 +1230,7 @@
         </w:tc>
         <w:tc>
           <w:tcPr>
-            <w:tcW w:type="dxa" w:w="2855"/>
+            <w:tcW w:type="dxa" w:w="2910"/>
             <w:tcBorders>
               <w:top w:val="single" w:color="C9CCD6" w:sz="4"/>
               <w:left w:val="single" w:color="C9CCD6" w:sz="4"/>
@@ -1256,7 +1256,7 @@
         </w:tc>
         <w:tc>
           <w:tcPr>
-            <w:tcW w:type="dxa" w:w="4760"/>
+            <w:tcW w:type="dxa" w:w="4720"/>
             <w:tcBorders>
               <w:top w:val="single" w:color="C9CCD6" w:sz="4"/>
               <w:left w:val="single" w:color="C9CCD6" w:sz="4"/>
@@ -1287,7 +1287,7 @@
         </w:trPr>
         <w:tc>
           <w:tcPr>
-            <w:tcW w:type="dxa" w:w="1745"/>
+            <w:tcW w:type="dxa" w:w="1730"/>
             <w:tcBorders>
               <w:top w:val="single" w:color="C9CCD6" w:sz="4"/>
               <w:left w:val="single" w:color="C9CCD6" w:sz="4"/>
@@ -1313,7 +1313,7 @@
         </w:tc>
         <w:tc>
           <w:tcPr>
-            <w:tcW w:type="dxa" w:w="2855"/>
+            <w:tcW w:type="dxa" w:w="2910"/>
             <w:tcBorders>
               <w:top w:val="single" w:color="C9CCD6" w:sz="4"/>
               <w:left w:val="single" w:color="C9CCD6" w:sz="4"/>
@@ -1339,7 +1339,7 @@
         </w:tc>
         <w:tc>
           <w:tcPr>
-            <w:tcW w:type="dxa" w:w="4760"/>
+            <w:tcW w:type="dxa" w:w="4720"/>
             <w:tcBorders>
               <w:top w:val="single" w:color="C9CCD6" w:sz="4"/>
               <w:left w:val="single" w:color="C9CCD6" w:sz="4"/>
@@ -3101,7 +3101,7 @@
         <w:spacing w:after="120"/>
       </w:pPr>
       <w:r>
-        <w:t xml:space="preserve">Each player's set has 15 tiles and 21 loot icons: 7 Move, 9 Attack, 5 Heal.</w:t>
+        <w:t xml:space="preserve">Each player's set has 15 tiles and 21 loot icons: 6 Move, 11 Attack, 4 Heal.</w:t>
       </w:r>
     </w:p>
     <w:tbl>
@@ -3349,7 +3349,7 @@
                 <w:sz w:val="20"/>
                 <w:szCs w:val="20"/>
               </w:rPr>
-              <w:t xml:space="preserve">2 each: Move+Attack · Attack+Heal · Heal+Move · Move+Move</w:t>
+              <w:t xml:space="preserve">2 each: Move+Attack · Attack+Attack · Attack+Heal · Move+Move</w:t>
             </w:r>
           </w:p>
         </w:tc>
@@ -3406,7 +3406,7 @@
                 <w:sz w:val="20"/>
                 <w:szCs w:val="20"/>
               </w:rPr>
-              <w:t xml:space="preserve">3 each: Move+Attack+Attack · Attack+Attack+Heal · Move+Attack+Heal</w:t>
+              <w:t xml:space="preserve">3 each: Move+Attack+Heal · Attack+Attack+Heal · Move+Attack+Attack</w:t>
             </w:r>
           </w:p>
         </w:tc>

</xml_diff>

<commit_message>
Last Deck Standing: end-of-turn discard to 3 replaces draw-at-least-2 (SIM-020)
Also records ability-card pool tests in the simulator.

Co-Authored-By: Claude Opus 5.5 <noreply@anthropic.com>
Claude-Session: https://claude.ai/code/session_0199qUwKDP7RJD17yuiRZBeo
</commit_message>
<xml_diff>
--- a/games/last-deck-standing/Last Deck Standing Rules v1.docx
+++ b/games/last-deck-standing/Last Deck Standing Rules v1.docx
@@ -1627,17 +1627,7 @@
         <w:t xml:space="preserve">Draw:</w:t>
       </w:r>
       <w:r>
-        <w:t xml:space="preserve"> draw until you have 5 cards in hand, and always draw </w:t>
-      </w:r>
-      <w:r>
-        <w:rPr>
-          <w:b/>
-          <w:bCs/>
-        </w:rPr>
-        <w:t xml:space="preserve">at least 2</w:t>
-      </w:r>
-      <w:r>
-        <w:t xml:space="preserve"> cards. If that puts you over 5, discard cards of your choice until you have 5 (Dead cards can't be discarded). Held cards and Dead cards count toward the 5. If your draw pile runs out, shuffle your discard pile to make a new one and keep drawing. If both are empty, stop drawing.</w:t>
+        <w:t xml:space="preserve"> draw until you have 5 cards in hand. Held cards and Dead cards count toward the 5. (You end each turn with 3 cards or fewer, so you always draw at least 2.) If your draw pile runs out, shuffle your discard pile to make a new one and keep drawing. If both are empty, stop drawing.</w:t>
       </w:r>
     </w:p>
     <w:p>
@@ -1821,10 +1811,10 @@
           <w:b/>
           <w:bCs/>
         </w:rPr>
-        <w:t xml:space="preserve">You may keep any unplayed cards in your hand</w:t>
-      </w:r>
-      <w:r>
-        <w:t xml:space="preserve">; Dead cards must stay. Any card you put into play counts as played, even if you didn't use all of its value.</w:t>
+        <w:t xml:space="preserve">Then discard down to 3 cards.</w:t>
+      </w:r>
+      <w:r>
+        <w:t xml:space="preserve"> You choose which unplayed cards to keep. Dead cards can't be discarded and count toward the 3. Any card you put into play counts as played, even if you didn't use all of its value.</w:t>
       </w:r>
     </w:p>
     <w:p>
@@ -3437,7 +3427,7 @@
         <w:t xml:space="preserve">Upkeep:</w:t>
       </w:r>
       <w:r>
-        <w:t xml:space="preserve"> refill Shield up to Base Shield → draw up to 5 and at least 2, then discard down to 5 (not Dead cards) → 3+ Dead: announce "critical"</w:t>
+        <w:t xml:space="preserve"> refill Shield up to Base Shield → draw up to 5 (held and Dead cards count) → 3+ Dead: announce "critical"</w:t>
       </w:r>
     </w:p>
     <w:p>
@@ -3527,7 +3517,7 @@
         <w:t xml:space="preserve">End:</w:t>
       </w:r>
       <w:r>
-        <w:t xml:space="preserve"> eliminated if 3+ Dead in hand (then skip the rest) → discard played cards, keep any others → storm markers → storm damage</w:t>
+        <w:t xml:space="preserve"> eliminated if 3+ Dead in hand (then skip the rest) → discard played cards, then discard down to 3 (Dead cards stay and count) → storm markers → storm damage</w:t>
       </w:r>
     </w:p>
     <w:p>

</xml_diff>

<commit_message>
Last Deck Standing: 10 character (ability) cards, Player 1-5 starting decks (SIM-019)
Co-Authored-By: Claude Opus 5.5 <noreply@anthropic.com>
Claude-Session: https://claude.ai/code/session_0199qUwKDP7RJD17yuiRZBeo
</commit_message>
<xml_diff>
--- a/games/last-deck-standing/Last Deck Standing Rules v1.docx
+++ b/games/last-deck-standing/Last Deck Standing Rules v1.docx
@@ -371,7 +371,7 @@
                 <w:sz w:val="20"/>
                 <w:szCs w:val="20"/>
               </w:rPr>
-              <w:t xml:space="preserve">4 Strike (Attack 1), 3 Dash (Move 1), 3 Patch Up (Heal 1). Each player's deck belongs to a character, shown by name and symbol on the card's top band: Blaze ▲, Ember ◆, Tide ≈, Nova ★, Shade ☾</w:t>
+              <w:t xml:space="preserve">4 Strike (Attack 1), 3 Dash (Move 1), 3 Patch Up (Heal 1). Labelled Player 1–5 on the card's top band so decks don't mix</w:t>
             </w:r>
           </w:p>
         </w:tc>
@@ -1364,6 +1364,89 @@
           </w:p>
         </w:tc>
       </w:tr>
+      <w:tr>
+        <w:trPr>
+          <w:tblHeader w:val="off"/>
+        </w:trPr>
+        <w:tc>
+          <w:tcPr>
+            <w:tcW w:type="dxa" w:w="1730"/>
+            <w:tcBorders>
+              <w:top w:val="single" w:color="C9CCD6" w:sz="4"/>
+              <w:left w:val="single" w:color="C9CCD6" w:sz="4"/>
+              <w:bottom w:val="single" w:color="C9CCD6" w:sz="4"/>
+              <w:right w:val="single" w:color="C9CCD6" w:sz="4"/>
+            </w:tcBorders>
+            <w:tcMar>
+              <w:top w:type="dxa" w:w="60"/>
+              <w:left w:type="dxa" w:w="100"/>
+              <w:bottom w:type="dxa" w:w="60"/>
+              <w:right w:type="dxa" w:w="100"/>
+            </w:tcMar>
+          </w:tcPr>
+          <w:p>
+            <w:r>
+              <w:rPr>
+                <w:sz w:val="20"/>
+                <w:szCs w:val="20"/>
+              </w:rPr>
+              <w:t xml:space="preserve">Character cards</w:t>
+            </w:r>
+          </w:p>
+        </w:tc>
+        <w:tc>
+          <w:tcPr>
+            <w:tcW w:type="dxa" w:w="2910"/>
+            <w:tcBorders>
+              <w:top w:val="single" w:color="C9CCD6" w:sz="4"/>
+              <w:left w:val="single" w:color="C9CCD6" w:sz="4"/>
+              <w:bottom w:val="single" w:color="C9CCD6" w:sz="4"/>
+              <w:right w:val="single" w:color="C9CCD6" w:sz="4"/>
+            </w:tcBorders>
+            <w:tcMar>
+              <w:top w:type="dxa" w:w="60"/>
+              <w:left w:type="dxa" w:w="100"/>
+              <w:bottom w:type="dxa" w:w="60"/>
+              <w:right w:type="dxa" w:w="100"/>
+            </w:tcMar>
+          </w:tcPr>
+          <w:p>
+            <w:r>
+              <w:rPr>
+                <w:sz w:val="20"/>
+                <w:szCs w:val="20"/>
+              </w:rPr>
+              <w:t xml:space="preserve">10</w:t>
+            </w:r>
+          </w:p>
+        </w:tc>
+        <w:tc>
+          <w:tcPr>
+            <w:tcW w:type="dxa" w:w="4720"/>
+            <w:tcBorders>
+              <w:top w:val="single" w:color="C9CCD6" w:sz="4"/>
+              <w:left w:val="single" w:color="C9CCD6" w:sz="4"/>
+              <w:bottom w:val="single" w:color="C9CCD6" w:sz="4"/>
+              <w:right w:val="single" w:color="C9CCD6" w:sz="4"/>
+            </w:tcBorders>
+            <w:tcMar>
+              <w:top w:type="dxa" w:w="60"/>
+              <w:left w:type="dxa" w:w="100"/>
+              <w:bottom w:type="dxa" w:w="60"/>
+              <w:right w:type="dxa" w:w="100"/>
+            </w:tcMar>
+          </w:tcPr>
+          <w:p>
+            <w:r>
+              <w:rPr>
+                <w:sz w:val="20"/>
+                <w:szCs w:val="20"/>
+              </w:rPr>
+              <w:t xml:space="preserve">One ability each; see Characters</w:t>
+            </w:r>
+          </w:p>
+        </w:tc>
+      </w:tr>
     </w:tbl>
     <w:p>
       <w:pPr>
@@ -1541,7 +1624,26 @@
         </w:numPr>
       </w:pPr>
       <w:r>
-        <w:t xml:space="preserve">Each player sets their stats to Base Move 1, Base Attack 1, Base Shield 0.</w:t>
+        <w:rPr>
+          <w:b/>
+          <w:bCs/>
+        </w:rPr>
+        <w:t xml:space="preserve">Choose characters.</w:t>
+      </w:r>
+      <w:r>
+        <w:t xml:space="preserve"> Shuffle the character cards and deal 2 to each player. Keep 1 face up in front of you and return the other to the box.</w:t>
+      </w:r>
+    </w:p>
+    <w:p>
+      <w:pPr>
+        <w:pStyle w:val="ListParagraph"/>
+        <w:numPr>
+          <w:ilvl w:val="0"/>
+          <w:numId w:val="3"/>
+        </w:numPr>
+      </w:pPr>
+      <w:r>
+        <w:t xml:space="preserve">Each player sets their stats to Base Move 1, Base Attack 1, Base Shield 0, then applies their character's changes.</w:t>
       </w:r>
     </w:p>
     <w:p>
@@ -2165,6 +2267,817 @@
                 <w:szCs w:val="20"/>
               </w:rPr>
               <w:t xml:space="preserve"> add that many points to your Shield tracker (maximum 4). They stay until damage uses them; the card is discarded at the end of your turn with your other cards.</w:t>
+            </w:r>
+          </w:p>
+        </w:tc>
+      </w:tr>
+    </w:tbl>
+    <w:p>
+      <w:pPr>
+        <w:spacing w:after="60"/>
+      </w:pPr>
+    </w:p>
+    <w:p>
+      <w:pPr>
+        <w:pStyle w:val="Heading1"/>
+      </w:pPr>
+      <w:r>
+        <w:t xml:space="preserve">Characters</w:t>
+      </w:r>
+    </w:p>
+    <w:p>
+      <w:pPr>
+        <w:spacing w:after="120"/>
+      </w:pPr>
+      <w:r>
+        <w:t xml:space="preserve">Each character card gives you one ability for the whole game.</w:t>
+      </w:r>
+    </w:p>
+    <w:tbl>
+      <w:tblPr>
+        <w:tblW w:type="dxa" w:w="9360"/>
+        <w:tblBorders>
+          <w:top w:val="single" w:color="auto" w:sz="4"/>
+          <w:left w:val="single" w:color="auto" w:sz="4"/>
+          <w:bottom w:val="single" w:color="auto" w:sz="4"/>
+          <w:right w:val="single" w:color="auto" w:sz="4"/>
+          <w:insideH w:val="single" w:color="auto" w:sz="4"/>
+          <w:insideV w:val="single" w:color="auto" w:sz="4"/>
+        </w:tblBorders>
+      </w:tblPr>
+      <w:tblGrid>
+        <w:gridCol w:w="1666"/>
+        <w:gridCol w:w="7694"/>
+      </w:tblGrid>
+      <w:tr>
+        <w:trPr>
+          <w:tblHeader/>
+        </w:trPr>
+        <w:tc>
+          <w:tcPr>
+            <w:tcW w:type="dxa" w:w="1666"/>
+            <w:tcBorders>
+              <w:top w:val="single" w:color="C9CCD6" w:sz="4"/>
+              <w:left w:val="single" w:color="C9CCD6" w:sz="4"/>
+              <w:bottom w:val="single" w:color="C9CCD6" w:sz="4"/>
+              <w:right w:val="single" w:color="C9CCD6" w:sz="4"/>
+            </w:tcBorders>
+            <w:shd w:fill="ECE7F7" w:color="auto" w:val="clear"/>
+            <w:tcMar>
+              <w:top w:type="dxa" w:w="60"/>
+              <w:left w:type="dxa" w:w="100"/>
+              <w:bottom w:type="dxa" w:w="60"/>
+              <w:right w:type="dxa" w:w="100"/>
+            </w:tcMar>
+          </w:tcPr>
+          <w:p>
+            <w:r>
+              <w:rPr>
+                <w:b/>
+                <w:bCs/>
+                <w:sz w:val="20"/>
+                <w:szCs w:val="20"/>
+              </w:rPr>
+              <w:t xml:space="preserve">Character</w:t>
+            </w:r>
+          </w:p>
+        </w:tc>
+        <w:tc>
+          <w:tcPr>
+            <w:tcW w:type="dxa" w:w="7694"/>
+            <w:tcBorders>
+              <w:top w:val="single" w:color="C9CCD6" w:sz="4"/>
+              <w:left w:val="single" w:color="C9CCD6" w:sz="4"/>
+              <w:bottom w:val="single" w:color="C9CCD6" w:sz="4"/>
+              <w:right w:val="single" w:color="C9CCD6" w:sz="4"/>
+            </w:tcBorders>
+            <w:shd w:fill="ECE7F7" w:color="auto" w:val="clear"/>
+            <w:tcMar>
+              <w:top w:type="dxa" w:w="60"/>
+              <w:left w:type="dxa" w:w="100"/>
+              <w:bottom w:type="dxa" w:w="60"/>
+              <w:right w:type="dxa" w:w="100"/>
+            </w:tcMar>
+          </w:tcPr>
+          <w:p>
+            <w:r>
+              <w:rPr>
+                <w:b/>
+                <w:bCs/>
+                <w:sz w:val="20"/>
+                <w:szCs w:val="20"/>
+              </w:rPr>
+              <w:t xml:space="preserve">Ability</w:t>
+            </w:r>
+          </w:p>
+        </w:tc>
+      </w:tr>
+      <w:tr>
+        <w:trPr>
+          <w:tblHeader w:val="off"/>
+        </w:trPr>
+        <w:tc>
+          <w:tcPr>
+            <w:tcW w:type="dxa" w:w="1666"/>
+            <w:tcBorders>
+              <w:top w:val="single" w:color="C9CCD6" w:sz="4"/>
+              <w:left w:val="single" w:color="C9CCD6" w:sz="4"/>
+              <w:bottom w:val="single" w:color="C9CCD6" w:sz="4"/>
+              <w:right w:val="single" w:color="C9CCD6" w:sz="4"/>
+            </w:tcBorders>
+            <w:tcMar>
+              <w:top w:type="dxa" w:w="60"/>
+              <w:left w:type="dxa" w:w="100"/>
+              <w:bottom w:type="dxa" w:w="60"/>
+              <w:right w:type="dxa" w:w="100"/>
+            </w:tcMar>
+          </w:tcPr>
+          <w:p>
+            <w:r>
+              <w:rPr>
+                <w:sz w:val="20"/>
+                <w:szCs w:val="20"/>
+              </w:rPr>
+              <w:t xml:space="preserve">▲ </w:t>
+            </w:r>
+            <w:r>
+              <w:rPr>
+                <w:sz w:val="20"/>
+                <w:szCs w:val="20"/>
+              </w:rPr>
+              <w:t xml:space="preserve">Blaze</w:t>
+            </w:r>
+          </w:p>
+        </w:tc>
+        <w:tc>
+          <w:tcPr>
+            <w:tcW w:type="dxa" w:w="7694"/>
+            <w:tcBorders>
+              <w:top w:val="single" w:color="C9CCD6" w:sz="4"/>
+              <w:left w:val="single" w:color="C9CCD6" w:sz="4"/>
+              <w:bottom w:val="single" w:color="C9CCD6" w:sz="4"/>
+              <w:right w:val="single" w:color="C9CCD6" w:sz="4"/>
+            </w:tcBorders>
+            <w:tcMar>
+              <w:top w:type="dxa" w:w="60"/>
+              <w:left w:type="dxa" w:w="100"/>
+              <w:bottom w:type="dxa" w:w="60"/>
+              <w:right w:type="dxa" w:w="100"/>
+            </w:tcMar>
+          </w:tcPr>
+          <w:p>
+            <w:r>
+              <w:rPr>
+                <w:sz w:val="20"/>
+                <w:szCs w:val="20"/>
+              </w:rPr>
+              <w:t xml:space="preserve">Point blank:</w:t>
+            </w:r>
+            <w:r>
+              <w:rPr>
+                <w:sz w:val="20"/>
+                <w:szCs w:val="20"/>
+              </w:rPr>
+              <w:t xml:space="preserve"> your attacks deal +1 damage to a player on your own tile.</w:t>
+            </w:r>
+          </w:p>
+        </w:tc>
+      </w:tr>
+      <w:tr>
+        <w:trPr>
+          <w:tblHeader w:val="off"/>
+        </w:trPr>
+        <w:tc>
+          <w:tcPr>
+            <w:tcW w:type="dxa" w:w="1666"/>
+            <w:tcBorders>
+              <w:top w:val="single" w:color="C9CCD6" w:sz="4"/>
+              <w:left w:val="single" w:color="C9CCD6" w:sz="4"/>
+              <w:bottom w:val="single" w:color="C9CCD6" w:sz="4"/>
+              <w:right w:val="single" w:color="C9CCD6" w:sz="4"/>
+            </w:tcBorders>
+            <w:tcMar>
+              <w:top w:type="dxa" w:w="60"/>
+              <w:left w:type="dxa" w:w="100"/>
+              <w:bottom w:type="dxa" w:w="60"/>
+              <w:right w:type="dxa" w:w="100"/>
+            </w:tcMar>
+          </w:tcPr>
+          <w:p>
+            <w:r>
+              <w:rPr>
+                <w:sz w:val="20"/>
+                <w:szCs w:val="20"/>
+              </w:rPr>
+              <w:t xml:space="preserve">☾ </w:t>
+            </w:r>
+            <w:r>
+              <w:rPr>
+                <w:sz w:val="20"/>
+                <w:szCs w:val="20"/>
+              </w:rPr>
+              <w:t xml:space="preserve">Shade</w:t>
+            </w:r>
+          </w:p>
+        </w:tc>
+        <w:tc>
+          <w:tcPr>
+            <w:tcW w:type="dxa" w:w="7694"/>
+            <w:tcBorders>
+              <w:top w:val="single" w:color="C9CCD6" w:sz="4"/>
+              <w:left w:val="single" w:color="C9CCD6" w:sz="4"/>
+              <w:bottom w:val="single" w:color="C9CCD6" w:sz="4"/>
+              <w:right w:val="single" w:color="C9CCD6" w:sz="4"/>
+            </w:tcBorders>
+            <w:tcMar>
+              <w:top w:type="dxa" w:w="60"/>
+              <w:left w:type="dxa" w:w="100"/>
+              <w:bottom w:type="dxa" w:w="60"/>
+              <w:right w:type="dxa" w:w="100"/>
+            </w:tcMar>
+          </w:tcPr>
+          <w:p>
+            <w:r>
+              <w:rPr>
+                <w:sz w:val="20"/>
+                <w:szCs w:val="20"/>
+              </w:rPr>
+              <w:t xml:space="preserve">Long shot:</w:t>
+            </w:r>
+            <w:r>
+              <w:rPr>
+                <w:sz w:val="20"/>
+                <w:szCs w:val="20"/>
+              </w:rPr>
+              <w:t xml:space="preserve"> your attacks deal +1 damage to a player who isn't on your tile.</w:t>
+            </w:r>
+          </w:p>
+        </w:tc>
+      </w:tr>
+      <w:tr>
+        <w:trPr>
+          <w:tblHeader w:val="off"/>
+        </w:trPr>
+        <w:tc>
+          <w:tcPr>
+            <w:tcW w:type="dxa" w:w="1666"/>
+            <w:tcBorders>
+              <w:top w:val="single" w:color="C9CCD6" w:sz="4"/>
+              <w:left w:val="single" w:color="C9CCD6" w:sz="4"/>
+              <w:bottom w:val="single" w:color="C9CCD6" w:sz="4"/>
+              <w:right w:val="single" w:color="C9CCD6" w:sz="4"/>
+            </w:tcBorders>
+            <w:tcMar>
+              <w:top w:type="dxa" w:w="60"/>
+              <w:left w:type="dxa" w:w="100"/>
+              <w:bottom w:type="dxa" w:w="60"/>
+              <w:right w:type="dxa" w:w="100"/>
+            </w:tcMar>
+          </w:tcPr>
+          <w:p>
+            <w:r>
+              <w:rPr>
+                <w:sz w:val="20"/>
+                <w:szCs w:val="20"/>
+              </w:rPr>
+              <w:t xml:space="preserve">◆ </w:t>
+            </w:r>
+            <w:r>
+              <w:rPr>
+                <w:sz w:val="20"/>
+                <w:szCs w:val="20"/>
+              </w:rPr>
+              <w:t xml:space="preserve">Ember</w:t>
+            </w:r>
+          </w:p>
+        </w:tc>
+        <w:tc>
+          <w:tcPr>
+            <w:tcW w:type="dxa" w:w="7694"/>
+            <w:tcBorders>
+              <w:top w:val="single" w:color="C9CCD6" w:sz="4"/>
+              <w:left w:val="single" w:color="C9CCD6" w:sz="4"/>
+              <w:bottom w:val="single" w:color="C9CCD6" w:sz="4"/>
+              <w:right w:val="single" w:color="C9CCD6" w:sz="4"/>
+            </w:tcBorders>
+            <w:tcMar>
+              <w:top w:type="dxa" w:w="60"/>
+              <w:left w:type="dxa" w:w="100"/>
+              <w:bottom w:type="dxa" w:w="60"/>
+              <w:right w:type="dxa" w:w="100"/>
+            </w:tcMar>
+          </w:tcPr>
+          <w:p>
+            <w:r>
+              <w:rPr>
+                <w:sz w:val="20"/>
+                <w:szCs w:val="20"/>
+              </w:rPr>
+              <w:t xml:space="preserve">Scavenge:</w:t>
+            </w:r>
+            <w:r>
+              <w:rPr>
+                <w:sz w:val="20"/>
+                <w:szCs w:val="20"/>
+              </w:rPr>
+              <w:t xml:space="preserve"> you may loot twice per turn.</w:t>
+            </w:r>
+          </w:p>
+        </w:tc>
+      </w:tr>
+      <w:tr>
+        <w:trPr>
+          <w:tblHeader w:val="off"/>
+        </w:trPr>
+        <w:tc>
+          <w:tcPr>
+            <w:tcW w:type="dxa" w:w="1666"/>
+            <w:tcBorders>
+              <w:top w:val="single" w:color="C9CCD6" w:sz="4"/>
+              <w:left w:val="single" w:color="C9CCD6" w:sz="4"/>
+              <w:bottom w:val="single" w:color="C9CCD6" w:sz="4"/>
+              <w:right w:val="single" w:color="C9CCD6" w:sz="4"/>
+            </w:tcBorders>
+            <w:tcMar>
+              <w:top w:type="dxa" w:w="60"/>
+              <w:left w:type="dxa" w:w="100"/>
+              <w:bottom w:type="dxa" w:w="60"/>
+              <w:right w:type="dxa" w:w="100"/>
+            </w:tcMar>
+          </w:tcPr>
+          <w:p>
+            <w:r>
+              <w:rPr>
+                <w:sz w:val="20"/>
+                <w:szCs w:val="20"/>
+              </w:rPr>
+              <w:t xml:space="preserve">≈ </w:t>
+            </w:r>
+            <w:r>
+              <w:rPr>
+                <w:sz w:val="20"/>
+                <w:szCs w:val="20"/>
+              </w:rPr>
+              <w:t xml:space="preserve">Tide</w:t>
+            </w:r>
+          </w:p>
+        </w:tc>
+        <w:tc>
+          <w:tcPr>
+            <w:tcW w:type="dxa" w:w="7694"/>
+            <w:tcBorders>
+              <w:top w:val="single" w:color="C9CCD6" w:sz="4"/>
+              <w:left w:val="single" w:color="C9CCD6" w:sz="4"/>
+              <w:bottom w:val="single" w:color="C9CCD6" w:sz="4"/>
+              <w:right w:val="single" w:color="C9CCD6" w:sz="4"/>
+            </w:tcBorders>
+            <w:tcMar>
+              <w:top w:type="dxa" w:w="60"/>
+              <w:left w:type="dxa" w:w="100"/>
+              <w:bottom w:type="dxa" w:w="60"/>
+              <w:right w:type="dxa" w:w="100"/>
+            </w:tcMar>
+          </w:tcPr>
+          <w:p>
+            <w:r>
+              <w:rPr>
+                <w:sz w:val="20"/>
+                <w:szCs w:val="20"/>
+              </w:rPr>
+              <w:t xml:space="preserve">Runner:</w:t>
+            </w:r>
+            <w:r>
+              <w:rPr>
+                <w:sz w:val="20"/>
+                <w:szCs w:val="20"/>
+              </w:rPr>
+              <w:t xml:space="preserve"> your Base Move starts at 2.</w:t>
+            </w:r>
+          </w:p>
+        </w:tc>
+      </w:tr>
+      <w:tr>
+        <w:trPr>
+          <w:tblHeader w:val="off"/>
+        </w:trPr>
+        <w:tc>
+          <w:tcPr>
+            <w:tcW w:type="dxa" w:w="1666"/>
+            <w:tcBorders>
+              <w:top w:val="single" w:color="C9CCD6" w:sz="4"/>
+              <w:left w:val="single" w:color="C9CCD6" w:sz="4"/>
+              <w:bottom w:val="single" w:color="C9CCD6" w:sz="4"/>
+              <w:right w:val="single" w:color="C9CCD6" w:sz="4"/>
+            </w:tcBorders>
+            <w:tcMar>
+              <w:top w:type="dxa" w:w="60"/>
+              <w:left w:type="dxa" w:w="100"/>
+              <w:bottom w:type="dxa" w:w="60"/>
+              <w:right w:type="dxa" w:w="100"/>
+            </w:tcMar>
+          </w:tcPr>
+          <w:p>
+            <w:r>
+              <w:rPr>
+                <w:sz w:val="20"/>
+                <w:szCs w:val="20"/>
+              </w:rPr>
+              <w:t xml:space="preserve">★ </w:t>
+            </w:r>
+            <w:r>
+              <w:rPr>
+                <w:sz w:val="20"/>
+                <w:szCs w:val="20"/>
+              </w:rPr>
+              <w:t xml:space="preserve">Nova</w:t>
+            </w:r>
+          </w:p>
+        </w:tc>
+        <w:tc>
+          <w:tcPr>
+            <w:tcW w:type="dxa" w:w="7694"/>
+            <w:tcBorders>
+              <w:top w:val="single" w:color="C9CCD6" w:sz="4"/>
+              <w:left w:val="single" w:color="C9CCD6" w:sz="4"/>
+              <w:bottom w:val="single" w:color="C9CCD6" w:sz="4"/>
+              <w:right w:val="single" w:color="C9CCD6" w:sz="4"/>
+            </w:tcBorders>
+            <w:tcMar>
+              <w:top w:type="dxa" w:w="60"/>
+              <w:left w:type="dxa" w:w="100"/>
+              <w:bottom w:type="dxa" w:w="60"/>
+              <w:right w:type="dxa" w:w="100"/>
+            </w:tcMar>
+          </w:tcPr>
+          <w:p>
+            <w:r>
+              <w:rPr>
+                <w:sz w:val="20"/>
+                <w:szCs w:val="20"/>
+              </w:rPr>
+              <w:t xml:space="preserve">Field medic:</w:t>
+            </w:r>
+            <w:r>
+              <w:rPr>
+                <w:sz w:val="20"/>
+                <w:szCs w:val="20"/>
+              </w:rPr>
+              <w:t xml:space="preserve"> your Base Move starts at 2, and each Heal card you use to heal removes 2 extra Dead cards.</w:t>
+            </w:r>
+          </w:p>
+        </w:tc>
+      </w:tr>
+      <w:tr>
+        <w:trPr>
+          <w:tblHeader w:val="off"/>
+        </w:trPr>
+        <w:tc>
+          <w:tcPr>
+            <w:tcW w:type="dxa" w:w="1666"/>
+            <w:tcBorders>
+              <w:top w:val="single" w:color="C9CCD6" w:sz="4"/>
+              <w:left w:val="single" w:color="C9CCD6" w:sz="4"/>
+              <w:bottom w:val="single" w:color="C9CCD6" w:sz="4"/>
+              <w:right w:val="single" w:color="C9CCD6" w:sz="4"/>
+            </w:tcBorders>
+            <w:tcMar>
+              <w:top w:type="dxa" w:w="60"/>
+              <w:left w:type="dxa" w:w="100"/>
+              <w:bottom w:type="dxa" w:w="60"/>
+              <w:right w:type="dxa" w:w="100"/>
+            </w:tcMar>
+          </w:tcPr>
+          <w:p>
+            <w:r>
+              <w:rPr>
+                <w:sz w:val="20"/>
+                <w:szCs w:val="20"/>
+              </w:rPr>
+              <w:t xml:space="preserve">☁ </w:t>
+            </w:r>
+            <w:r>
+              <w:rPr>
+                <w:sz w:val="20"/>
+                <w:szCs w:val="20"/>
+              </w:rPr>
+              <w:t xml:space="preserve">Gale</w:t>
+            </w:r>
+          </w:p>
+        </w:tc>
+        <w:tc>
+          <w:tcPr>
+            <w:tcW w:type="dxa" w:w="7694"/>
+            <w:tcBorders>
+              <w:top w:val="single" w:color="C9CCD6" w:sz="4"/>
+              <w:left w:val="single" w:color="C9CCD6" w:sz="4"/>
+              <w:bottom w:val="single" w:color="C9CCD6" w:sz="4"/>
+              <w:right w:val="single" w:color="C9CCD6" w:sz="4"/>
+            </w:tcBorders>
+            <w:tcMar>
+              <w:top w:type="dxa" w:w="60"/>
+              <w:left w:type="dxa" w:w="100"/>
+              <w:bottom w:type="dxa" w:w="60"/>
+              <w:right w:type="dxa" w:w="100"/>
+            </w:tcMar>
+          </w:tcPr>
+          <w:p>
+            <w:r>
+              <w:rPr>
+                <w:sz w:val="20"/>
+                <w:szCs w:val="20"/>
+              </w:rPr>
+              <w:t xml:space="preserve">Storm runner:</w:t>
+            </w:r>
+            <w:r>
+              <w:rPr>
+                <w:sz w:val="20"/>
+                <w:szCs w:val="20"/>
+              </w:rPr>
+              <w:t xml:space="preserve"> you take 1 less storm damage.</w:t>
+            </w:r>
+          </w:p>
+        </w:tc>
+      </w:tr>
+      <w:tr>
+        <w:trPr>
+          <w:tblHeader w:val="off"/>
+        </w:trPr>
+        <w:tc>
+          <w:tcPr>
+            <w:tcW w:type="dxa" w:w="1666"/>
+            <w:tcBorders>
+              <w:top w:val="single" w:color="C9CCD6" w:sz="4"/>
+              <w:left w:val="single" w:color="C9CCD6" w:sz="4"/>
+              <w:bottom w:val="single" w:color="C9CCD6" w:sz="4"/>
+              <w:right w:val="single" w:color="C9CCD6" w:sz="4"/>
+            </w:tcBorders>
+            <w:tcMar>
+              <w:top w:type="dxa" w:w="60"/>
+              <w:left w:type="dxa" w:w="100"/>
+              <w:bottom w:type="dxa" w:w="60"/>
+              <w:right w:type="dxa" w:w="100"/>
+            </w:tcMar>
+          </w:tcPr>
+          <w:p>
+            <w:r>
+              <w:rPr>
+                <w:sz w:val="20"/>
+                <w:szCs w:val="20"/>
+              </w:rPr>
+              <w:t xml:space="preserve">⚡ </w:t>
+            </w:r>
+            <w:r>
+              <w:rPr>
+                <w:sz w:val="20"/>
+                <w:szCs w:val="20"/>
+              </w:rPr>
+              <w:t xml:space="preserve">Vex</w:t>
+            </w:r>
+          </w:p>
+        </w:tc>
+        <w:tc>
+          <w:tcPr>
+            <w:tcW w:type="dxa" w:w="7694"/>
+            <w:tcBorders>
+              <w:top w:val="single" w:color="C9CCD6" w:sz="4"/>
+              <w:left w:val="single" w:color="C9CCD6" w:sz="4"/>
+              <w:bottom w:val="single" w:color="C9CCD6" w:sz="4"/>
+              <w:right w:val="single" w:color="C9CCD6" w:sz="4"/>
+            </w:tcBorders>
+            <w:tcMar>
+              <w:top w:type="dxa" w:w="60"/>
+              <w:left w:type="dxa" w:w="100"/>
+              <w:bottom w:type="dxa" w:w="60"/>
+              <w:right w:type="dxa" w:w="100"/>
+            </w:tcMar>
+          </w:tcPr>
+          <w:p>
+            <w:r>
+              <w:rPr>
+                <w:sz w:val="20"/>
+                <w:szCs w:val="20"/>
+              </w:rPr>
+              <w:t xml:space="preserve">Siphon:</w:t>
+            </w:r>
+            <w:r>
+              <w:rPr>
+                <w:sz w:val="20"/>
+                <w:szCs w:val="20"/>
+              </w:rPr>
+              <w:t xml:space="preserve"> when your attack puts 2 or more Dead cards on a player, return 1 Dead card from your hand to the supply.</w:t>
+            </w:r>
+          </w:p>
+        </w:tc>
+      </w:tr>
+      <w:tr>
+        <w:trPr>
+          <w:tblHeader w:val="off"/>
+        </w:trPr>
+        <w:tc>
+          <w:tcPr>
+            <w:tcW w:type="dxa" w:w="1666"/>
+            <w:tcBorders>
+              <w:top w:val="single" w:color="C9CCD6" w:sz="4"/>
+              <w:left w:val="single" w:color="C9CCD6" w:sz="4"/>
+              <w:bottom w:val="single" w:color="C9CCD6" w:sz="4"/>
+              <w:right w:val="single" w:color="C9CCD6" w:sz="4"/>
+            </w:tcBorders>
+            <w:tcMar>
+              <w:top w:type="dxa" w:w="60"/>
+              <w:left w:type="dxa" w:w="100"/>
+              <w:bottom w:type="dxa" w:w="60"/>
+              <w:right w:type="dxa" w:w="100"/>
+            </w:tcMar>
+          </w:tcPr>
+          <w:p>
+            <w:r>
+              <w:rPr>
+                <w:sz w:val="20"/>
+                <w:szCs w:val="20"/>
+              </w:rPr>
+              <w:t xml:space="preserve">■ </w:t>
+            </w:r>
+            <w:r>
+              <w:rPr>
+                <w:sz w:val="20"/>
+                <w:szCs w:val="20"/>
+              </w:rPr>
+              <w:t xml:space="preserve">Bastion</w:t>
+            </w:r>
+          </w:p>
+        </w:tc>
+        <w:tc>
+          <w:tcPr>
+            <w:tcW w:type="dxa" w:w="7694"/>
+            <w:tcBorders>
+              <w:top w:val="single" w:color="C9CCD6" w:sz="4"/>
+              <w:left w:val="single" w:color="C9CCD6" w:sz="4"/>
+              <w:bottom w:val="single" w:color="C9CCD6" w:sz="4"/>
+              <w:right w:val="single" w:color="C9CCD6" w:sz="4"/>
+            </w:tcBorders>
+            <w:tcMar>
+              <w:top w:type="dxa" w:w="60"/>
+              <w:left w:type="dxa" w:w="100"/>
+              <w:bottom w:type="dxa" w:w="60"/>
+              <w:right w:type="dxa" w:w="100"/>
+            </w:tcMar>
+          </w:tcPr>
+          <w:p>
+            <w:r>
+              <w:rPr>
+                <w:sz w:val="20"/>
+                <w:szCs w:val="20"/>
+              </w:rPr>
+              <w:t xml:space="preserve">Armored:</w:t>
+            </w:r>
+            <w:r>
+              <w:rPr>
+                <w:sz w:val="20"/>
+                <w:szCs w:val="20"/>
+              </w:rPr>
+              <w:t xml:space="preserve"> you start the game with 1 Shield point (it doesn't refill at upkeep).</w:t>
+            </w:r>
+          </w:p>
+        </w:tc>
+      </w:tr>
+      <w:tr>
+        <w:trPr>
+          <w:tblHeader w:val="off"/>
+        </w:trPr>
+        <w:tc>
+          <w:tcPr>
+            <w:tcW w:type="dxa" w:w="1666"/>
+            <w:tcBorders>
+              <w:top w:val="single" w:color="C9CCD6" w:sz="4"/>
+              <w:left w:val="single" w:color="C9CCD6" w:sz="4"/>
+              <w:bottom w:val="single" w:color="C9CCD6" w:sz="4"/>
+              <w:right w:val="single" w:color="C9CCD6" w:sz="4"/>
+            </w:tcBorders>
+            <w:tcMar>
+              <w:top w:type="dxa" w:w="60"/>
+              <w:left w:type="dxa" w:w="100"/>
+              <w:bottom w:type="dxa" w:w="60"/>
+              <w:right w:type="dxa" w:w="100"/>
+            </w:tcMar>
+          </w:tcPr>
+          <w:p>
+            <w:r>
+              <w:rPr>
+                <w:sz w:val="20"/>
+                <w:szCs w:val="20"/>
+              </w:rPr>
+              <w:t xml:space="preserve">● </w:t>
+            </w:r>
+            <w:r>
+              <w:rPr>
+                <w:sz w:val="20"/>
+                <w:szCs w:val="20"/>
+              </w:rPr>
+              <w:t xml:space="preserve">Brute</w:t>
+            </w:r>
+          </w:p>
+        </w:tc>
+        <w:tc>
+          <w:tcPr>
+            <w:tcW w:type="dxa" w:w="7694"/>
+            <w:tcBorders>
+              <w:top w:val="single" w:color="C9CCD6" w:sz="4"/>
+              <w:left w:val="single" w:color="C9CCD6" w:sz="4"/>
+              <w:bottom w:val="single" w:color="C9CCD6" w:sz="4"/>
+              <w:right w:val="single" w:color="C9CCD6" w:sz="4"/>
+            </w:tcBorders>
+            <w:tcMar>
+              <w:top w:type="dxa" w:w="60"/>
+              <w:left w:type="dxa" w:w="100"/>
+              <w:bottom w:type="dxa" w:w="60"/>
+              <w:right w:type="dxa" w:w="100"/>
+            </w:tcMar>
+          </w:tcPr>
+          <w:p>
+            <w:r>
+              <w:rPr>
+                <w:sz w:val="20"/>
+                <w:szCs w:val="20"/>
+              </w:rPr>
+              <w:t xml:space="preserve">Heavy hitter:</w:t>
+            </w:r>
+            <w:r>
+              <w:rPr>
+                <w:sz w:val="20"/>
+                <w:szCs w:val="20"/>
+              </w:rPr>
+              <w:t xml:space="preserve"> your Base Attack starts at 2.</w:t>
+            </w:r>
+          </w:p>
+        </w:tc>
+      </w:tr>
+      <w:tr>
+        <w:trPr>
+          <w:tblHeader w:val="off"/>
+        </w:trPr>
+        <w:tc>
+          <w:tcPr>
+            <w:tcW w:type="dxa" w:w="1666"/>
+            <w:tcBorders>
+              <w:top w:val="single" w:color="C9CCD6" w:sz="4"/>
+              <w:left w:val="single" w:color="C9CCD6" w:sz="4"/>
+              <w:bottom w:val="single" w:color="C9CCD6" w:sz="4"/>
+              <w:right w:val="single" w:color="C9CCD6" w:sz="4"/>
+            </w:tcBorders>
+            <w:tcMar>
+              <w:top w:type="dxa" w:w="60"/>
+              <w:left w:type="dxa" w:w="100"/>
+              <w:bottom w:type="dxa" w:w="60"/>
+              <w:right w:type="dxa" w:w="100"/>
+            </w:tcMar>
+          </w:tcPr>
+          <w:p>
+            <w:r>
+              <w:rPr>
+                <w:sz w:val="20"/>
+                <w:szCs w:val="20"/>
+              </w:rPr>
+              <w:t xml:space="preserve">⚙ </w:t>
+            </w:r>
+            <w:r>
+              <w:rPr>
+                <w:sz w:val="20"/>
+                <w:szCs w:val="20"/>
+              </w:rPr>
+              <w:t xml:space="preserve">Rig</w:t>
+            </w:r>
+          </w:p>
+        </w:tc>
+        <w:tc>
+          <w:tcPr>
+            <w:tcW w:type="dxa" w:w="7694"/>
+            <w:tcBorders>
+              <w:top w:val="single" w:color="C9CCD6" w:sz="4"/>
+              <w:left w:val="single" w:color="C9CCD6" w:sz="4"/>
+              <w:bottom w:val="single" w:color="C9CCD6" w:sz="4"/>
+              <w:right w:val="single" w:color="C9CCD6" w:sz="4"/>
+            </w:tcBorders>
+            <w:tcMar>
+              <w:top w:type="dxa" w:w="60"/>
+              <w:left w:type="dxa" w:w="100"/>
+              <w:bottom w:type="dxa" w:w="60"/>
+              <w:right w:type="dxa" w:w="100"/>
+            </w:tcMar>
+          </w:tcPr>
+          <w:p>
+            <w:r>
+              <w:rPr>
+                <w:sz w:val="20"/>
+                <w:szCs w:val="20"/>
+              </w:rPr>
+              <w:t xml:space="preserve">Tinkerer:</w:t>
+            </w:r>
+            <w:r>
+              <w:rPr>
+                <w:sz w:val="20"/>
+                <w:szCs w:val="20"/>
+              </w:rPr>
+              <w:t xml:space="preserve"> your first upgrade costs 3 instead of 4.</w:t>
             </w:r>
           </w:p>
         </w:tc>
@@ -3572,6 +4485,25 @@
       </w:pPr>
       <w:r>
         <w:t xml:space="preserve">Ideas for Later (not in these rules)</w:t>
+      </w:r>
+    </w:p>
+    <w:p>
+      <w:pPr>
+        <w:pStyle w:val="ListParagraph"/>
+        <w:numPr>
+          <w:ilvl w:val="0"/>
+          <w:numId w:val="2"/>
+        </w:numPr>
+      </w:pPr>
+      <w:r>
+        <w:rPr>
+          <w:b/>
+          <w:bCs/>
+        </w:rPr>
+        <w:t xml:space="preserve">Deep pockets (character):</w:t>
+      </w:r>
+      <w:r>
+        <w:t xml:space="preserve"> keep 4 cards at end of turn instead of 3. Tested too weak (SIM-019); needs a buff before it joins the deck.</w:t>
       </w:r>
     </w:p>
     <w:p>

</xml_diff>

<commit_message>
Last Deck Standing: characters marked optional; no-character baseline (SIM-020)
Co-Authored-By: Claude Opus 5.5 <noreply@anthropic.com>
Claude-Session: https://claude.ai/code/session_0199qUwKDP7RJD17yuiRZBeo
</commit_message>
<xml_diff>
--- a/games/last-deck-standing/Last Deck Standing Rules v1.docx
+++ b/games/last-deck-standing/Last Deck Standing Rules v1.docx
@@ -1442,7 +1442,7 @@
                 <w:sz w:val="20"/>
                 <w:szCs w:val="20"/>
               </w:rPr>
-              <w:t xml:space="preserve">One ability each; see Characters</w:t>
+              <w:t xml:space="preserve">Optional variant: one ability each; see Characters</w:t>
             </w:r>
           </w:p>
         </w:tc>
@@ -1628,7 +1628,7 @@
           <w:b/>
           <w:bCs/>
         </w:rPr>
-        <w:t xml:space="preserve">Choose characters.</w:t>
+        <w:t xml:space="preserve">Characters (optional variant; skip for your first games).</w:t>
       </w:r>
       <w:r>
         <w:t xml:space="preserve"> Shuffle the character cards and deal 2 to each player. Keep 1 face up in front of you and return the other to the box.</w:t>
@@ -1643,7 +1643,7 @@
         </w:numPr>
       </w:pPr>
       <w:r>
-        <w:t xml:space="preserve">Each player sets their stats to Base Move 1, Base Attack 1, Base Shield 0, then applies their character's changes.</w:t>
+        <w:t xml:space="preserve">Each player sets their stats to Base Move 1, Base Attack 1, Base Shield 0, then applies their character's changes if you're using characters.</w:t>
       </w:r>
     </w:p>
     <w:p>
@@ -2282,7 +2282,7 @@
         <w:pStyle w:val="Heading1"/>
       </w:pPr>
       <w:r>
-        <w:t xml:space="preserve">Characters</w:t>
+        <w:t xml:space="preserve">Characters (optional variant)</w:t>
       </w:r>
     </w:p>
     <w:p>
@@ -2290,7 +2290,7 @@
         <w:spacing w:after="120"/>
       </w:pPr>
       <w:r>
-        <w:t xml:space="preserve">Each character card gives you one ability for the whole game.</w:t>
+        <w:t xml:space="preserve">Not used in the base game yet; try them after a few games without. Each character card gives you one ability for the whole game.</w:t>
       </w:r>
     </w:p>
     <w:tbl>

</xml_diff>

<commit_message>
Last Deck Standing: READTHROUGH-004 wording fixes
Co-Authored-By: Claude Opus 5.5 <noreply@anthropic.com>
Claude-Session: https://claude.ai/code/session_0199qUwKDP7RJD17yuiRZBeo
</commit_message>
<xml_diff>
--- a/games/last-deck-standing/Last Deck Standing Rules v1.docx
+++ b/games/last-deck-standing/Last Deck Standing Rules v1.docx
@@ -1527,7 +1527,7 @@
         <w:t xml:space="preserve">10</w:t>
       </w:r>
       <w:r>
-        <w:t xml:space="preserve"> with 5. Return the rest to the box unseen. Starting with the start player and going clockwise, take your top tile, turn it face up and place it. The first tile starts the board; each tile after that must touch at least one tile already placed. Keep going around the table until everyone has placed all their tiles.</w:t>
+        <w:t xml:space="preserve"> with 5. Return the rest to the box unseen. Starting with the start player and going clockwise, take your top tile, turn it face up and place it. The first tile starts the board; each tile after that must touch at least one tile already placed. Keep going around the table until everyone has placed all their tiles. Try to build a compact, roundish board; long snakes leave the storm nowhere to close in from.</w:t>
       </w:r>
     </w:p>
     <w:p>
@@ -1729,7 +1729,7 @@
         <w:t xml:space="preserve">Draw:</w:t>
       </w:r>
       <w:r>
-        <w:t xml:space="preserve"> draw until you have 5 cards in hand. Held cards and Dead cards count toward the 5. (You end each turn with 3 cards or fewer, so you always draw at least 2.) If your draw pile runs out, shuffle your discard pile to make a new one and keep drawing. If both are empty, stop drawing.</w:t>
+        <w:t xml:space="preserve"> draw until you have 5 cards in hand. Held cards and Dead cards count toward the 5. (You end each turn with 3 cards or fewer, so you always draw at least 2 unless your deck and discard pile both run out.) If your draw pile runs out, shuffle your discard pile to make a new one and keep drawing. If both are empty, stop drawing.</w:t>
       </w:r>
     </w:p>
     <w:p>
@@ -1916,7 +1916,7 @@
         <w:t xml:space="preserve">Then discard down to 3 cards.</w:t>
       </w:r>
       <w:r>
-        <w:t xml:space="preserve"> You choose which unplayed cards to keep. Dead cards can't be discarded and count toward the 3. Any card you put into play counts as played, even if you didn't use all of its value.</w:t>
+        <w:t xml:space="preserve"> You choose which unplayed cards to keep. Dead cards can't be discarded and count toward the 3.</w:t>
       </w:r>
     </w:p>
     <w:p>
@@ -2224,7 +2224,7 @@
                 <w:sz w:val="20"/>
                 <w:szCs w:val="20"/>
               </w:rPr>
-              <w:t xml:space="preserve">Choose one mode for its whole value when you play it. </w:t>
+              <w:t xml:space="preserve">Choose one mode for its whole value when you play it. Unused value is lost. </w:t>
             </w:r>
             <w:r>
               <w:rPr>
@@ -2279,6 +2279,14 @@
     </w:p>
     <w:p>
       <w:pPr>
+        <w:spacing w:after="120"/>
+      </w:pPr>
+      <w:r>
+        <w:t xml:space="preserve">Any card you put into play counts as played, even if you didn't use all of its value.</w:t>
+      </w:r>
+    </w:p>
+    <w:p>
+      <w:pPr>
         <w:pStyle w:val="Heading1"/>
       </w:pPr>
       <w:r>
@@ -2290,7 +2298,7 @@
         <w:spacing w:after="120"/>
       </w:pPr>
       <w:r>
-        <w:t xml:space="preserve">Not used in the base game yet; try them after a few games without. Each character card gives you one ability for the whole game.</w:t>
+        <w:t xml:space="preserve">Not used in the base game yet; try them after a few games without. Each character card gives you one ability for the whole game. Stats that start at 2 can still be upgraded to the maximum of 4.</w:t>
       </w:r>
     </w:p>
     <w:tbl>
@@ -2438,7 +2446,7 @@
                 <w:sz w:val="20"/>
                 <w:szCs w:val="20"/>
               </w:rPr>
-              <w:t xml:space="preserve"> your attacks deal +1 damage to a player on your own tile.</w:t>
+              <w:t xml:space="preserve"> when you attack a player on your own tile, add 1 damage (before their Shield).</w:t>
             </w:r>
           </w:p>
         </w:tc>
@@ -2509,7 +2517,7 @@
                 <w:sz w:val="20"/>
                 <w:szCs w:val="20"/>
               </w:rPr>
-              <w:t xml:space="preserve"> your attacks deal +1 damage to a player who isn't on your tile.</w:t>
+              <w:t xml:space="preserve"> when you attack a player who isn't on your tile and they're in range, add 1 damage (before their Shield). It can't bring an out-of-range player into range.</w:t>
             </w:r>
           </w:p>
         </w:tc>
@@ -2580,7 +2588,21 @@
                 <w:sz w:val="20"/>
                 <w:szCs w:val="20"/>
               </w:rPr>
-              <w:t xml:space="preserve"> you may loot twice per turn.</w:t>
+              <w:t xml:space="preserve"> after your normal loot, you may take 1 more </w:t>
+            </w:r>
+            <w:r>
+              <w:rPr>
+                <w:sz w:val="20"/>
+                <w:szCs w:val="20"/>
+              </w:rPr>
+              <w:t xml:space="preserve">cube</w:t>
+            </w:r>
+            <w:r>
+              <w:rPr>
+                <w:sz w:val="20"/>
+                <w:szCs w:val="20"/>
+              </w:rPr>
+              <w:t xml:space="preserve"> from the same tile.</w:t>
             </w:r>
           </w:p>
         </w:tc>
@@ -2722,7 +2744,7 @@
                 <w:sz w:val="20"/>
                 <w:szCs w:val="20"/>
               </w:rPr>
-              <w:t xml:space="preserve"> your Base Move starts at 2, and each Heal card you use to heal removes 2 extra Dead cards.</w:t>
+              <w:t xml:space="preserve"> your Base Move starts at 2, and each Heal card you use to heal removes up to 2 extra Dead cards from your hand.</w:t>
             </w:r>
           </w:p>
         </w:tc>
@@ -2793,7 +2815,7 @@
                 <w:sz w:val="20"/>
                 <w:szCs w:val="20"/>
               </w:rPr>
-              <w:t xml:space="preserve"> you take 1 less storm damage.</w:t>
+              <w:t xml:space="preserve"> you take 1 less storm damage (so none in rounds 1–6).</w:t>
             </w:r>
           </w:p>
         </w:tc>
@@ -2864,7 +2886,7 @@
                 <w:sz w:val="20"/>
                 <w:szCs w:val="20"/>
               </w:rPr>
-              <w:t xml:space="preserve"> when your attack puts 2 or more Dead cards on a player, return 1 Dead card from your hand to the supply.</w:t>
+              <w:t xml:space="preserve"> when your attack puts 2 or more Dead cards on a player after their Shield, return 1 Dead card from your hand to the supply.</w:t>
             </w:r>
           </w:p>
         </w:tc>
@@ -2935,7 +2957,7 @@
                 <w:sz w:val="20"/>
                 <w:szCs w:val="20"/>
               </w:rPr>
-              <w:t xml:space="preserve"> you start the game with 1 Shield point (it doesn't refill at upkeep).</w:t>
+              <w:t xml:space="preserve"> you start the game with 1 Shield point. Your Base Shield is still 0.</w:t>
             </w:r>
           </w:p>
         </w:tc>
@@ -3077,7 +3099,7 @@
                 <w:sz w:val="20"/>
                 <w:szCs w:val="20"/>
               </w:rPr>
-              <w:t xml:space="preserve"> your first upgrade costs 3 instead of 4.</w:t>
+              <w:t xml:space="preserve"> your first upgrade of the game costs 3 instead of 4.</w:t>
             </w:r>
           </w:p>
         </w:tc>
@@ -3216,7 +3238,17 @@
         <w:spacing w:after="120"/>
       </w:pPr>
       <w:r>
-        <w:t xml:space="preserve">Once per turn, you may take 1 cube from the tile you're on, make one claim on a loot pile there (see Elimination; if there are several piles, pick one), or take 1 card from a supply drop there (see Supply Drops). Only one of these per turn. Return the cube to the general supply and gain a card of that type (Move cube → Movement deck, Attack → Attack deck, Heal → Heal deck). Choose either:</w:t>
+        <w:t xml:space="preserve">Once per turn, you may do </w:t>
+      </w:r>
+      <w:r>
+        <w:rPr>
+          <w:b/>
+          <w:bCs/>
+        </w:rPr>
+        <w:t xml:space="preserve">one</w:t>
+      </w:r>
+      <w:r>
+        <w:t xml:space="preserve"> of these on the tile you're on:</w:t>
       </w:r>
     </w:p>
     <w:p>
@@ -3228,6 +3260,57 @@
         </w:numPr>
       </w:pPr>
       <w:r>
+        <w:t xml:space="preserve">take 1 loot cube (below),</w:t>
+      </w:r>
+    </w:p>
+    <w:p>
+      <w:pPr>
+        <w:pStyle w:val="ListParagraph"/>
+        <w:numPr>
+          <w:ilvl w:val="0"/>
+          <w:numId w:val="2"/>
+        </w:numPr>
+      </w:pPr>
+      <w:r>
+        <w:t xml:space="preserve">make one claim on a loot pile (see Elimination; if there are several piles, pick one), or</w:t>
+      </w:r>
+    </w:p>
+    <w:p>
+      <w:pPr>
+        <w:pStyle w:val="ListParagraph"/>
+        <w:numPr>
+          <w:ilvl w:val="0"/>
+          <w:numId w:val="2"/>
+        </w:numPr>
+      </w:pPr>
+      <w:r>
+        <w:t xml:space="preserve">take 1 card from a supply drop (see Supply Drops).</w:t>
+      </w:r>
+    </w:p>
+    <w:p>
+      <w:pPr>
+        <w:spacing w:after="120"/>
+      </w:pPr>
+      <w:r>
+        <w:rPr>
+          <w:b/>
+          <w:bCs/>
+        </w:rPr>
+        <w:t xml:space="preserve">Looting a cube:</w:t>
+      </w:r>
+      <w:r>
+        <w:t xml:space="preserve"> return the cube to the general supply and gain a card of that type (Move cube → Movement deck, Attack → Attack deck, Heal → Heal deck). Choose either:</w:t>
+      </w:r>
+    </w:p>
+    <w:p>
+      <w:pPr>
+        <w:pStyle w:val="ListParagraph"/>
+        <w:numPr>
+          <w:ilvl w:val="0"/>
+          <w:numId w:val="2"/>
+        </w:numPr>
+      </w:pPr>
+      <w:r>
         <w:rPr>
           <w:b/>
           <w:bCs/>
@@ -3275,7 +3358,7 @@
         <w:t xml:space="preserve">discard pile</w:t>
       </w:r>
       <w:r>
-        <w:t xml:space="preserve">. Cubes taken from tiles never come back. If a deck and its display slot are both empty, you can't loot that type.</w:t>
+        <w:t xml:space="preserve">. Cubes taken from tiles never come back. You can loot a type as long as any card of it is face up or left in its deck. If none are left, that type's cubes stay on the board unused.</w:t>
       </w:r>
     </w:p>
     <w:p>
@@ -3665,7 +3748,7 @@
         <w:t xml:space="preserve">Placing markers:</w:t>
       </w:r>
       <w:r>
-        <w:t xml:space="preserve"> put each marker on an unmarked tile that is on the edge of the board (at least one of its six sides has no tile next to it, including sides facing a hole) or touches a marked tile. You choose which. It doesn't matter what's on the tile: pawns, loot cubes and loot piles all stay. Once every tile is marked, stop placing markers.</w:t>
+        <w:t xml:space="preserve"> put each marker on an unmarked tile that is on the edge of the board (at least one of its six sides has no tile next to it, including sides facing a hole) or touches a marked tile. You choose which. It doesn't matter what's on the tile: pawns, loot cubes and loot piles all stay. Once every tile is marked, stop placing markers. From then on, everyone takes storm damage every turn: this is the endgame.</w:t>
       </w:r>
     </w:p>
     <w:p>
@@ -3690,7 +3773,7 @@
         <w:t xml:space="preserve">end your turn on a storm tile</w:t>
       </w:r>
       <w:r>
-        <w:t xml:space="preserve">, take the storm damage for this round as Dead cards into your discard pile. Shield does not block storm damage.</w:t>
+        <w:t xml:space="preserve">, take the storm damage for this round as Dead cards into your discard pile. Storm damage ignores Shield and doesn't use up any Shield points.</w:t>
       </w:r>
     </w:p>
     <w:p>
@@ -3745,7 +3828,7 @@
         <w:t xml:space="preserve">Who places it:</w:t>
       </w:r>
       <w:r>
-        <w:t xml:space="preserve"> the start player places the first drop, then placing passes clockwise to the next player still in the game.</w:t>
+        <w:t xml:space="preserve"> the start player places the first drop (or the next player clockwise still in the game, if the start player is out), then placing passes clockwise to the next player still in the game.</w:t>
       </w:r>
     </w:p>
     <w:p>
@@ -3774,7 +3857,7 @@
         <w:t xml:space="preserve">not a storm tile and not an edge tile</w:t>
       </w:r>
       <w:r>
-        <w:t xml:space="preserve">.</w:t>
+        <w:t xml:space="preserve">. If there is none, use any tile that isn't an edge tile; if there is none of those either, any tile.</w:t>
       </w:r>
     </w:p>
     <w:p>
@@ -3793,7 +3876,7 @@
         <w:t xml:space="preserve">Nudging:</w:t>
       </w:r>
       <w:r>
-        <w:t xml:space="preserve"> then each other player, clockwise, may move the drop 1 tile or pass.</w:t>
+        <w:t xml:space="preserve"> then each other player, clockwise, may move the drop 1 tile in any direction (onto any tile, storm or edge included) or pass.</w:t>
       </w:r>
     </w:p>
     <w:p>
@@ -3820,7 +3903,7 @@
         <w:spacing w:after="120"/>
       </w:pPr>
       <w:r>
-        <w:t xml:space="preserve">A drop can land on a storm tile, and storm markers can be placed on a drop's tile.</w:t>
+        <w:t xml:space="preserve">Once placed, a drop can end up on a storm tile through nudges or new storm markers; it stays there.</w:t>
       </w:r>
     </w:p>
     <w:p>

</xml_diff>

<commit_message>
Last Deck Standing: Fortnite rarity naming; gold deck becomes Legendary deck
Co-Authored-By: Claude Opus 5.5 <noreply@anthropic.com>
Claude-Session: https://claude.ai/code/session_0199qUwKDP7RJD17yuiRZBeo
</commit_message>
<xml_diff>
--- a/games/last-deck-standing/Last Deck Standing Rules v1.docx
+++ b/games/last-deck-standing/Last Deck Standing Rules v1.docx
@@ -1058,7 +1058,7 @@
                 <w:sz w:val="20"/>
                 <w:szCs w:val="20"/>
               </w:rPr>
-              <w:t xml:space="preserve">Gold deck</w:t>
+              <w:t xml:space="preserve">Legendary deck</w:t>
             </w:r>
           </w:p>
         </w:tc>
@@ -1458,7 +1458,7 @@
         <w:spacing w:after="120"/>
       </w:pPr>
       <w:r>
-        <w:t xml:space="preserve">Each card has a value from 1 to 3, which is its strength. Rarity color: value 1 gray, 2 blue, 3 purple.</w:t>
+        <w:t xml:space="preserve">Each card has a value from 1 to 3, which is its strength. Rarity follows Fortnite: value 1 Common (gray), 2 Rare (blue), 3 Epic (purple). Supply drop cards are Legendary (gold).</w:t>
       </w:r>
     </w:p>
     <w:p>
@@ -1592,7 +1592,7 @@
         </w:numPr>
       </w:pPr>
       <w:r>
-        <w:t xml:space="preserve">Shuffle the gold deck face down. Shuffle the three supply decks separately and place them face down. Turn the top </w:t>
+        <w:t xml:space="preserve">Shuffle the Legendary deck face down. Shuffle the three supply decks separately and place them face down. Turn the top </w:t>
       </w:r>
       <w:r>
         <w:rPr>
@@ -3847,7 +3847,7 @@
         <w:t xml:space="preserve">Placing:</w:t>
       </w:r>
       <w:r>
-        <w:t xml:space="preserve"> draw 2 gold cards face up and put them with the drop marker on any tile that is </w:t>
+        <w:t xml:space="preserve"> draw 2 Legendary cards face up and put them with the drop marker on any tile that is </w:t>
       </w:r>
       <w:r>
         <w:rPr>

</xml_diff>

<commit_message>
Last Deck Standing: Legendary deck 3/3/4/4; full-colour comic PnP alongside ink-saver
Co-Authored-By: Claude Opus 5.5 <noreply@anthropic.com>
Claude-Session: https://claude.ai/code/session_0199qUwKDP7RJD17yuiRZBeo
</commit_message>
<xml_diff>
--- a/games/last-deck-standing/Last Deck Standing Rules v1.docx
+++ b/games/last-deck-standing/Last Deck Standing Rules v1.docx
@@ -1110,7 +1110,7 @@
                 <w:sz w:val="20"/>
                 <w:szCs w:val="20"/>
               </w:rPr>
-              <w:t xml:space="preserve">For supply drops: 2 each of Attack 2, Attack 3, Move 2, Move 3, Heal 2, Heal 3</w:t>
+              <w:t xml:space="preserve">For supply drops: 2 each of Attack 3, Attack 4, Move 3, Move 4, Heal 3, Heal 4</w:t>
             </w:r>
           </w:p>
         </w:tc>
@@ -1458,7 +1458,7 @@
         <w:spacing w:after="120"/>
       </w:pPr>
       <w:r>
-        <w:t xml:space="preserve">Each card has a value from 1 to 3, which is its strength. Rarity follows Fortnite: value 1 Common (gray), 2 Rare (blue), 3 Epic (purple). Supply drop cards are Legendary (gold).</w:t>
+        <w:t xml:space="preserve">Each card has a value from 1 to 4, which is its strength (value 4 only appears on Legendary cards). Rarity follows Fortnite: value 1 Common (gray), 2 Rare (blue), 3 Epic (purple). Supply drop cards are Legendary (gold).</w:t>
       </w:r>
     </w:p>
     <w:p>

</xml_diff>

<commit_message>
Last Deck Standing: starting cards read Attack 1 / Move 1 / Heal 1; character nicknames as titles
Character cards show the nickname (The Brawler, ...) as the title with the
ability name in the character's colour and a CHARACTER label top-right.

Co-Authored-By: Claude Opus 5.5 <noreply@anthropic.com>
Claude-Session: https://claude.ai/code/session_0199qUwKDP7RJD17yuiRZBeo
</commit_message>
<xml_diff>
--- a/games/last-deck-standing/Last Deck Standing Rules v1.docx
+++ b/games/last-deck-standing/Last Deck Standing Rules v1.docx
@@ -371,7 +371,7 @@
                 <w:sz w:val="20"/>
                 <w:szCs w:val="20"/>
               </w:rPr>
-              <w:t xml:space="preserve">4 Strike (Attack 1), 3 Dash (Move 1), 3 Patch Up (Heal 1). Labelled Player 1–5 on the card's top band so decks don't mix</w:t>
+              <w:t xml:space="preserve">4 Attack 1, 3 Move 1, 3 Heal 1: the same as supply cards, but labelled Player 1–5 on the card's top band so decks don't mix</w:t>
             </w:r>
           </w:p>
         </w:tc>
@@ -1971,8 +1971,8 @@
         </w:tblBorders>
       </w:tblPr>
       <w:tblGrid>
-        <w:gridCol w:w="3255"/>
-        <w:gridCol w:w="6105"/>
+        <w:gridCol w:w="3854"/>
+        <w:gridCol w:w="5506"/>
       </w:tblGrid>
       <w:tr>
         <w:trPr>
@@ -1980,7 +1980,7 @@
         </w:trPr>
         <w:tc>
           <w:tcPr>
-            <w:tcW w:type="dxa" w:w="3255"/>
+            <w:tcW w:type="dxa" w:w="3854"/>
             <w:tcBorders>
               <w:top w:val="single" w:color="C9CCD6" w:sz="4"/>
               <w:left w:val="single" w:color="C9CCD6" w:sz="4"/>
@@ -2009,7 +2009,7 @@
         </w:tc>
         <w:tc>
           <w:tcPr>
-            <w:tcW w:type="dxa" w:w="6105"/>
+            <w:tcW w:type="dxa" w:w="5506"/>
             <w:tcBorders>
               <w:top w:val="single" w:color="C9CCD6" w:sz="4"/>
               <w:left w:val="single" w:color="C9CCD6" w:sz="4"/>
@@ -2043,7 +2043,7 @@
         </w:trPr>
         <w:tc>
           <w:tcPr>
-            <w:tcW w:type="dxa" w:w="3255"/>
+            <w:tcW w:type="dxa" w:w="3854"/>
             <w:tcBorders>
               <w:top w:val="single" w:color="C9CCD6" w:sz="4"/>
               <w:left w:val="single" w:color="C9CCD6" w:sz="4"/>
@@ -2070,13 +2070,13 @@
                 <w:sz w:val="20"/>
                 <w:szCs w:val="20"/>
               </w:rPr>
-              <w:t xml:space="preserve"> (Dash, Movement deck)</w:t>
-            </w:r>
-          </w:p>
-        </w:tc>
-        <w:tc>
-          <w:tcPr>
-            <w:tcW w:type="dxa" w:w="6105"/>
+              <w:t xml:space="preserve"> (starting deck and Movement deck)</w:t>
+            </w:r>
+          </w:p>
+        </w:tc>
+        <w:tc>
+          <w:tcPr>
+            <w:tcW w:type="dxa" w:w="5506"/>
             <w:tcBorders>
               <w:top w:val="single" w:color="C9CCD6" w:sz="4"/>
               <w:left w:val="single" w:color="C9CCD6" w:sz="4"/>
@@ -2107,7 +2107,7 @@
         </w:trPr>
         <w:tc>
           <w:tcPr>
-            <w:tcW w:type="dxa" w:w="3255"/>
+            <w:tcW w:type="dxa" w:w="3854"/>
             <w:tcBorders>
               <w:top w:val="single" w:color="C9CCD6" w:sz="4"/>
               <w:left w:val="single" w:color="C9CCD6" w:sz="4"/>
@@ -2134,13 +2134,13 @@
                 <w:sz w:val="20"/>
                 <w:szCs w:val="20"/>
               </w:rPr>
-              <w:t xml:space="preserve"> (Strike, Attack deck)</w:t>
-            </w:r>
-          </w:p>
-        </w:tc>
-        <w:tc>
-          <w:tcPr>
-            <w:tcW w:type="dxa" w:w="6105"/>
+              <w:t xml:space="preserve"> (starting deck and Attack deck)</w:t>
+            </w:r>
+          </w:p>
+        </w:tc>
+        <w:tc>
+          <w:tcPr>
+            <w:tcW w:type="dxa" w:w="5506"/>
             <w:tcBorders>
               <w:top w:val="single" w:color="C9CCD6" w:sz="4"/>
               <w:left w:val="single" w:color="C9CCD6" w:sz="4"/>
@@ -2171,7 +2171,7 @@
         </w:trPr>
         <w:tc>
           <w:tcPr>
-            <w:tcW w:type="dxa" w:w="3255"/>
+            <w:tcW w:type="dxa" w:w="3854"/>
             <w:tcBorders>
               <w:top w:val="single" w:color="C9CCD6" w:sz="4"/>
               <w:left w:val="single" w:color="C9CCD6" w:sz="4"/>
@@ -2198,13 +2198,13 @@
                 <w:sz w:val="20"/>
                 <w:szCs w:val="20"/>
               </w:rPr>
-              <w:t xml:space="preserve"> (Patch Up, Heal deck)</w:t>
-            </w:r>
-          </w:p>
-        </w:tc>
-        <w:tc>
-          <w:tcPr>
-            <w:tcW w:type="dxa" w:w="6105"/>
+              <w:t xml:space="preserve"> (starting deck and Heal deck)</w:t>
+            </w:r>
+          </w:p>
+        </w:tc>
+        <w:tc>
+          <w:tcPr>
+            <w:tcW w:type="dxa" w:w="5506"/>
             <w:tcBorders>
               <w:top w:val="single" w:color="C9CCD6" w:sz="4"/>
               <w:left w:val="single" w:color="C9CCD6" w:sz="4"/>
@@ -2314,8 +2314,8 @@
         </w:tblBorders>
       </w:tblPr>
       <w:tblGrid>
-        <w:gridCol w:w="1666"/>
-        <w:gridCol w:w="7694"/>
+        <w:gridCol w:w="2511"/>
+        <w:gridCol w:w="6849"/>
       </w:tblGrid>
       <w:tr>
         <w:trPr>
@@ -2323,7 +2323,7 @@
         </w:trPr>
         <w:tc>
           <w:tcPr>
-            <w:tcW w:type="dxa" w:w="1666"/>
+            <w:tcW w:type="dxa" w:w="2511"/>
             <w:tcBorders>
               <w:top w:val="single" w:color="C9CCD6" w:sz="4"/>
               <w:left w:val="single" w:color="C9CCD6" w:sz="4"/>
@@ -2352,7 +2352,7 @@
         </w:tc>
         <w:tc>
           <w:tcPr>
-            <w:tcW w:type="dxa" w:w="7694"/>
+            <w:tcW w:type="dxa" w:w="6849"/>
             <w:tcBorders>
               <w:top w:val="single" w:color="C9CCD6" w:sz="4"/>
               <w:left w:val="single" w:color="C9CCD6" w:sz="4"/>
@@ -2386,7 +2386,7 @@
         </w:trPr>
         <w:tc>
           <w:tcPr>
-            <w:tcW w:type="dxa" w:w="1666"/>
+            <w:tcW w:type="dxa" w:w="2511"/>
             <w:tcBorders>
               <w:top w:val="single" w:color="C9CCD6" w:sz="4"/>
               <w:left w:val="single" w:color="C9CCD6" w:sz="4"/>
@@ -2413,13 +2413,13 @@
                 <w:sz w:val="20"/>
                 <w:szCs w:val="20"/>
               </w:rPr>
-              <w:t xml:space="preserve">Blaze</w:t>
-            </w:r>
-          </w:p>
-        </w:tc>
-        <w:tc>
-          <w:tcPr>
-            <w:tcW w:type="dxa" w:w="7694"/>
+              <w:t xml:space="preserve">The Brawler</w:t>
+            </w:r>
+          </w:p>
+        </w:tc>
+        <w:tc>
+          <w:tcPr>
+            <w:tcW w:type="dxa" w:w="6849"/>
             <w:tcBorders>
               <w:top w:val="single" w:color="C9CCD6" w:sz="4"/>
               <w:left w:val="single" w:color="C9CCD6" w:sz="4"/>
@@ -2457,7 +2457,7 @@
         </w:trPr>
         <w:tc>
           <w:tcPr>
-            <w:tcW w:type="dxa" w:w="1666"/>
+            <w:tcW w:type="dxa" w:w="2511"/>
             <w:tcBorders>
               <w:top w:val="single" w:color="C9CCD6" w:sz="4"/>
               <w:left w:val="single" w:color="C9CCD6" w:sz="4"/>
@@ -2484,13 +2484,13 @@
                 <w:sz w:val="20"/>
                 <w:szCs w:val="20"/>
               </w:rPr>
-              <w:t xml:space="preserve">Shade</w:t>
-            </w:r>
-          </w:p>
-        </w:tc>
-        <w:tc>
-          <w:tcPr>
-            <w:tcW w:type="dxa" w:w="7694"/>
+              <w:t xml:space="preserve">The Sniper</w:t>
+            </w:r>
+          </w:p>
+        </w:tc>
+        <w:tc>
+          <w:tcPr>
+            <w:tcW w:type="dxa" w:w="6849"/>
             <w:tcBorders>
               <w:top w:val="single" w:color="C9CCD6" w:sz="4"/>
               <w:left w:val="single" w:color="C9CCD6" w:sz="4"/>
@@ -2528,7 +2528,7 @@
         </w:trPr>
         <w:tc>
           <w:tcPr>
-            <w:tcW w:type="dxa" w:w="1666"/>
+            <w:tcW w:type="dxa" w:w="2511"/>
             <w:tcBorders>
               <w:top w:val="single" w:color="C9CCD6" w:sz="4"/>
               <w:left w:val="single" w:color="C9CCD6" w:sz="4"/>
@@ -2555,13 +2555,13 @@
                 <w:sz w:val="20"/>
                 <w:szCs w:val="20"/>
               </w:rPr>
-              <w:t xml:space="preserve">Ember</w:t>
-            </w:r>
-          </w:p>
-        </w:tc>
-        <w:tc>
-          <w:tcPr>
-            <w:tcW w:type="dxa" w:w="7694"/>
+              <w:t xml:space="preserve">The Scavenger</w:t>
+            </w:r>
+          </w:p>
+        </w:tc>
+        <w:tc>
+          <w:tcPr>
+            <w:tcW w:type="dxa" w:w="6849"/>
             <w:tcBorders>
               <w:top w:val="single" w:color="C9CCD6" w:sz="4"/>
               <w:left w:val="single" w:color="C9CCD6" w:sz="4"/>
@@ -2613,7 +2613,7 @@
         </w:trPr>
         <w:tc>
           <w:tcPr>
-            <w:tcW w:type="dxa" w:w="1666"/>
+            <w:tcW w:type="dxa" w:w="2511"/>
             <w:tcBorders>
               <w:top w:val="single" w:color="C9CCD6" w:sz="4"/>
               <w:left w:val="single" w:color="C9CCD6" w:sz="4"/>
@@ -2640,13 +2640,13 @@
                 <w:sz w:val="20"/>
                 <w:szCs w:val="20"/>
               </w:rPr>
-              <w:t xml:space="preserve">Tide</w:t>
-            </w:r>
-          </w:p>
-        </w:tc>
-        <w:tc>
-          <w:tcPr>
-            <w:tcW w:type="dxa" w:w="7694"/>
+              <w:t xml:space="preserve">The Runner</w:t>
+            </w:r>
+          </w:p>
+        </w:tc>
+        <w:tc>
+          <w:tcPr>
+            <w:tcW w:type="dxa" w:w="6849"/>
             <w:tcBorders>
               <w:top w:val="single" w:color="C9CCD6" w:sz="4"/>
               <w:left w:val="single" w:color="C9CCD6" w:sz="4"/>
@@ -2684,7 +2684,7 @@
         </w:trPr>
         <w:tc>
           <w:tcPr>
-            <w:tcW w:type="dxa" w:w="1666"/>
+            <w:tcW w:type="dxa" w:w="2511"/>
             <w:tcBorders>
               <w:top w:val="single" w:color="C9CCD6" w:sz="4"/>
               <w:left w:val="single" w:color="C9CCD6" w:sz="4"/>
@@ -2711,13 +2711,13 @@
                 <w:sz w:val="20"/>
                 <w:szCs w:val="20"/>
               </w:rPr>
-              <w:t xml:space="preserve">Nova</w:t>
-            </w:r>
-          </w:p>
-        </w:tc>
-        <w:tc>
-          <w:tcPr>
-            <w:tcW w:type="dxa" w:w="7694"/>
+              <w:t xml:space="preserve">The Medic</w:t>
+            </w:r>
+          </w:p>
+        </w:tc>
+        <w:tc>
+          <w:tcPr>
+            <w:tcW w:type="dxa" w:w="6849"/>
             <w:tcBorders>
               <w:top w:val="single" w:color="C9CCD6" w:sz="4"/>
               <w:left w:val="single" w:color="C9CCD6" w:sz="4"/>
@@ -2755,7 +2755,7 @@
         </w:trPr>
         <w:tc>
           <w:tcPr>
-            <w:tcW w:type="dxa" w:w="1666"/>
+            <w:tcW w:type="dxa" w:w="2511"/>
             <w:tcBorders>
               <w:top w:val="single" w:color="C9CCD6" w:sz="4"/>
               <w:left w:val="single" w:color="C9CCD6" w:sz="4"/>
@@ -2782,13 +2782,13 @@
                 <w:sz w:val="20"/>
                 <w:szCs w:val="20"/>
               </w:rPr>
-              <w:t xml:space="preserve">Gale</w:t>
-            </w:r>
-          </w:p>
-        </w:tc>
-        <w:tc>
-          <w:tcPr>
-            <w:tcW w:type="dxa" w:w="7694"/>
+              <w:t xml:space="preserve">The Storm Chaser</w:t>
+            </w:r>
+          </w:p>
+        </w:tc>
+        <w:tc>
+          <w:tcPr>
+            <w:tcW w:type="dxa" w:w="6849"/>
             <w:tcBorders>
               <w:top w:val="single" w:color="C9CCD6" w:sz="4"/>
               <w:left w:val="single" w:color="C9CCD6" w:sz="4"/>
@@ -2826,7 +2826,7 @@
         </w:trPr>
         <w:tc>
           <w:tcPr>
-            <w:tcW w:type="dxa" w:w="1666"/>
+            <w:tcW w:type="dxa" w:w="2511"/>
             <w:tcBorders>
               <w:top w:val="single" w:color="C9CCD6" w:sz="4"/>
               <w:left w:val="single" w:color="C9CCD6" w:sz="4"/>
@@ -2853,13 +2853,13 @@
                 <w:sz w:val="20"/>
                 <w:szCs w:val="20"/>
               </w:rPr>
-              <w:t xml:space="preserve">Vex</w:t>
-            </w:r>
-          </w:p>
-        </w:tc>
-        <w:tc>
-          <w:tcPr>
-            <w:tcW w:type="dxa" w:w="7694"/>
+              <w:t xml:space="preserve">The Leech</w:t>
+            </w:r>
+          </w:p>
+        </w:tc>
+        <w:tc>
+          <w:tcPr>
+            <w:tcW w:type="dxa" w:w="6849"/>
             <w:tcBorders>
               <w:top w:val="single" w:color="C9CCD6" w:sz="4"/>
               <w:left w:val="single" w:color="C9CCD6" w:sz="4"/>
@@ -2897,7 +2897,7 @@
         </w:trPr>
         <w:tc>
           <w:tcPr>
-            <w:tcW w:type="dxa" w:w="1666"/>
+            <w:tcW w:type="dxa" w:w="2511"/>
             <w:tcBorders>
               <w:top w:val="single" w:color="C9CCD6" w:sz="4"/>
               <w:left w:val="single" w:color="C9CCD6" w:sz="4"/>
@@ -2924,13 +2924,13 @@
                 <w:sz w:val="20"/>
                 <w:szCs w:val="20"/>
               </w:rPr>
-              <w:t xml:space="preserve">Bastion</w:t>
-            </w:r>
-          </w:p>
-        </w:tc>
-        <w:tc>
-          <w:tcPr>
-            <w:tcW w:type="dxa" w:w="7694"/>
+              <w:t xml:space="preserve">The Tank</w:t>
+            </w:r>
+          </w:p>
+        </w:tc>
+        <w:tc>
+          <w:tcPr>
+            <w:tcW w:type="dxa" w:w="6849"/>
             <w:tcBorders>
               <w:top w:val="single" w:color="C9CCD6" w:sz="4"/>
               <w:left w:val="single" w:color="C9CCD6" w:sz="4"/>
@@ -2968,7 +2968,7 @@
         </w:trPr>
         <w:tc>
           <w:tcPr>
-            <w:tcW w:type="dxa" w:w="1666"/>
+            <w:tcW w:type="dxa" w:w="2511"/>
             <w:tcBorders>
               <w:top w:val="single" w:color="C9CCD6" w:sz="4"/>
               <w:left w:val="single" w:color="C9CCD6" w:sz="4"/>
@@ -2995,13 +2995,13 @@
                 <w:sz w:val="20"/>
                 <w:szCs w:val="20"/>
               </w:rPr>
-              <w:t xml:space="preserve">Brute</w:t>
-            </w:r>
-          </w:p>
-        </w:tc>
-        <w:tc>
-          <w:tcPr>
-            <w:tcW w:type="dxa" w:w="7694"/>
+              <w:t xml:space="preserve">The Heavy</w:t>
+            </w:r>
+          </w:p>
+        </w:tc>
+        <w:tc>
+          <w:tcPr>
+            <w:tcW w:type="dxa" w:w="6849"/>
             <w:tcBorders>
               <w:top w:val="single" w:color="C9CCD6" w:sz="4"/>
               <w:left w:val="single" w:color="C9CCD6" w:sz="4"/>
@@ -3039,7 +3039,7 @@
         </w:trPr>
         <w:tc>
           <w:tcPr>
-            <w:tcW w:type="dxa" w:w="1666"/>
+            <w:tcW w:type="dxa" w:w="2511"/>
             <w:tcBorders>
               <w:top w:val="single" w:color="C9CCD6" w:sz="4"/>
               <w:left w:val="single" w:color="C9CCD6" w:sz="4"/>
@@ -3066,13 +3066,13 @@
                 <w:sz w:val="20"/>
                 <w:szCs w:val="20"/>
               </w:rPr>
-              <w:t xml:space="preserve">Rig</w:t>
-            </w:r>
-          </w:p>
-        </w:tc>
-        <w:tc>
-          <w:tcPr>
-            <w:tcW w:type="dxa" w:w="7694"/>
+              <w:t xml:space="preserve">The Mechanic</w:t>
+            </w:r>
+          </w:p>
+        </w:tc>
+        <w:tc>
+          <w:tcPr>
+            <w:tcW w:type="dxa" w:w="6849"/>
             <w:tcBorders>
               <w:top w:val="single" w:color="C9CCD6" w:sz="4"/>
               <w:left w:val="single" w:color="C9CCD6" w:sz="4"/>

</xml_diff>

<commit_message>
Last Deck Standing: Mechanic, Tank and Medic tweaks (SIM-023)
Mechanic: all upgrades cost 3. Tank: Base Shield 1, upgrades cost 5.
Medic: heal +2 and Heal cards go to the discard pile (no more Base Move 2).

Co-Authored-By: Claude Opus 5.5 <noreply@anthropic.com>
Claude-Session: https://claude.ai/code/session_0199qUwKDP7RJD17yuiRZBeo
</commit_message>
<xml_diff>
--- a/games/last-deck-standing/Last Deck Standing Rules v1.docx
+++ b/games/last-deck-standing/Last Deck Standing Rules v1.docx
@@ -2744,7 +2744,7 @@
                 <w:sz w:val="20"/>
                 <w:szCs w:val="20"/>
               </w:rPr>
-              <w:t xml:space="preserve"> your Base Move starts at 2, and each Heal card you use to heal removes up to 2 extra Dead cards from your hand.</w:t>
+              <w:t xml:space="preserve"> each Heal card you use to heal removes up to 2 extra Dead cards from your hand, and goes to your discard pile instead of leaving the game.</w:t>
             </w:r>
           </w:p>
         </w:tc>
@@ -2957,7 +2957,7 @@
                 <w:sz w:val="20"/>
                 <w:szCs w:val="20"/>
               </w:rPr>
-              <w:t xml:space="preserve"> you start the game with 1 Shield point. Your Base Shield is still 0.</w:t>
+              <w:t xml:space="preserve"> your Base Shield starts at 1, but your upgrades cost 5 instead of 4.</w:t>
             </w:r>
           </w:p>
         </w:tc>
@@ -3099,7 +3099,7 @@
                 <w:sz w:val="20"/>
                 <w:szCs w:val="20"/>
               </w:rPr>
-              <w:t xml:space="preserve"> your first upgrade of the game costs 3 instead of 4.</w:t>
+              <w:t xml:space="preserve"> your upgrades cost 3 instead of 4.</w:t>
             </w:r>
           </w:p>
         </w:tc>

</xml_diff>

<commit_message>
Last Deck Standing: READTHROUGH-005 wording fixes
Co-Authored-By: Claude Opus 5.5 <noreply@anthropic.com>
Claude-Session: https://claude.ai/code/session_0199qUwKDP7RJD17yuiRZBeo
</commit_message>
<xml_diff>
--- a/games/last-deck-standing/Last Deck Standing Rules v1.docx
+++ b/games/last-deck-standing/Last Deck Standing Rules v1.docx
@@ -1729,7 +1729,7 @@
         <w:t xml:space="preserve">Draw:</w:t>
       </w:r>
       <w:r>
-        <w:t xml:space="preserve"> draw until you have 5 cards in hand. Held cards and Dead cards count toward the 5. (You end each turn with 3 cards or fewer, so you always draw at least 2 unless your deck and discard pile both run out.) If your draw pile runs out, shuffle your discard pile to make a new one and keep drawing. If both are empty, stop drawing.</w:t>
+        <w:t xml:space="preserve"> draw until you have 5 cards in hand. Cards you kept from last turn and Dead cards count toward the 5. (You end each turn with 3 cards or fewer, so you always draw at least 2 unless your deck and discard pile both run out.) If your draw pile runs out, shuffle your discard pile to make a new one and keep drawing. If both are empty, stop drawing.</w:t>
       </w:r>
     </w:p>
     <w:p>
@@ -1802,7 +1802,7 @@
         <w:t xml:space="preserve">Move</w:t>
       </w:r>
       <w:r>
-        <w:t xml:space="preserve"> up to your total Move: Base Move plus the Move cards you played this turn. You may move some before playing cards and the rest after.</w:t>
+        <w:t xml:space="preserve"> up to your total Move: Base Move plus the Move cards you played this turn. Each point of Move takes your pawn to an adjacent tile; you can't cross a gap where there's no tile. Any number of pawns may share a tile. You may move some before playing cards and the rest after.</w:t>
       </w:r>
     </w:p>
     <w:p>
@@ -1916,7 +1916,7 @@
         <w:t xml:space="preserve">Then discard down to 3 cards.</w:t>
       </w:r>
       <w:r>
-        <w:t xml:space="preserve"> You choose which unplayed cards to keep. Dead cards can't be discarded and count toward the 3.</w:t>
+        <w:t xml:space="preserve"> You choose which unplayed cards to keep, and you may keep fewer. Dead cards can't be discarded and count toward the 3.</w:t>
       </w:r>
     </w:p>
     <w:p>
@@ -2744,7 +2744,21 @@
                 <w:sz w:val="20"/>
                 <w:szCs w:val="20"/>
               </w:rPr>
-              <w:t xml:space="preserve"> each Heal card you use to heal removes up to 2 extra Dead cards from your hand, and goes to your discard pile instead of leaving the game.</w:t>
+              <w:t xml:space="preserve"> each Heal card you use to heal removes up to its value </w:t>
+            </w:r>
+            <w:r>
+              <w:rPr>
+                <w:sz w:val="20"/>
+                <w:szCs w:val="20"/>
+              </w:rPr>
+              <w:t xml:space="preserve">+2</w:t>
+            </w:r>
+            <w:r>
+              <w:rPr>
+                <w:sz w:val="20"/>
+                <w:szCs w:val="20"/>
+              </w:rPr>
+              <w:t xml:space="preserve"> Dead cards from your hand, then goes to your discard pile with your other played cards instead of leaving the game.</w:t>
             </w:r>
           </w:p>
         </w:tc>
@@ -2957,7 +2971,7 @@
                 <w:sz w:val="20"/>
                 <w:szCs w:val="20"/>
               </w:rPr>
-              <w:t xml:space="preserve"> your Base Shield starts at 1, but your upgrades cost 5 instead of 4.</w:t>
+              <w:t xml:space="preserve"> your Base Shield starts at 1, but all your upgrades (any stat) cost 5 instead of 4.</w:t>
             </w:r>
           </w:p>
         </w:tc>
@@ -3374,7 +3388,17 @@
         <w:spacing w:after="120"/>
       </w:pPr>
       <w:r>
-        <w:t xml:space="preserve">During your Actions phase, pay cards from your hand of one type with a total value of </w:t>
+        <w:t xml:space="preserve">During your Actions phase, pay cards from your hand of one type worth at least your </w:t>
+      </w:r>
+      <w:r>
+        <w:rPr>
+          <w:b/>
+          <w:bCs/>
+        </w:rPr>
+        <w:t xml:space="preserve">upgrade cost</w:t>
+      </w:r>
+      <w:r>
+        <w:t xml:space="preserve"> (normally </w:t>
       </w:r>
       <w:r>
         <w:rPr>
@@ -3384,7 +3408,7 @@
         <w:t xml:space="preserve">4</w:t>
       </w:r>
       <w:r>
-        <w:t xml:space="preserve"> or more to raise that stat by 1:</w:t>
+        <w:t xml:space="preserve">) to raise that stat by 1:</w:t>
       </w:r>
     </w:p>
     <w:p>
@@ -3436,7 +3460,7 @@
         <w:spacing w:after="120"/>
       </w:pPr>
       <w:r>
-        <w:t xml:space="preserve">Paid cards go to your discard pile, not out of the game; they come back when you reshuffle. Cards you pay with can't also be played this turn and add nothing to your Move, Attack or Shield. You may overpay, but extra value above 4 is lost. Each stat maxes out at 4.</w:t>
+        <w:t xml:space="preserve">Paid cards go to your discard pile, not out of the game; they come back when you reshuffle. Cards you pay with can't also be played this turn and add nothing to your Move, Attack or Shield. You may overpay, but extra value is lost. Each stat maxes out at 4; you can't upgrade a stat that's already 4.</w:t>
       </w:r>
     </w:p>
     <w:p>
@@ -3748,7 +3772,7 @@
         <w:t xml:space="preserve">Placing markers:</w:t>
       </w:r>
       <w:r>
-        <w:t xml:space="preserve"> put each marker on an unmarked tile that is on the edge of the board (at least one of its six sides has no tile next to it, including sides facing a hole) or touches a marked tile. You choose which. It doesn't matter what's on the tile: pawns, loot cubes and loot piles all stay. Once every tile is marked, stop placing markers. From then on, everyone takes storm damage every turn: this is the endgame.</w:t>
+        <w:t xml:space="preserve"> you choose where each marker goes, and you may use them to cut off opponents. Put each marker on an unmarked tile that is on the edge of the board (at least one of its six sides has no tile next to it, including sides facing a hole) or touches a marked tile. You choose which. It doesn't matter what's on the tile: pawns, loot cubes and loot piles all stay. Once every tile is marked, stop placing markers. From then on, everyone takes storm damage every turn: this is the endgame.</w:t>
       </w:r>
     </w:p>
     <w:p>
@@ -3828,7 +3852,7 @@
         <w:t xml:space="preserve">Who places it:</w:t>
       </w:r>
       <w:r>
-        <w:t xml:space="preserve"> the start player places the first drop (or the next player clockwise still in the game, if the start player is out), then placing passes clockwise to the next player still in the game.</w:t>
+        <w:t xml:space="preserve"> the start player places the first drop (or the next player clockwise still in the game, if the start player is out), then each later drop is placed by the next player still in the game clockwise from whoever placed the previous one. Placing and all nudges happen before the start player's upkeep.</w:t>
       </w:r>
     </w:p>
     <w:p>
@@ -4543,7 +4567,7 @@
         <w:t xml:space="preserve">Upgrade:</w:t>
       </w:r>
       <w:r>
-        <w:t xml:space="preserve"> pay 4+ value of one type from hand → +1 stat (max 4); paid cards go to discard</w:t>
+        <w:t xml:space="preserve"> pay your upgrade cost (normally 4) in value of one type from hand → +1 stat (max 4); paid cards go to discard</w:t>
       </w:r>
     </w:p>
     <w:p>

</xml_diff>

<commit_message>
Last Deck Standing: First Game learning rules box (SIM-024)
Co-Authored-By: Claude Opus 5.5 <noreply@anthropic.com>
Claude-Session: https://claude.ai/code/session_0199qUwKDP7RJD17yuiRZBeo
</commit_message>
<xml_diff>
--- a/games/last-deck-standing/Last Deck Standing Rules v1.docx
+++ b/games/last-deck-standing/Last Deck Standing Rules v1.docx
@@ -91,6 +91,457 @@
       </w:r>
       <w:r>
         <w:t xml:space="preserve"> if you end your turn with 3 or more Dead cards in your hand. Dead cards stay in your hand until you heal them, so every hit also slows you down.</w:t>
+      </w:r>
+    </w:p>
+    <w:p>
+      <w:pPr>
+        <w:pStyle w:val="Heading1"/>
+      </w:pPr>
+      <w:r>
+        <w:t xml:space="preserve">First Game (learning rules)</w:t>
+      </w:r>
+    </w:p>
+    <w:p>
+      <w:pPr>
+        <w:spacing w:after="120"/>
+      </w:pPr>
+      <w:r>
+        <w:t xml:space="preserve">For your first game, leave these out. Everything else plays exactly as written.</w:t>
+      </w:r>
+    </w:p>
+    <w:tbl>
+      <w:tblPr>
+        <w:tblW w:type="dxa" w:w="9360"/>
+        <w:tblBorders>
+          <w:top w:val="single" w:color="auto" w:sz="4"/>
+          <w:left w:val="single" w:color="auto" w:sz="4"/>
+          <w:bottom w:val="single" w:color="auto" w:sz="4"/>
+          <w:right w:val="single" w:color="auto" w:sz="4"/>
+          <w:insideH w:val="single" w:color="auto" w:sz="4"/>
+          <w:insideV w:val="single" w:color="auto" w:sz="4"/>
+        </w:tblBorders>
+      </w:tblPr>
+      <w:tblGrid>
+        <w:gridCol w:w="2280"/>
+        <w:gridCol w:w="7080"/>
+      </w:tblGrid>
+      <w:tr>
+        <w:trPr>
+          <w:tblHeader/>
+        </w:trPr>
+        <w:tc>
+          <w:tcPr>
+            <w:tcW w:type="dxa" w:w="2280"/>
+            <w:tcBorders>
+              <w:top w:val="single" w:color="C9CCD6" w:sz="4"/>
+              <w:left w:val="single" w:color="C9CCD6" w:sz="4"/>
+              <w:bottom w:val="single" w:color="C9CCD6" w:sz="4"/>
+              <w:right w:val="single" w:color="C9CCD6" w:sz="4"/>
+            </w:tcBorders>
+            <w:shd w:fill="ECE7F7" w:color="auto" w:val="clear"/>
+            <w:tcMar>
+              <w:top w:type="dxa" w:w="60"/>
+              <w:left w:type="dxa" w:w="100"/>
+              <w:bottom w:type="dxa" w:w="60"/>
+              <w:right w:type="dxa" w:w="100"/>
+            </w:tcMar>
+          </w:tcPr>
+          <w:p>
+            <w:r>
+              <w:rPr>
+                <w:b/>
+                <w:bCs/>
+                <w:sz w:val="20"/>
+                <w:szCs w:val="20"/>
+              </w:rPr>
+              <w:t xml:space="preserve">Leave out</w:t>
+            </w:r>
+          </w:p>
+        </w:tc>
+        <w:tc>
+          <w:tcPr>
+            <w:tcW w:type="dxa" w:w="7080"/>
+            <w:tcBorders>
+              <w:top w:val="single" w:color="C9CCD6" w:sz="4"/>
+              <w:left w:val="single" w:color="C9CCD6" w:sz="4"/>
+              <w:bottom w:val="single" w:color="C9CCD6" w:sz="4"/>
+              <w:right w:val="single" w:color="C9CCD6" w:sz="4"/>
+            </w:tcBorders>
+            <w:shd w:fill="ECE7F7" w:color="auto" w:val="clear"/>
+            <w:tcMar>
+              <w:top w:type="dxa" w:w="60"/>
+              <w:left w:type="dxa" w:w="100"/>
+              <w:bottom w:type="dxa" w:w="60"/>
+              <w:right w:type="dxa" w:w="100"/>
+            </w:tcMar>
+          </w:tcPr>
+          <w:p>
+            <w:r>
+              <w:rPr>
+                <w:b/>
+                <w:bCs/>
+                <w:sz w:val="20"/>
+                <w:szCs w:val="20"/>
+              </w:rPr>
+              <w:t xml:space="preserve">Instead</w:t>
+            </w:r>
+          </w:p>
+        </w:tc>
+      </w:tr>
+      <w:tr>
+        <w:trPr>
+          <w:tblHeader w:val="off"/>
+        </w:trPr>
+        <w:tc>
+          <w:tcPr>
+            <w:tcW w:type="dxa" w:w="2280"/>
+            <w:tcBorders>
+              <w:top w:val="single" w:color="C9CCD6" w:sz="4"/>
+              <w:left w:val="single" w:color="C9CCD6" w:sz="4"/>
+              <w:bottom w:val="single" w:color="C9CCD6" w:sz="4"/>
+              <w:right w:val="single" w:color="C9CCD6" w:sz="4"/>
+            </w:tcBorders>
+            <w:tcMar>
+              <w:top w:type="dxa" w:w="60"/>
+              <w:left w:type="dxa" w:w="100"/>
+              <w:bottom w:type="dxa" w:w="60"/>
+              <w:right w:type="dxa" w:w="100"/>
+            </w:tcMar>
+          </w:tcPr>
+          <w:p>
+            <w:r>
+              <w:rPr>
+                <w:sz w:val="20"/>
+                <w:szCs w:val="20"/>
+              </w:rPr>
+              <w:t xml:space="preserve">Supply Drops</w:t>
+            </w:r>
+          </w:p>
+        </w:tc>
+        <w:tc>
+          <w:tcPr>
+            <w:tcW w:type="dxa" w:w="7080"/>
+            <w:tcBorders>
+              <w:top w:val="single" w:color="C9CCD6" w:sz="4"/>
+              <w:left w:val="single" w:color="C9CCD6" w:sz="4"/>
+              <w:bottom w:val="single" w:color="C9CCD6" w:sz="4"/>
+              <w:right w:val="single" w:color="C9CCD6" w:sz="4"/>
+            </w:tcBorders>
+            <w:tcMar>
+              <w:top w:type="dxa" w:w="60"/>
+              <w:left w:type="dxa" w:w="100"/>
+              <w:bottom w:type="dxa" w:w="60"/>
+              <w:right w:type="dxa" w:w="100"/>
+            </w:tcMar>
+          </w:tcPr>
+          <w:p>
+            <w:r>
+              <w:rPr>
+                <w:sz w:val="20"/>
+                <w:szCs w:val="20"/>
+              </w:rPr>
+              <w:t xml:space="preserve">No drops; skip the Legendary deck</w:t>
+            </w:r>
+          </w:p>
+        </w:tc>
+      </w:tr>
+      <w:tr>
+        <w:trPr>
+          <w:tblHeader w:val="off"/>
+        </w:trPr>
+        <w:tc>
+          <w:tcPr>
+            <w:tcW w:type="dxa" w:w="2280"/>
+            <w:tcBorders>
+              <w:top w:val="single" w:color="C9CCD6" w:sz="4"/>
+              <w:left w:val="single" w:color="C9CCD6" w:sz="4"/>
+              <w:bottom w:val="single" w:color="C9CCD6" w:sz="4"/>
+              <w:right w:val="single" w:color="C9CCD6" w:sz="4"/>
+            </w:tcBorders>
+            <w:tcMar>
+              <w:top w:type="dxa" w:w="60"/>
+              <w:left w:type="dxa" w:w="100"/>
+              <w:bottom w:type="dxa" w:w="60"/>
+              <w:right w:type="dxa" w:w="100"/>
+            </w:tcMar>
+          </w:tcPr>
+          <w:p>
+            <w:r>
+              <w:rPr>
+                <w:sz w:val="20"/>
+                <w:szCs w:val="20"/>
+              </w:rPr>
+              <w:t xml:space="preserve">Loot piles</w:t>
+            </w:r>
+          </w:p>
+        </w:tc>
+        <w:tc>
+          <w:tcPr>
+            <w:tcW w:type="dxa" w:w="7080"/>
+            <w:tcBorders>
+              <w:top w:val="single" w:color="C9CCD6" w:sz="4"/>
+              <w:left w:val="single" w:color="C9CCD6" w:sz="4"/>
+              <w:bottom w:val="single" w:color="C9CCD6" w:sz="4"/>
+              <w:right w:val="single" w:color="C9CCD6" w:sz="4"/>
+            </w:tcBorders>
+            <w:tcMar>
+              <w:top w:type="dxa" w:w="60"/>
+              <w:left w:type="dxa" w:w="100"/>
+              <w:bottom w:type="dxa" w:w="60"/>
+              <w:right w:type="dxa" w:w="100"/>
+            </w:tcMar>
+          </w:tcPr>
+          <w:p>
+            <w:r>
+              <w:rPr>
+                <w:sz w:val="20"/>
+                <w:szCs w:val="20"/>
+              </w:rPr>
+              <w:t xml:space="preserve">When a player is eliminated, all their cards leave the game</w:t>
+            </w:r>
+          </w:p>
+        </w:tc>
+      </w:tr>
+      <w:tr>
+        <w:trPr>
+          <w:tblHeader w:val="off"/>
+        </w:trPr>
+        <w:tc>
+          <w:tcPr>
+            <w:tcW w:type="dxa" w:w="2280"/>
+            <w:tcBorders>
+              <w:top w:val="single" w:color="C9CCD6" w:sz="4"/>
+              <w:left w:val="single" w:color="C9CCD6" w:sz="4"/>
+              <w:bottom w:val="single" w:color="C9CCD6" w:sz="4"/>
+              <w:right w:val="single" w:color="C9CCD6" w:sz="4"/>
+            </w:tcBorders>
+            <w:tcMar>
+              <w:top w:type="dxa" w:w="60"/>
+              <w:left w:type="dxa" w:w="100"/>
+              <w:bottom w:type="dxa" w:w="60"/>
+              <w:right w:type="dxa" w:w="100"/>
+            </w:tcMar>
+          </w:tcPr>
+          <w:p>
+            <w:r>
+              <w:rPr>
+                <w:sz w:val="20"/>
+                <w:szCs w:val="20"/>
+              </w:rPr>
+              <w:t xml:space="preserve">Upgrading</w:t>
+            </w:r>
+          </w:p>
+        </w:tc>
+        <w:tc>
+          <w:tcPr>
+            <w:tcW w:type="dxa" w:w="7080"/>
+            <w:tcBorders>
+              <w:top w:val="single" w:color="C9CCD6" w:sz="4"/>
+              <w:left w:val="single" w:color="C9CCD6" w:sz="4"/>
+              <w:bottom w:val="single" w:color="C9CCD6" w:sz="4"/>
+              <w:right w:val="single" w:color="C9CCD6" w:sz="4"/>
+            </w:tcBorders>
+            <w:tcMar>
+              <w:top w:type="dxa" w:w="60"/>
+              <w:left w:type="dxa" w:w="100"/>
+              <w:bottom w:type="dxa" w:w="60"/>
+              <w:right w:type="dxa" w:w="100"/>
+            </w:tcMar>
+          </w:tcPr>
+          <w:p>
+            <w:r>
+              <w:rPr>
+                <w:sz w:val="20"/>
+                <w:szCs w:val="20"/>
+              </w:rPr>
+              <w:t xml:space="preserve">Stats never change from their starting values</w:t>
+            </w:r>
+          </w:p>
+        </w:tc>
+      </w:tr>
+      <w:tr>
+        <w:trPr>
+          <w:tblHeader w:val="off"/>
+        </w:trPr>
+        <w:tc>
+          <w:tcPr>
+            <w:tcW w:type="dxa" w:w="2280"/>
+            <w:tcBorders>
+              <w:top w:val="single" w:color="C9CCD6" w:sz="4"/>
+              <w:left w:val="single" w:color="C9CCD6" w:sz="4"/>
+              <w:bottom w:val="single" w:color="C9CCD6" w:sz="4"/>
+              <w:right w:val="single" w:color="C9CCD6" w:sz="4"/>
+            </w:tcBorders>
+            <w:tcMar>
+              <w:top w:type="dxa" w:w="60"/>
+              <w:left w:type="dxa" w:w="100"/>
+              <w:bottom w:type="dxa" w:w="60"/>
+              <w:right w:type="dxa" w:w="100"/>
+            </w:tcMar>
+          </w:tcPr>
+          <w:p>
+            <w:r>
+              <w:rPr>
+                <w:sz w:val="20"/>
+                <w:szCs w:val="20"/>
+              </w:rPr>
+              <w:t xml:space="preserve">The loot display</w:t>
+            </w:r>
+          </w:p>
+        </w:tc>
+        <w:tc>
+          <w:tcPr>
+            <w:tcW w:type="dxa" w:w="7080"/>
+            <w:tcBorders>
+              <w:top w:val="single" w:color="C9CCD6" w:sz="4"/>
+              <w:left w:val="single" w:color="C9CCD6" w:sz="4"/>
+              <w:bottom w:val="single" w:color="C9CCD6" w:sz="4"/>
+              <w:right w:val="single" w:color="C9CCD6" w:sz="4"/>
+            </w:tcBorders>
+            <w:tcMar>
+              <w:top w:type="dxa" w:w="60"/>
+              <w:left w:type="dxa" w:w="100"/>
+              <w:bottom w:type="dxa" w:w="60"/>
+              <w:right w:type="dxa" w:w="100"/>
+            </w:tcMar>
+          </w:tcPr>
+          <w:p>
+            <w:r>
+              <w:rPr>
+                <w:sz w:val="20"/>
+                <w:szCs w:val="20"/>
+              </w:rPr>
+              <w:t xml:space="preserve">When you loot a cube, take the top card of that deck</w:t>
+            </w:r>
+          </w:p>
+        </w:tc>
+      </w:tr>
+      <w:tr>
+        <w:trPr>
+          <w:tblHeader w:val="off"/>
+        </w:trPr>
+        <w:tc>
+          <w:tcPr>
+            <w:tcW w:type="dxa" w:w="2280"/>
+            <w:tcBorders>
+              <w:top w:val="single" w:color="C9CCD6" w:sz="4"/>
+              <w:left w:val="single" w:color="C9CCD6" w:sz="4"/>
+              <w:bottom w:val="single" w:color="C9CCD6" w:sz="4"/>
+              <w:right w:val="single" w:color="C9CCD6" w:sz="4"/>
+            </w:tcBorders>
+            <w:tcMar>
+              <w:top w:type="dxa" w:w="60"/>
+              <w:left w:type="dxa" w:w="100"/>
+              <w:bottom w:type="dxa" w:w="60"/>
+              <w:right w:type="dxa" w:w="100"/>
+            </w:tcMar>
+          </w:tcPr>
+          <w:p>
+            <w:r>
+              <w:rPr>
+                <w:sz w:val="20"/>
+                <w:szCs w:val="20"/>
+              </w:rPr>
+              <w:t xml:space="preserve">The "critical" call</w:t>
+            </w:r>
+          </w:p>
+        </w:tc>
+        <w:tc>
+          <w:tcPr>
+            <w:tcW w:type="dxa" w:w="7080"/>
+            <w:tcBorders>
+              <w:top w:val="single" w:color="C9CCD6" w:sz="4"/>
+              <w:left w:val="single" w:color="C9CCD6" w:sz="4"/>
+              <w:bottom w:val="single" w:color="C9CCD6" w:sz="4"/>
+              <w:right w:val="single" w:color="C9CCD6" w:sz="4"/>
+            </w:tcBorders>
+            <w:tcMar>
+              <w:top w:type="dxa" w:w="60"/>
+              <w:left w:type="dxa" w:w="100"/>
+              <w:bottom w:type="dxa" w:w="60"/>
+              <w:right w:type="dxa" w:w="100"/>
+            </w:tcMar>
+          </w:tcPr>
+          <w:p>
+            <w:r>
+              <w:rPr>
+                <w:sz w:val="20"/>
+                <w:szCs w:val="20"/>
+              </w:rPr>
+              <w:t xml:space="preserve">Just check for 3+ Dead cards at the end of your turn</w:t>
+            </w:r>
+          </w:p>
+        </w:tc>
+      </w:tr>
+      <w:tr>
+        <w:trPr>
+          <w:tblHeader w:val="off"/>
+        </w:trPr>
+        <w:tc>
+          <w:tcPr>
+            <w:tcW w:type="dxa" w:w="2280"/>
+            <w:tcBorders>
+              <w:top w:val="single" w:color="C9CCD6" w:sz="4"/>
+              <w:left w:val="single" w:color="C9CCD6" w:sz="4"/>
+              <w:bottom w:val="single" w:color="C9CCD6" w:sz="4"/>
+              <w:right w:val="single" w:color="C9CCD6" w:sz="4"/>
+            </w:tcBorders>
+            <w:tcMar>
+              <w:top w:type="dxa" w:w="60"/>
+              <w:left w:type="dxa" w:w="100"/>
+              <w:bottom w:type="dxa" w:w="60"/>
+              <w:right w:type="dxa" w:w="100"/>
+            </w:tcMar>
+          </w:tcPr>
+          <w:p>
+            <w:r>
+              <w:rPr>
+                <w:sz w:val="20"/>
+                <w:szCs w:val="20"/>
+              </w:rPr>
+              <w:t xml:space="preserve">Characters</w:t>
+            </w:r>
+          </w:p>
+        </w:tc>
+        <w:tc>
+          <w:tcPr>
+            <w:tcW w:type="dxa" w:w="7080"/>
+            <w:tcBorders>
+              <w:top w:val="single" w:color="C9CCD6" w:sz="4"/>
+              <w:left w:val="single" w:color="C9CCD6" w:sz="4"/>
+              <w:bottom w:val="single" w:color="C9CCD6" w:sz="4"/>
+              <w:right w:val="single" w:color="C9CCD6" w:sz="4"/>
+            </w:tcBorders>
+            <w:tcMar>
+              <w:top w:type="dxa" w:w="60"/>
+              <w:left w:type="dxa" w:w="100"/>
+              <w:bottom w:type="dxa" w:w="60"/>
+              <w:right w:type="dxa" w:w="100"/>
+            </w:tcMar>
+          </w:tcPr>
+          <w:p>
+            <w:r>
+              <w:rPr>
+                <w:sz w:val="20"/>
+                <w:szCs w:val="20"/>
+              </w:rPr>
+              <w:t xml:space="preserve">Don't use them</w:t>
+            </w:r>
+          </w:p>
+        </w:tc>
+      </w:tr>
+    </w:tbl>
+    <w:p>
+      <w:pPr>
+        <w:spacing w:after="60"/>
+      </w:pPr>
+    </w:p>
+    <w:p>
+      <w:pPr>
+        <w:spacing w:after="120"/>
+      </w:pPr>
+      <w:r>
+        <w:t xml:space="preserve">Simulated first games run the same length as full games (about 11–14 rounds) and never stall. Add the full rules from your second game.</w:t>
       </w:r>
     </w:p>
     <w:p>

</xml_diff>

<commit_message>
Last Deck Standing: close Medic heal loop and Mechanic upgrade loop (SIM-025)
Co-Authored-By: Claude Opus 5.5 <noreply@anthropic.com>
Claude-Session: https://claude.ai/code/session_0199qUwKDP7RJD17yuiRZBeo
</commit_message>
<xml_diff>
--- a/games/last-deck-standing/Last Deck Standing Rules v1.docx
+++ b/games/last-deck-standing/Last Deck Standing Rules v1.docx
@@ -3209,7 +3209,7 @@
                 <w:sz w:val="20"/>
                 <w:szCs w:val="20"/>
               </w:rPr>
-              <w:t xml:space="preserve"> Dead cards from your hand, then goes to your discard pile with your other played cards instead of leaving the game.</w:t>
+              <w:t xml:space="preserve"> Dead cards from your hand, then goes to your discard pile with your other played cards instead of leaving the game. You can't keep Heal cards in your hand at the end of your turn.</w:t>
             </w:r>
           </w:p>
         </w:tc>
@@ -3564,7 +3564,7 @@
                 <w:sz w:val="20"/>
                 <w:szCs w:val="20"/>
               </w:rPr>
-              <w:t xml:space="preserve"> your upgrades cost 3 instead of 4.</w:t>
+              <w:t xml:space="preserve"> the first upgrade of each stat costs you 3 instead of 4.</w:t>
             </w:r>
           </w:p>
         </w:tc>

</xml_diff>

<commit_message>
Last Deck Standing: no Shield refill (Heal bonus upgrade) and split attacks (SIM-026)
Co-Authored-By: Claude Opus 5.5 <noreply@anthropic.com>
Claude-Session: https://claude.ai/code/session_0199qUwKDP7RJD17yuiRZBeo
</commit_message>
<xml_diff>
--- a/games/last-deck-standing/Last Deck Standing Rules v1.docx
+++ b/games/last-deck-standing/Last Deck Standing Rules v1.docx
@@ -1395,7 +1395,7 @@
                 <w:sz w:val="20"/>
                 <w:szCs w:val="20"/>
               </w:rPr>
-              <w:t xml:space="preserve">Tracks Base Move, Base Attack and Base Shield (each 0–4) and current Shield points (0–4)</w:t>
+              <w:t xml:space="preserve">Tracks Base Move and Base Attack (each 0–4), Heal bonus (0–3) and current Shield points (0–4)</w:t>
             </w:r>
           </w:p>
         </w:tc>
@@ -2094,7 +2094,7 @@
         </w:numPr>
       </w:pPr>
       <w:r>
-        <w:t xml:space="preserve">Each player sets their stats to Base Move 1, Base Attack 1, Base Shield 0, then applies their character's changes if you're using characters.</w:t>
+        <w:t xml:space="preserve">Each player sets their stats to Base Move 1, Base Attack 1, Heal bonus 0, Shield 0, then applies their character's changes if you're using characters.</w:t>
       </w:r>
     </w:p>
     <w:p>
@@ -2147,6 +2147,14 @@
     </w:p>
     <w:p>
       <w:pPr>
+        <w:spacing w:after="120"/>
+      </w:pPr>
+      <w:r>
+        <w:t xml:space="preserve">Your Shield points never refill on their own. They only come from Heal cards and stay until damage uses them.</w:t>
+      </w:r>
+    </w:p>
+    <w:p>
+      <w:pPr>
         <w:pStyle w:val="ListParagraph"/>
         <w:numPr>
           <w:ilvl w:val="0"/>
@@ -2158,10 +2166,10 @@
           <w:b/>
           <w:bCs/>
         </w:rPr>
-        <w:t xml:space="preserve">Shield refill:</w:t>
-      </w:r>
-      <w:r>
-        <w:t xml:space="preserve"> if your Shield points are below your Base Shield, raise them to your Base Shield. Shield points never go down at upkeep; they stay until damage uses them.</w:t>
+        <w:t xml:space="preserve">Draw:</w:t>
+      </w:r>
+      <w:r>
+        <w:t xml:space="preserve"> draw until you have 5 cards in hand. Cards you kept from last turn and Dead cards count toward the 5. (You end each turn with 3 cards or fewer, so you always draw at least 2 unless your deck and discard pile both run out.) If your draw pile runs out, shuffle your discard pile to make a new one and keep drawing. If both are empty, stop drawing.</w:t>
       </w:r>
     </w:p>
     <w:p>
@@ -2177,25 +2185,6 @@
           <w:b/>
           <w:bCs/>
         </w:rPr>
-        <w:t xml:space="preserve">Draw:</w:t>
-      </w:r>
-      <w:r>
-        <w:t xml:space="preserve"> draw until you have 5 cards in hand. Cards you kept from last turn and Dead cards count toward the 5. (You end each turn with 3 cards or fewer, so you always draw at least 2 unless your deck and discard pile both run out.) If your draw pile runs out, shuffle your discard pile to make a new one and keep drawing. If both are empty, stop drawing.</w:t>
-      </w:r>
-    </w:p>
-    <w:p>
-      <w:pPr>
-        <w:pStyle w:val="ListParagraph"/>
-        <w:numPr>
-          <w:ilvl w:val="0"/>
-          <w:numId w:val="4"/>
-        </w:numPr>
-      </w:pPr>
-      <w:r>
-        <w:rPr>
-          <w:b/>
-          <w:bCs/>
-        </w:rPr>
         <w:t xml:space="preserve">Critical:</w:t>
       </w:r>
       <w:r>
@@ -2269,10 +2258,10 @@
           <w:b/>
           <w:bCs/>
         </w:rPr>
-        <w:t xml:space="preserve">Attack once</w:t>
-      </w:r>
-      <w:r>
-        <w:t xml:space="preserve"> (see Attacking). You may attack even if you played no Attack cards, since your Base Attack still counts.</w:t>
+        <w:t xml:space="preserve">Attack</w:t>
+      </w:r>
+      <w:r>
+        <w:t xml:space="preserve"> (see Attacking). You may split your Attack among several players. You may attack even if you played no Attack cards, since your Base Attack still counts.</w:t>
       </w:r>
     </w:p>
     <w:p>
@@ -2675,7 +2664,7 @@
                 <w:sz w:val="20"/>
                 <w:szCs w:val="20"/>
               </w:rPr>
-              <w:t xml:space="preserve">Choose one mode for its whole value when you play it. Unused value is lost. </w:t>
+              <w:t xml:space="preserve">Its value is the card's number plus your Heal bonus. Choose one mode for its whole value when you play it. Unused value is lost. </w:t>
             </w:r>
             <w:r>
               <w:rPr>
@@ -3422,7 +3411,7 @@
                 <w:sz w:val="20"/>
                 <w:szCs w:val="20"/>
               </w:rPr>
-              <w:t xml:space="preserve"> your Base Shield starts at 1, but all your upgrades (any stat) cost 5 instead of 4.</w:t>
+              <w:t xml:space="preserve"> you start the game with 2 Shield points, but all your upgrades (any stat) cost 5 instead of 4.</w:t>
             </w:r>
           </w:p>
         </w:tc>
@@ -3604,7 +3593,26 @@
         </w:numPr>
       </w:pPr>
       <w:r>
-        <w:t xml:space="preserve">Pick a target. </w:t>
+        <w:rPr>
+          <w:b/>
+          <w:bCs/>
+        </w:rPr>
+        <w:t xml:space="preserve">Split it if you like:</w:t>
+      </w:r>
+      <w:r>
+        <w:t xml:space="preserve"> divide your Total Attack among any number of players, at most one attack per player each turn. Each attack below uses only the points you gave it.</w:t>
+      </w:r>
+    </w:p>
+    <w:p>
+      <w:pPr>
+        <w:pStyle w:val="ListParagraph"/>
+        <w:numPr>
+          <w:ilvl w:val="0"/>
+          <w:numId w:val="6"/>
+        </w:numPr>
+      </w:pPr>
+      <w:r>
+        <w:t xml:space="preserve">For each attack, pick its target. </w:t>
       </w:r>
       <w:r>
         <w:rPr>
@@ -3630,7 +3638,7 @@
           <w:b/>
           <w:bCs/>
         </w:rPr>
-        <w:t xml:space="preserve">Damage = Total Attack − Range.</w:t>
+        <w:t xml:space="preserve">Damage = points given to that attack − Range.</w:t>
       </w:r>
       <w:r>
         <w:t xml:space="preserve"> If that is 0 or less, the target is out of range and you can't attack them.</w:t>
@@ -3645,7 +3653,7 @@
         </w:numPr>
       </w:pPr>
       <w:r>
-        <w:t xml:space="preserve">Example: Attack 4 hits range 0 for 4, range 2 for 2, range 3 for 1, and can't reach range 4.</w:t>
+        <w:t xml:space="preserve">Example: Attack 4 hits range 0 for 4, range 2 for 2, range 3 for 1, and can't reach range 4. Split instead, it could put 2 into a player at range 1 (1 damage) and 2 into a player on your tile (2 damage).</w:t>
       </w:r>
     </w:p>
     <w:p>
@@ -3687,7 +3695,7 @@
         <w:spacing w:after="120"/>
       </w:pPr>
       <w:r>
-        <w:t xml:space="preserve">You only get one attack, so play your Attack cards before you attack.</w:t>
+        <w:t xml:space="preserve">Splitting costs range again for every target, so it's best for finishing off players or hitting several on your tile. Play your Attack cards before you attack.</w:t>
       </w:r>
     </w:p>
     <w:p>
@@ -3895,7 +3903,17 @@
         </w:numPr>
       </w:pPr>
       <w:r>
-        <w:t xml:space="preserve">Heal cards → Base Shield</w:t>
+        <w:t xml:space="preserve">Heal cards → </w:t>
+      </w:r>
+      <w:r>
+        <w:rPr>
+          <w:b/>
+          <w:bCs/>
+        </w:rPr>
+        <w:t xml:space="preserve">Heal bonus</w:t>
+      </w:r>
+      <w:r>
+        <w:t xml:space="preserve">: +1 to the value of every Heal card you play (heal or shield), up to +3</w:t>
       </w:r>
     </w:p>
     <w:p>
@@ -3911,7 +3929,7 @@
         <w:spacing w:after="120"/>
       </w:pPr>
       <w:r>
-        <w:t xml:space="preserve">Paid cards go to your discard pile, not out of the game; they come back when you reshuffle. Cards you pay with can't also be played this turn and add nothing to your Move, Attack or Shield. You may overpay, but extra value is lost. Each stat maxes out at 4; you can't upgrade a stat that's already 4.</w:t>
+        <w:t xml:space="preserve">Paid cards go to your discard pile, not out of the game; they come back when you reshuffle. Cards you pay with can't also be played this turn and add nothing to your Move, Attack or Shield. You may overpay, but extra value is lost. Base Move and Base Attack max out at 4, and the Heal bonus at +3; you can't upgrade past the maximum.</w:t>
       </w:r>
     </w:p>
     <w:p>
@@ -4898,7 +4916,7 @@
         <w:t xml:space="preserve">Upkeep:</w:t>
       </w:r>
       <w:r>
-        <w:t xml:space="preserve"> refill Shield up to Base Shield → draw up to 5 (held and Dead cards count) → 3+ Dead: announce "critical"</w:t>
+        <w:t xml:space="preserve"> draw up to 5 (held and Dead cards count) → 3+ Dead: announce "critical"</w:t>
       </w:r>
     </w:p>
     <w:p>
@@ -4913,7 +4931,7 @@
         <w:t xml:space="preserve">Actions (any order):</w:t>
       </w:r>
       <w:r>
-        <w:t xml:space="preserve"> play any cards · move · 1 attack · 1 loot (1 cube, 1 pile claim or 1 drop card) · upgrade</w:t>
+        <w:t xml:space="preserve"> play any cards · move · attack (split it among players if you like) · 1 loot (1 cube, 1 pile claim or 1 drop card) · upgrade</w:t>
       </w:r>
     </w:p>
     <w:p>
@@ -4943,7 +4961,7 @@
         <w:t xml:space="preserve">Heal card:</w:t>
       </w:r>
       <w:r>
-        <w:t xml:space="preserve"> heal (Dead from hand → supply, card leaves the game) or shield (+Shield, max 4; stays until used)</w:t>
+        <w:t xml:space="preserve"> value + your Heal bonus: heal (Dead from hand → supply, card leaves the game) or shield (+Shield, max 4; stays until used; never refills)</w:t>
       </w:r>
     </w:p>
     <w:p>
@@ -5003,7 +5021,7 @@
         <w:t xml:space="preserve">Damage:</w:t>
       </w:r>
       <w:r>
-        <w:t xml:space="preserve"> Attack − Range, then Shield absorbs; 0 or less can't hit; Dead cards go to the target's discard pile</w:t>
+        <w:t xml:space="preserve"> points in that attack − Range, then Shield absorbs; 0 or less can't hit; Dead cards go to the target's discard pile</w:t>
       </w:r>
     </w:p>
     <w:p>
@@ -5018,7 +5036,7 @@
         <w:t xml:space="preserve">Upgrade:</w:t>
       </w:r>
       <w:r>
-        <w:t xml:space="preserve"> pay your upgrade cost (normally 4) in value of one type from hand → +1 stat (max 4); paid cards go to discard</w:t>
+        <w:t xml:space="preserve"> pay your upgrade cost (normally 4) in value of one type from hand → +1 Move or Attack (max 4) or +1 Heal bonus (max +3); paid cards go to discard</w:t>
       </w:r>
     </w:p>
     <w:p>

</xml_diff>

<commit_message>
Last Deck Standing: ring-by-ring storm (SIM-027)
Co-Authored-By: Claude Opus 5.5 <noreply@anthropic.com>
Claude-Session: https://claude.ai/code/session_0199qUwKDP7RJD17yuiRZBeo
</commit_message>
<xml_diff>
--- a/games/last-deck-standing/Last Deck Standing Rules v1.docx
+++ b/games/last-deck-standing/Last Deck Standing Rules v1.docx
@@ -3945,7 +3945,17 @@
         <w:spacing w:after="120"/>
       </w:pPr>
       <w:r>
-        <w:t xml:space="preserve">The storm closes in from the outside of the board, like a shrinking circle. At the end of your turn, place storm markers on tiles, then check for storm damage.</w:t>
+        <w:t xml:space="preserve">The storm closes in from the outside of the board </w:t>
+      </w:r>
+      <w:r>
+        <w:rPr>
+          <w:b/>
+          <w:bCs/>
+        </w:rPr>
+        <w:t xml:space="preserve">one ring at a time</w:t>
+      </w:r>
+      <w:r>
+        <w:t xml:space="preserve">, like a shrinking circle. At the end of your turn, place storm markers on tiles, then check for storm damage.</w:t>
       </w:r>
     </w:p>
     <w:tbl>
@@ -4238,10 +4248,88 @@
           <w:b/>
           <w:bCs/>
         </w:rPr>
+        <w:t xml:space="preserve">Rings:</w:t>
+      </w:r>
+    </w:p>
+    <w:p>
+      <w:pPr>
+        <w:pStyle w:val="ListParagraph"/>
+        <w:numPr>
+          <w:ilvl w:val="0"/>
+          <w:numId w:val="2"/>
+        </w:numPr>
+      </w:pPr>
+      <w:r>
+        <w:rPr>
+          <w:b/>
+          <w:bCs/>
+        </w:rPr>
+        <w:t xml:space="preserve">Ring 1</w:t>
+      </w:r>
+      <w:r>
+        <w:t xml:space="preserve"> is every tile on the edge of the board: any tile with at least one side not touching another tile, including sides facing a hole.</w:t>
+      </w:r>
+    </w:p>
+    <w:p>
+      <w:pPr>
+        <w:pStyle w:val="ListParagraph"/>
+        <w:numPr>
+          <w:ilvl w:val="0"/>
+          <w:numId w:val="2"/>
+        </w:numPr>
+      </w:pPr>
+      <w:r>
+        <w:rPr>
+          <w:b/>
+          <w:bCs/>
+        </w:rPr>
+        <w:t xml:space="preserve">Ring 2</w:t>
+      </w:r>
+      <w:r>
+        <w:t xml:space="preserve"> is every tile touching a Ring 1 tile. </w:t>
+      </w:r>
+      <w:r>
+        <w:rPr>
+          <w:b/>
+          <w:bCs/>
+        </w:rPr>
+        <w:t xml:space="preserve">Ring 3</w:t>
+      </w:r>
+      <w:r>
+        <w:t xml:space="preserve"> is every tile touching Ring 2, and so on. The board never changes, so the rings never change either.</w:t>
+      </w:r>
+    </w:p>
+    <w:p>
+      <w:pPr>
+        <w:spacing w:after="120"/>
+      </w:pPr>
+      <w:r>
+        <w:rPr>
+          <w:b/>
+          <w:bCs/>
+        </w:rPr>
         <w:t xml:space="preserve">Placing markers:</w:t>
       </w:r>
       <w:r>
-        <w:t xml:space="preserve"> you choose where each marker goes, and you may use them to cut off opponents. Put each marker on an unmarked tile that is on the edge of the board (at least one of its six sides has no tile next to it, including sides facing a hole) or touches a marked tile. You choose which. It doesn't matter what's on the tile: pawns, loot cubes and loot piles all stay. Once every tile is marked, stop placing markers. From then on, everyone takes storm damage every turn: this is the endgame.</w:t>
+        <w:t xml:space="preserve"> put each marker on an unmarked tile in the </w:t>
+      </w:r>
+      <w:r>
+        <w:rPr>
+          <w:b/>
+          <w:bCs/>
+        </w:rPr>
+        <w:t xml:space="preserve">current ring</w:t>
+      </w:r>
+      <w:r>
+        <w:t xml:space="preserve">: the outermost ring that still has unmarked tiles. You choose which tile in that ring. You can't mark a tile in the next ring while any tile in the current ring is unmarked. If you have 2 markers and the current ring has only 1 tile left, mark it, then put the second marker in the next ring. It doesn't matter what's on the tile: pawns, loot cubes and loot piles all stay. Once every tile is marked, stop placing markers. From then on, everyone takes storm damage every turn: this is the endgame.</w:t>
+      </w:r>
+    </w:p>
+    <w:p>
+      <w:pPr>
+        <w:spacing w:after="120"/>
+      </w:pPr>
+      <w:r>
+        <w:t xml:space="preserve">*Tip: if players struggle to see the current ring, put a small token on every Ring 1 tile after building the board.*</w:t>
       </w:r>
     </w:p>
     <w:p>
@@ -4976,7 +5064,7 @@
         <w:t xml:space="preserve">Storm:</w:t>
       </w:r>
       <w:r>
-        <w:t xml:space="preserve"> place markers on edge tiles or tiles touching a marked tile: 1 per turn (rounds 1–6), 2 per turn (round 7+). End your turn on a storm tile: 1 Dead card (round 7+: 2) to your discard pile; Shield doesn't block it</w:t>
+        <w:t xml:space="preserve"> finish the outermost ring before starting the next; place 1 per turn (rounds 1–6), 2 per turn (round 7+). End your turn on a storm tile: 1 Dead card (round 7+: 2) to your discard pile; Shield doesn't block it</w:t>
       </w:r>
     </w:p>
     <w:p>

</xml_diff>

<commit_message>
Last Deck Standing: ring storm wording fixes from blind check
Co-Authored-By: Claude Opus 5.5 <noreply@anthropic.com>
Claude-Session: https://claude.ai/code/session_0199qUwKDP7RJD17yuiRZBeo
</commit_message>
<xml_diff>
--- a/games/last-deck-standing/Last Deck Standing Rules v1.docx
+++ b/games/last-deck-standing/Last Deck Standing Rules v1.docx
@@ -4267,7 +4267,7 @@
         <w:t xml:space="preserve">Ring 1</w:t>
       </w:r>
       <w:r>
-        <w:t xml:space="preserve"> is every tile on the edge of the board: any tile with at least one side not touching another tile, including sides facing a hole.</w:t>
+        <w:t xml:space="preserve"> is every tile on the edge of the board: any tile with at least one open side. A side is open if no tile is there, whether that's the board's outside or a hole inside the board. (So tiles beside a hole are Ring 1, even near the middle.)</w:t>
       </w:r>
     </w:p>
     <w:p>
@@ -4286,7 +4286,7 @@
         <w:t xml:space="preserve">Ring 2</w:t>
       </w:r>
       <w:r>
-        <w:t xml:space="preserve"> is every tile touching a Ring 1 tile. </w:t>
+        <w:t xml:space="preserve"> is every tile not in Ring 1 that touches a Ring 1 tile. </w:t>
       </w:r>
       <w:r>
         <w:rPr>
@@ -4296,7 +4296,7 @@
         <w:t xml:space="preserve">Ring 3</w:t>
       </w:r>
       <w:r>
-        <w:t xml:space="preserve"> is every tile touching Ring 2, and so on. The board never changes, so the rings never change either.</w:t>
+        <w:t xml:space="preserve"> is every tile not yet in a ring that touches Ring 2, and so on. Rings depend only on where tiles are, never on markers, so they never change.</w:t>
       </w:r>
     </w:p>
     <w:p>
@@ -4311,7 +4311,7 @@
         <w:t xml:space="preserve">Placing markers:</w:t>
       </w:r>
       <w:r>
-        <w:t xml:space="preserve"> put each marker on an unmarked tile in the </w:t>
+        <w:t xml:space="preserve"> place your markers one at a time. Each goes on an unmarked tile in the </w:t>
       </w:r>
       <w:r>
         <w:rPr>
@@ -4321,7 +4321,7 @@
         <w:t xml:space="preserve">current ring</w:t>
       </w:r>
       <w:r>
-        <w:t xml:space="preserve">: the outermost ring that still has unmarked tiles. You choose which tile in that ring. You can't mark a tile in the next ring while any tile in the current ring is unmarked. If you have 2 markers and the current ring has only 1 tile left, mark it, then put the second marker in the next ring. It doesn't matter what's on the tile: pawns, loot cubes and loot piles all stay. Once every tile is marked, stop placing markers. From then on, everyone takes storm damage every turn: this is the endgame.</w:t>
+        <w:t xml:space="preserve">: the outermost ring that still has unmarked tiles at that moment. You choose which tile in that ring. So if you have 2 markers and the current ring has 1 tile left, the first finishes that ring and the second goes in the next ring. If no unmarked tiles remain, place no more. It doesn't matter what's on the tile: pawns, loot cubes and loot piles all stay. Once every tile is marked, stop placing markers. From then on, everyone takes storm damage every turn: this is the endgame.</w:t>
       </w:r>
     </w:p>
     <w:p>

</xml_diff>

<commit_message>
Last Deck Standing: split one-time Heal cards, no Heal upgrade, new character abilities (SIM-028/029)
Heal cards split their value between removing Dead cards and adding
Shield, then leave the game. Upgrades are Move/Attack only. Characters:
Medic +1 Dead removal per Heal card, Tank starts with 1 Shield (max 6),
Mechanic upgrades cost 3, new Berserker (+2 Attack per Dead in hand).

Co-Authored-By: Claude Opus 5.5 <noreply@anthropic.com>
Claude-Session: https://claude.ai/code/session_0199qUwKDP7RJD17yuiRZBeo
</commit_message>
<xml_diff>
--- a/games/last-deck-standing/Last Deck Standing Rules v1.docx
+++ b/games/last-deck-standing/Last Deck Standing Rules v1.docx
@@ -1395,7 +1395,7 @@
                 <w:sz w:val="20"/>
                 <w:szCs w:val="20"/>
               </w:rPr>
-              <w:t xml:space="preserve">Tracks Base Move and Base Attack (each 0–4), Heal bonus (0–3) and current Shield points (0–4)</w:t>
+              <w:t xml:space="preserve">Tracks Base Move and Base Attack (each 0–4) and your Shield (0–4; the Tank can reach 6)</w:t>
             </w:r>
           </w:p>
         </w:tc>
@@ -1867,7 +1867,7 @@
                 <w:sz w:val="20"/>
                 <w:szCs w:val="20"/>
               </w:rPr>
-              <w:t xml:space="preserve">10</w:t>
+              <w:t xml:space="preserve">11</w:t>
             </w:r>
           </w:p>
         </w:tc>
@@ -2094,7 +2094,7 @@
         </w:numPr>
       </w:pPr>
       <w:r>
-        <w:t xml:space="preserve">Each player sets their stats to Base Move 1, Base Attack 1, Heal bonus 0, Shield 0, then applies their character's changes if you're using characters.</w:t>
+        <w:t xml:space="preserve">Each player sets their stats to Base Move 1, Base Attack 1, Shield 0, then applies their character's changes if you're using characters.</w:t>
       </w:r>
     </w:p>
     <w:p>
@@ -2346,7 +2346,7 @@
         </w:numPr>
       </w:pPr>
       <w:r>
-        <w:t xml:space="preserve">Put your played cards in your discard pile (Heal cards used to heal were already removed from the game). </w:t>
+        <w:t xml:space="preserve">Put your played cards in your discard pile (Heal cards were already removed from the game). </w:t>
       </w:r>
       <w:r>
         <w:rPr>
@@ -2664,49 +2664,42 @@
                 <w:sz w:val="20"/>
                 <w:szCs w:val="20"/>
               </w:rPr>
-              <w:t xml:space="preserve">Its value is the card's number plus your Heal bonus. Choose one mode for its whole value when you play it. Unused value is lost. </w:t>
-            </w:r>
-            <w:r>
-              <w:rPr>
-                <w:sz w:val="20"/>
-                <w:szCs w:val="20"/>
-              </w:rPr>
-              <w:t xml:space="preserve">Heal:</w:t>
-            </w:r>
-            <w:r>
-              <w:rPr>
-                <w:sz w:val="20"/>
-                <w:szCs w:val="20"/>
-              </w:rPr>
-              <w:t xml:space="preserve"> return up to that many Dead cards </w:t>
-            </w:r>
-            <w:r>
-              <w:rPr>
-                <w:sz w:val="20"/>
-                <w:szCs w:val="20"/>
-              </w:rPr>
-              <w:t xml:space="preserve">from your hand</w:t>
-            </w:r>
-            <w:r>
-              <w:rPr>
-                <w:sz w:val="20"/>
-                <w:szCs w:val="20"/>
-              </w:rPr>
-              <w:t xml:space="preserve"> to the Dead supply, then remove this card from the game. </w:t>
-            </w:r>
-            <w:r>
-              <w:rPr>
-                <w:sz w:val="20"/>
-                <w:szCs w:val="20"/>
-              </w:rPr>
-              <w:t xml:space="preserve">Shield:</w:t>
-            </w:r>
-            <w:r>
-              <w:rPr>
-                <w:sz w:val="20"/>
-                <w:szCs w:val="20"/>
-              </w:rPr>
-              <w:t xml:space="preserve"> add that many points to your Shield tracker (maximum 4). They stay until damage uses them; the card is discarded at the end of your turn with your other cards.</w:t>
+              <w:t xml:space="preserve">One-time use.</w:t>
+            </w:r>
+            <w:r>
+              <w:rPr>
+                <w:sz w:val="20"/>
+                <w:szCs w:val="20"/>
+              </w:rPr>
+              <w:t xml:space="preserve"> Split its value however you like between </w:t>
+            </w:r>
+            <w:r>
+              <w:rPr>
+                <w:sz w:val="20"/>
+                <w:szCs w:val="20"/>
+              </w:rPr>
+              <w:t xml:space="preserve">removing Dead cards from your hand</w:t>
+            </w:r>
+            <w:r>
+              <w:rPr>
+                <w:sz w:val="20"/>
+                <w:szCs w:val="20"/>
+              </w:rPr>
+              <w:t xml:space="preserve"> (each point returns 1 Dead card to the Dead supply) and </w:t>
+            </w:r>
+            <w:r>
+              <w:rPr>
+                <w:sz w:val="20"/>
+                <w:szCs w:val="20"/>
+              </w:rPr>
+              <w:t xml:space="preserve">adding Shield</w:t>
+            </w:r>
+            <w:r>
+              <w:rPr>
+                <w:sz w:val="20"/>
+                <w:szCs w:val="20"/>
+              </w:rPr>
+              <w:t xml:space="preserve"> (each point adds 1 Shield, max 4). Example: a Heal 2 can remove 1 Dead card and add 1 Shield. Unused value is lost. Then remove the card from the game. Shield stays until damage uses it and never refills on its own.</w:t>
             </w:r>
           </w:p>
         </w:tc>
@@ -3184,21 +3177,7 @@
                 <w:sz w:val="20"/>
                 <w:szCs w:val="20"/>
               </w:rPr>
-              <w:t xml:space="preserve"> each Heal card you use to heal removes up to its value </w:t>
-            </w:r>
-            <w:r>
-              <w:rPr>
-                <w:sz w:val="20"/>
-                <w:szCs w:val="20"/>
-              </w:rPr>
-              <w:t xml:space="preserve">+2</w:t>
-            </w:r>
-            <w:r>
-              <w:rPr>
-                <w:sz w:val="20"/>
-                <w:szCs w:val="20"/>
-              </w:rPr>
-              <w:t xml:space="preserve"> Dead cards from your hand, then goes to your discard pile with your other played cards instead of leaving the game. You can't keep Heal cards in your hand at the end of your turn.</w:t>
+              <w:t xml:space="preserve"> each Heal card you play can remove 1 extra Dead card from your hand (on top of its value).</w:t>
             </w:r>
           </w:p>
         </w:tc>
@@ -3411,7 +3390,7 @@
                 <w:sz w:val="20"/>
                 <w:szCs w:val="20"/>
               </w:rPr>
-              <w:t xml:space="preserve"> you start the game with 2 Shield points, but all your upgrades (any stat) cost 5 instead of 4.</w:t>
+              <w:t xml:space="preserve"> you start the game with 1 Shield point, and your Shield maximum is 6 instead of 4.</w:t>
             </w:r>
           </w:p>
         </w:tc>
@@ -3553,7 +3532,78 @@
                 <w:sz w:val="20"/>
                 <w:szCs w:val="20"/>
               </w:rPr>
-              <w:t xml:space="preserve"> the first upgrade of each stat costs you 3 instead of 4.</w:t>
+              <w:t xml:space="preserve"> your upgrades cost 3 instead of 4.</w:t>
+            </w:r>
+          </w:p>
+        </w:tc>
+      </w:tr>
+      <w:tr>
+        <w:trPr>
+          <w:tblHeader w:val="off"/>
+        </w:trPr>
+        <w:tc>
+          <w:tcPr>
+            <w:tcW w:type="dxa" w:w="2511"/>
+            <w:tcBorders>
+              <w:top w:val="single" w:color="C9CCD6" w:sz="4"/>
+              <w:left w:val="single" w:color="C9CCD6" w:sz="4"/>
+              <w:bottom w:val="single" w:color="C9CCD6" w:sz="4"/>
+              <w:right w:val="single" w:color="C9CCD6" w:sz="4"/>
+            </w:tcBorders>
+            <w:tcMar>
+              <w:top w:type="dxa" w:w="60"/>
+              <w:left w:type="dxa" w:w="100"/>
+              <w:bottom w:type="dxa" w:w="60"/>
+              <w:right w:type="dxa" w:w="100"/>
+            </w:tcMar>
+          </w:tcPr>
+          <w:p>
+            <w:r>
+              <w:rPr>
+                <w:sz w:val="20"/>
+                <w:szCs w:val="20"/>
+              </w:rPr>
+              <w:t xml:space="preserve">✖ </w:t>
+            </w:r>
+            <w:r>
+              <w:rPr>
+                <w:sz w:val="20"/>
+                <w:szCs w:val="20"/>
+              </w:rPr>
+              <w:t xml:space="preserve">The Berserker</w:t>
+            </w:r>
+          </w:p>
+        </w:tc>
+        <w:tc>
+          <w:tcPr>
+            <w:tcW w:type="dxa" w:w="6849"/>
+            <w:tcBorders>
+              <w:top w:val="single" w:color="C9CCD6" w:sz="4"/>
+              <w:left w:val="single" w:color="C9CCD6" w:sz="4"/>
+              <w:bottom w:val="single" w:color="C9CCD6" w:sz="4"/>
+              <w:right w:val="single" w:color="C9CCD6" w:sz="4"/>
+            </w:tcBorders>
+            <w:tcMar>
+              <w:top w:type="dxa" w:w="60"/>
+              <w:left w:type="dxa" w:w="100"/>
+              <w:bottom w:type="dxa" w:w="60"/>
+              <w:right w:type="dxa" w:w="100"/>
+            </w:tcMar>
+          </w:tcPr>
+          <w:p>
+            <w:r>
+              <w:rPr>
+                <w:sz w:val="20"/>
+                <w:szCs w:val="20"/>
+              </w:rPr>
+              <w:t xml:space="preserve">Rage:</w:t>
+            </w:r>
+            <w:r>
+              <w:rPr>
+                <w:sz w:val="20"/>
+                <w:szCs w:val="20"/>
+              </w:rPr>
+              <w:t xml:space="preserve"> your Attack is +2 for each Dead card in your hand.</w:t>
             </w:r>
           </w:p>
         </w:tc>
@@ -3847,7 +3897,7 @@
         <w:spacing w:after="120"/>
       </w:pPr>
       <w:r>
-        <w:t xml:space="preserve">During your Actions phase, pay cards from your hand of one type worth at least your </w:t>
+        <w:t xml:space="preserve">During your Actions phase, pay Attack or Move cards from your hand of one type worth at least your </w:t>
       </w:r>
       <w:r>
         <w:rPr>
@@ -3896,28 +3946,6 @@
     </w:p>
     <w:p>
       <w:pPr>
-        <w:pStyle w:val="ListParagraph"/>
-        <w:numPr>
-          <w:ilvl w:val="0"/>
-          <w:numId w:val="2"/>
-        </w:numPr>
-      </w:pPr>
-      <w:r>
-        <w:t xml:space="preserve">Heal cards → </w:t>
-      </w:r>
-      <w:r>
-        <w:rPr>
-          <w:b/>
-          <w:bCs/>
-        </w:rPr>
-        <w:t xml:space="preserve">Heal bonus</w:t>
-      </w:r>
-      <w:r>
-        <w:t xml:space="preserve">: +1 to the value of every Heal card you play (heal or shield), up to +3</w:t>
-      </w:r>
-    </w:p>
-    <w:p>
-      <w:pPr>
         <w:spacing w:after="120"/>
       </w:pPr>
       <w:r>
@@ -3929,7 +3957,7 @@
         <w:spacing w:after="120"/>
       </w:pPr>
       <w:r>
-        <w:t xml:space="preserve">Paid cards go to your discard pile, not out of the game; they come back when you reshuffle. Cards you pay with can't also be played this turn and add nothing to your Move, Attack or Shield. You may overpay, but extra value is lost. Base Move and Base Attack max out at 4, and the Heal bonus at +3; you can't upgrade past the maximum.</w:t>
+        <w:t xml:space="preserve">Paid cards go to your discard pile, not out of the game; they come back when you reshuffle. Cards you pay with can't also be played this turn and add nothing to your Move, Attack or Shield. You may overpay, but extra value is lost. Base Move and Base Attack max out at 4; you can't upgrade past that. Heal cards can't pay for upgrades.</w:t>
       </w:r>
     </w:p>
     <w:p>
@@ -5046,10 +5074,10 @@
           <w:b/>
           <w:bCs/>
         </w:rPr>
-        <w:t xml:space="preserve">Heal card:</w:t>
-      </w:r>
-      <w:r>
-        <w:t xml:space="preserve"> value + your Heal bonus: heal (Dead from hand → supply, card leaves the game) or shield (+Shield, max 4; stays until used; never refills)</w:t>
+        <w:t xml:space="preserve">Heal card (one-time):</w:t>
+      </w:r>
+      <w:r>
+        <w:t xml:space="preserve"> split its value between removing Dead cards from your hand and adding Shield (max 4); then it leaves the game. Shield never refills on its own</w:t>
       </w:r>
     </w:p>
     <w:p>
@@ -5124,7 +5152,7 @@
         <w:t xml:space="preserve">Upgrade:</w:t>
       </w:r>
       <w:r>
-        <w:t xml:space="preserve"> pay your upgrade cost (normally 4) in value of one type from hand → +1 Move or Attack (max 4) or +1 Heal bonus (max +3); paid cards go to discard</w:t>
+        <w:t xml:space="preserve"> pay your upgrade cost (normally 4) in value of one type from hand → +1 Move or Attack (max 4); paid cards go to discard; Heal cards can't pay</w:t>
       </w:r>
     </w:p>
     <w:p>

</xml_diff>